<commit_message>
Release v1.5: versioned docs, ZIP bundles, README/releases updates
- Complete Guide & Quick Reference: v1.5, 2026-01-25
- ZIP bundles: Awesome-Mnemonics-v1.5-Complete-Guide.zip, -Quick-Reference.zip (PDF, DOCX, RTF, MD)
- README: v1.5, ZIP links in download line and Release Versions
- releases/README: v1.5, ZIP section; regenerated PDF/DOCX/RTF
</commit_message>
<xml_diff>
--- a/releases/Awesome-Mnemonics-Complete-Guide.docx
+++ b/releases/Awesome-Mnemonics-Complete-Guide.docx
@@ -93,8 +93,25 @@
           <w:i/>
           <w:iCs/>
         </w:rPr>
-        <w:t xml:space="preserve">Release Version - Last Updated: 2026-01-25</w:t>
-      </w:r>
+        <w:t xml:space="preserve">Release v1.5 — 2026-01-25</w:t>
+      </w:r>
+    </w:p>
+    <w:p>
+      <w:pPr>
+        <w:pStyle w:val="BodyText"/>
+      </w:pPr>
+      <w:r>
+        <w:rPr>
+          <w:i/>
+          <w:iCs/>
+        </w:rPr>
+        <w:t xml:space="preserve">In PDF and DOCX, the table of contents and in-text links are clickable; use the TOC to jump to sections.</w:t>
+      </w:r>
+    </w:p>
+    <w:p>
+      <w:pPr>
+        <w:pStyle w:val="BodyText"/>
+      </w:pPr>
     </w:p>
     <w:bookmarkStart w:id="10" w:name="quick-reference-on-call-guide"/>
     <w:p>
@@ -687,6 +704,18 @@
       </w:pPr>
       <w:r>
         <w:rPr>
+          <w:i/>
+          <w:iCs/>
+        </w:rPr>
+        <w:t xml:space="preserve">(If icons don’t display in your viewer: 🚨=crisis, 🔍=root cause, 👥=conflict, 📊=planning, 🏗️=design, 🐛=debug, 😰=stress. Row text is sufficient.)</w:t>
+      </w:r>
+    </w:p>
+    <w:p>
+      <w:pPr>
+        <w:pStyle w:val="BodyText"/>
+      </w:pPr>
+      <w:r>
+        <w:rPr>
           <w:b/>
           <w:bCs/>
         </w:rPr>
@@ -2413,12 +2442,12 @@
           <w:numId w:val="1002"/>
         </w:numPr>
       </w:pPr>
-      <w:hyperlink w:anchor="awesome-mnemonics-">
+      <w:hyperlink w:anchor="awesome-mnemonics---complete-guide">
         <w:r>
           <w:rPr>
             <w:rStyle w:val="Hyperlink"/>
           </w:rPr>
-          <w:t xml:space="preserve">Awesome Mnemonics</w:t>
+          <w:t xml:space="preserve">Awesome Mnemonics - Complete Guide</w:t>
         </w:r>
       </w:hyperlink>
     </w:p>
@@ -3572,23 +3601,6 @@
             <w:rStyle w:val="Hyperlink"/>
           </w:rPr>
           <w:t xml:space="preserve">🤝 Contributing</w:t>
-        </w:r>
-      </w:hyperlink>
-    </w:p>
-    <w:p>
-      <w:pPr>
-        <w:pStyle w:val="Compact"/>
-        <w:numPr>
-          <w:ilvl w:val="1"/>
-          <w:numId w:val="1003"/>
-        </w:numPr>
-      </w:pPr>
-      <w:hyperlink w:anchor="X33d64d7c136dd2cf2ebd63318c2da52cd425a78">
-        <w:r>
-          <w:rPr>
-            <w:rStyle w:val="Hyperlink"/>
-          </w:rPr>
-          <w:t xml:space="preserve">📥 Release Versions</w:t>
         </w:r>
       </w:hyperlink>
     </w:p>

</xml_diff>

<commit_message>
Release v2.0: TOC/anchor link fixes, downloadable docs rebuilt
- Fixed README, Complete Guide, METRICS, runbook: anchor slugs to match
  GitHub heading IDs (#-categorized-index → #categorized-index, etc.)
- Bumped release to v2.0; regenerated PDF/DOCX/RTF from updated MD
- Added v2.0 ZIP bundles; updated releases/README and root README
- CHANGELOG: [2.0.0] - 2026-01-25
</commit_message>
<xml_diff>
--- a/releases/Awesome-Mnemonics-Complete-Guide.docx
+++ b/releases/Awesome-Mnemonics-Complete-Guide.docx
@@ -98,7 +98,7 @@
           <w:i/>
           <w:iCs/>
         </w:rPr>
-        <w:t xml:space="preserve">Release v1.8 — 2026-01-25</w:t>
+        <w:t xml:space="preserve">Release v2.0 — 2026-01-25</w:t>
       </w:r>
     </w:p>
     <w:p>
@@ -724,7 +724,7 @@
       <w:r>
         <w:t xml:space="preserve"> </w:t>
       </w:r>
-      <w:hyperlink w:anchor="Xc142c0b9be512e3c9c4a485e86a69efcbaf1e9f">
+      <w:hyperlink w:anchor="categorized-index">
         <w:r>
           <w:rPr>
             <w:rStyle w:val="Hyperlink"/>
@@ -741,7 +741,7 @@
       <w:r>
         <w:t xml:space="preserve"> </w:t>
       </w:r>
-      <w:hyperlink w:anchor="X402e7415662aa665c49dc22e8507e456f6f56cd">
+      <w:hyperlink w:anchor="proven-mnemonic-pipelines">
         <w:r>
           <w:rPr>
             <w:rStyle w:val="Hyperlink"/>
@@ -2156,7 +2156,7 @@
         </w:rPr>
         <w:t xml:space="preserve"> </w:t>
       </w:r>
-      <w:hyperlink w:anchor="X23533801c944ea69f521b2fcd684ef445c74dd3">
+      <w:hyperlink w:anchor="quick-reference--on-call-guide">
         <w:r>
           <w:rPr>
             <w:rStyle w:val="Hyperlink"/>
@@ -2187,7 +2187,7 @@
         </w:rPr>
         <w:t xml:space="preserve"> </w:t>
       </w:r>
-      <w:hyperlink w:anchor="Xc142c0b9be512e3c9c4a485e86a69efcbaf1e9f">
+      <w:hyperlink w:anchor="categorized-index">
         <w:r>
           <w:rPr>
             <w:rStyle w:val="Hyperlink"/>
@@ -2404,7 +2404,7 @@
       <w:r>
         <w:t xml:space="preserve"> </w:t>
       </w:r>
-      <w:hyperlink w:anchor="X23533801c944ea69f521b2fcd684ef445c74dd3">
+      <w:hyperlink w:anchor="quick-reference--on-call-guide">
         <w:r>
           <w:rPr>
             <w:rStyle w:val="Hyperlink"/>
@@ -2421,7 +2421,7 @@
       <w:r>
         <w:t xml:space="preserve"> </w:t>
       </w:r>
-      <w:hyperlink w:anchor="Xc142c0b9be512e3c9c4a485e86a69efcbaf1e9f">
+      <w:hyperlink w:anchor="categorized-index">
         <w:r>
           <w:rPr>
             <w:rStyle w:val="Hyperlink"/>
@@ -2468,7 +2468,7 @@
           <w:numId w:val="1002"/>
         </w:numPr>
       </w:pPr>
-      <w:hyperlink w:anchor="X23533801c944ea69f521b2fcd684ef445c74dd3">
+      <w:hyperlink w:anchor="quick-reference--on-call-guide">
         <w:r>
           <w:rPr>
             <w:rStyle w:val="Hyperlink"/>
@@ -2485,7 +2485,7 @@
           <w:numId w:val="1002"/>
         </w:numPr>
       </w:pPr>
-      <w:hyperlink w:anchor="Xc142c0b9be512e3c9c4a485e86a69efcbaf1e9f">
+      <w:hyperlink w:anchor="categorized-index">
         <w:r>
           <w:rPr>
             <w:rStyle w:val="Hyperlink"/>
@@ -2502,7 +2502,7 @@
           <w:numId w:val="1003"/>
         </w:numPr>
       </w:pPr>
-      <w:hyperlink w:anchor="Xdba380e767946d6f469735914cd360aaf1d12ca">
+      <w:hyperlink w:anchor="ops">
         <w:r>
           <w:rPr>
             <w:rStyle w:val="Hyperlink"/>
@@ -2519,7 +2519,7 @@
           <w:numId w:val="1003"/>
         </w:numPr>
       </w:pPr>
-      <w:hyperlink w:anchor="X38c8708d7bdb50d472b27e3ce028aaaa635a88e">
+      <w:hyperlink w:anchor="rca-root-cause-analysis">
         <w:r>
           <w:rPr>
             <w:rStyle w:val="Hyperlink"/>
@@ -2536,7 +2536,7 @@
           <w:numId w:val="1003"/>
         </w:numPr>
       </w:pPr>
-      <w:hyperlink w:anchor="X554ff09c5dd6e3a05e0ebf62166287bbf1dd2fc">
+      <w:hyperlink w:anchor="systems-design">
         <w:r>
           <w:rPr>
             <w:rStyle w:val="Hyperlink"/>
@@ -2553,7 +2553,7 @@
           <w:numId w:val="1003"/>
         </w:numPr>
       </w:pPr>
-      <w:hyperlink w:anchor="X6face8e3749d4ad13059e8e1fc955d7595b05a9">
+      <w:hyperlink w:anchor="human-factors">
         <w:r>
           <w:rPr>
             <w:rStyle w:val="Hyperlink"/>
@@ -2570,7 +2570,7 @@
           <w:numId w:val="1003"/>
         </w:numPr>
       </w:pPr>
-      <w:hyperlink w:anchor="X93ad5fd019527fde9459641dd0c3dbe92b931ff">
+      <w:hyperlink w:anchor="personal-life">
         <w:r>
           <w:rPr>
             <w:rStyle w:val="Hyperlink"/>
@@ -2604,7 +2604,7 @@
           <w:numId w:val="1002"/>
         </w:numPr>
       </w:pPr>
-      <w:hyperlink w:anchor="X73e83c231c2299f6d49971a9e782219146572e3">
+      <w:hyperlink w:anchor="mnemonic-selection-flowchart">
         <w:r>
           <w:rPr>
             <w:rStyle w:val="Hyperlink"/>
@@ -2638,7 +2638,7 @@
           <w:numId w:val="1002"/>
         </w:numPr>
       </w:pPr>
-      <w:hyperlink w:anchor="X3aaa63dad339d26660884c0c8044e5f1044ba2f">
+      <w:hyperlink w:anchor="problem-solving-techniques">
         <w:r>
           <w:rPr>
             <w:rStyle w:val="Hyperlink"/>
@@ -2808,7 +2808,7 @@
           <w:numId w:val="1002"/>
         </w:numPr>
       </w:pPr>
-      <w:hyperlink w:anchor="X78081af3ee20fe91273b5b114852076e0cffd75">
+      <w:hyperlink w:anchor="problem-analysis">
         <w:r>
           <w:rPr>
             <w:rStyle w:val="Hyperlink"/>
@@ -2893,7 +2893,7 @@
           <w:numId w:val="1002"/>
         </w:numPr>
       </w:pPr>
-      <w:hyperlink w:anchor="X7b1b6bb3643e9082a7fe14cb9ad87d7446e1955">
+      <w:hyperlink w:anchor="problem-resolution-threats">
         <w:r>
           <w:rPr>
             <w:rStyle w:val="Hyperlink"/>
@@ -2961,7 +2961,7 @@
           <w:numId w:val="1002"/>
         </w:numPr>
       </w:pPr>
-      <w:hyperlink w:anchor="Xe950eaa137e1c76f262ad57af9ecaf23d7c8ac7">
+      <w:hyperlink w:anchor="communication--conflict">
         <w:r>
           <w:rPr>
             <w:rStyle w:val="Hyperlink"/>
@@ -3029,7 +3029,7 @@
           <w:numId w:val="1002"/>
         </w:numPr>
       </w:pPr>
-      <w:hyperlink w:anchor="X8c34b8cad1ad73e047eb6f7481a031736eeb046">
+      <w:hyperlink w:anchor="stress--resilience">
         <w:r>
           <w:rPr>
             <w:rStyle w:val="Hyperlink"/>
@@ -3199,7 +3199,7 @@
           <w:numId w:val="1002"/>
         </w:numPr>
       </w:pPr>
-      <w:hyperlink w:anchor="Xc0b0263de7e13365b0885132fed14402595e71c">
+      <w:hyperlink w:anchor="infrastructure--systems-engineering">
         <w:r>
           <w:rPr>
             <w:rStyle w:val="Hyperlink"/>
@@ -3267,7 +3267,7 @@
           <w:numId w:val="1002"/>
         </w:numPr>
       </w:pPr>
-      <w:hyperlink w:anchor="X402e7415662aa665c49dc22e8507e456f6f56cd">
+      <w:hyperlink w:anchor="proven-mnemonic-pipelines">
         <w:r>
           <w:rPr>
             <w:rStyle w:val="Hyperlink"/>
@@ -3398,7 +3398,7 @@
           <w:numId w:val="1002"/>
         </w:numPr>
       </w:pPr>
-      <w:hyperlink w:anchor="Xa2454f1c22b0fae2b4bdcfba006c77de555d3c2">
+      <w:hyperlink w:anchor="pipeline-selection-matrix">
         <w:r>
           <w:rPr>
             <w:rStyle w:val="Hyperlink"/>
@@ -3415,7 +3415,7 @@
           <w:numId w:val="1002"/>
         </w:numPr>
       </w:pPr>
-      <w:hyperlink w:anchor="Xf85909148dd71aa9929852c6a8695742e3d79e0">
+      <w:hyperlink w:anchor="pro-tips">
         <w:r>
           <w:rPr>
             <w:rStyle w:val="Hyperlink"/>
@@ -3432,7 +3432,7 @@
           <w:numId w:val="1002"/>
         </w:numPr>
       </w:pPr>
-      <w:hyperlink w:anchor="Xc4e21595805c13697dfad0c36925df831fefcb3">
+      <w:hyperlink w:anchor="common-mistakes">
         <w:r>
           <w:rPr>
             <w:rStyle w:val="Hyperlink"/>
@@ -3449,7 +3449,7 @@
           <w:numId w:val="1002"/>
         </w:numPr>
       </w:pPr>
-      <w:hyperlink w:anchor="X6e2f41a9aab647f24492e4f54eba31603dade68">
+      <w:hyperlink w:anchor="contributing">
         <w:r>
           <w:rPr>
             <w:rStyle w:val="Hyperlink"/>
@@ -3466,7 +3466,7 @@
           <w:numId w:val="1002"/>
         </w:numPr>
       </w:pPr>
-      <w:hyperlink w:anchor="X33d64d7c136dd2cf2ebd63318c2da52cd425a78">
+      <w:hyperlink w:anchor="release-versions">
         <w:r>
           <w:rPr>
             <w:rStyle w:val="Hyperlink"/>
@@ -10759,7 +10759,7 @@
       <w:pPr>
         <w:pStyle w:val="BodyText"/>
       </w:pPr>
-      <w:hyperlink w:anchor="X23533801c944ea69f521b2fcd684ef445c74dd3">
+      <w:hyperlink w:anchor="quick-reference--on-call-guide">
         <w:r>
           <w:rPr>
             <w:rStyle w:val="Hyperlink"/>
@@ -10790,7 +10790,7 @@
         </w:rPr>
         <w:t xml:space="preserve"> </w:t>
       </w:r>
-      <w:hyperlink w:anchor="awesome-mnemonics-">
+      <w:hyperlink w:anchor="awesome-mnemonics---complete-guide">
         <w:r>
           <w:rPr>
             <w:rStyle w:val="Hyperlink"/>

</xml_diff>

<commit_message>
v2.1: SNR (Who Uses, CLI); Complete Guide synced; CLI package
- SNR: Who Uses (shorter CTA, social proof); CLI (one-line install/examples)
- Complete Guide: Who Uses, CLI section, TOC; Quick Ref release line
- mnemonic_cli package, pyproject.toml, scripts/mnemonic launcher
- v2.1 ZIPs; CHANGELOG [2.1.0]
</commit_message>
<xml_diff>
--- a/releases/Awesome-Mnemonics-Complete-Guide.docx
+++ b/releases/Awesome-Mnemonics-Complete-Guide.docx
@@ -28,7 +28,7 @@
         </w:p>
       </w:sdtContent>
     </w:sdt>
-    <w:bookmarkStart w:id="88" w:name="awesome-mnemonics---complete-guide"/>
+    <w:bookmarkStart w:id="89" w:name="awesome-mnemonics---complete-guide"/>
     <w:p>
       <w:pPr>
         <w:pStyle w:val="Heading1"/>
@@ -98,7 +98,7 @@
           <w:i/>
           <w:iCs/>
         </w:rPr>
-        <w:t xml:space="preserve">Release v2.0 — 2026-01-25</w:t>
+        <w:t xml:space="preserve">Release v2.1 — 2026-01-25</w:t>
       </w:r>
     </w:p>
     <w:p>
@@ -2096,29 +2096,65 @@
       <w:pPr>
         <w:pStyle w:val="FirstParagraph"/>
       </w:pPr>
-      <w:hyperlink r:id="rId17">
-        <w:r>
-          <w:rPr>
-            <w:rStyle w:val="Hyperlink"/>
-            <w:i/>
-            <w:iCs/>
-          </w:rPr>
-          <w:t xml:space="preserve">Add your team</w:t>
-        </w:r>
-      </w:hyperlink>
       <w:r>
         <w:rPr>
           <w:i/>
           <w:iCs/>
         </w:rPr>
-        <w:t xml:space="preserve"> </w:t>
+        <w:t xml:space="preserve">No entries yet —</w:t>
       </w:r>
       <w:r>
         <w:rPr>
           <w:i/>
           <w:iCs/>
         </w:rPr>
-        <w:t xml:space="preserve">via PR if you use these in production.</w:t>
+        <w:t xml:space="preserve"> </w:t>
+      </w:r>
+      <w:r>
+        <w:rPr>
+          <w:b/>
+          <w:bCs/>
+          <w:i/>
+          <w:iCs/>
+        </w:rPr>
+        <w:t xml:space="preserve">be the first.</w:t>
+      </w:r>
+      <w:r>
+        <w:t xml:space="preserve"> </w:t>
+      </w:r>
+      <w:r>
+        <w:t xml:space="preserve">Social proof helps enterprise adoption; your org helps others.</w:t>
+      </w:r>
+    </w:p>
+    <w:p>
+      <w:pPr>
+        <w:pStyle w:val="BodyText"/>
+      </w:pPr>
+      <w:r>
+        <w:t xml:space="preserve">One-line PR, e.g. </w:t>
+      </w:r>
+      <w:r>
+        <w:rPr>
+          <w:rStyle w:val="VerbatimChar"/>
+        </w:rPr>
+        <w:t xml:space="preserve">**[Acme](https://acme.com)** — SRE uses STOP→TRACE→DEBUG</w:t>
+      </w:r>
+      <w:r>
+        <w:t xml:space="preserve">.</w:t>
+      </w:r>
+      <w:r>
+        <w:t xml:space="preserve"> </w:t>
+      </w:r>
+      <w:hyperlink r:id="rId17">
+        <w:r>
+          <w:rPr>
+            <w:rStyle w:val="Hyperlink"/>
+          </w:rPr>
+          <w:t xml:space="preserve">How</w:t>
+        </w:r>
+      </w:hyperlink>
+      <w:r>
+        <w:t xml:space="preserve">.</w:t>
       </w:r>
     </w:p>
     <w:p>
@@ -2129,31 +2165,284 @@
       </w:r>
     </w:p>
     <w:bookmarkEnd w:id="18"/>
-    <w:bookmarkStart w:id="19" w:name="mnemonic-selection-flowchart"/>
+    <w:bookmarkStart w:id="19" w:name="cli"/>
     <w:p>
       <w:pPr>
         <w:pStyle w:val="Heading2"/>
       </w:pPr>
       <w:r>
-        <w:t xml:space="preserve">🔄 Mnemonic Selection Flowchart</w:t>
+        <w:t xml:space="preserve">CLI</w:t>
       </w:r>
     </w:p>
     <w:p>
       <w:pPr>
         <w:pStyle w:val="FirstParagraph"/>
       </w:pPr>
+      <w:r>
+        <w:rPr>
+          <w:rStyle w:val="VerbatimChar"/>
+        </w:rPr>
+        <w:t xml:space="preserve">mnemonic</w:t>
+      </w:r>
+      <w:r>
+        <w:t xml:space="preserve"> </w:t>
+      </w:r>
+      <w:r>
+        <w:t xml:space="preserve">— pipeline and search from</w:t>
+      </w:r>
+      <w:r>
+        <w:t xml:space="preserve"> </w:t>
+      </w:r>
+      <w:r>
+        <w:rPr>
+          <w:rStyle w:val="VerbatimChar"/>
+        </w:rPr>
+        <w:t xml:space="preserve">mnemonics-index.yaml</w:t>
+      </w:r>
+      <w:r>
+        <w:t xml:space="preserve">.</w:t>
+      </w:r>
+    </w:p>
+    <w:p>
+      <w:pPr>
+        <w:pStyle w:val="BodyText"/>
+      </w:pPr>
+      <w:r>
+        <w:rPr>
+          <w:b/>
+          <w:bCs/>
+        </w:rPr>
+        <w:t xml:space="preserve">Install:</w:t>
+      </w:r>
+      <w:r>
+        <w:t xml:space="preserve"> </w:t>
+      </w:r>
+      <w:r>
+        <w:t xml:space="preserve">From repo:</w:t>
+      </w:r>
+      <w:r>
+        <w:t xml:space="preserve"> </w:t>
+      </w:r>
+      <w:r>
+        <w:rPr>
+          <w:rStyle w:val="VerbatimChar"/>
+        </w:rPr>
+        <w:t xml:space="preserve">pip install -r scripts/requirements.txt</w:t>
+      </w:r>
+      <w:r>
+        <w:t xml:space="preserve"> </w:t>
+      </w:r>
+      <w:r>
+        <w:t xml:space="preserve">then</w:t>
+      </w:r>
+      <w:r>
+        <w:t xml:space="preserve"> </w:t>
+      </w:r>
+      <w:r>
+        <w:rPr>
+          <w:rStyle w:val="VerbatimChar"/>
+        </w:rPr>
+        <w:t xml:space="preserve">./scripts/mnemonic</w:t>
+      </w:r>
+      <w:r>
+        <w:t xml:space="preserve">. Package:</w:t>
+      </w:r>
+      <w:r>
+        <w:t xml:space="preserve"> </w:t>
+      </w:r>
+      <w:r>
+        <w:rPr>
+          <w:rStyle w:val="VerbatimChar"/>
+        </w:rPr>
+        <w:t xml:space="preserve">pip install git+https://github.com/StewAlexander-com/Awesome-Mnemonics.git</w:t>
+      </w:r>
+      <w:r>
+        <w:t xml:space="preserve">.</w:t>
+      </w:r>
+      <w:r>
+        <w:t xml:space="preserve"> </w:t>
+      </w:r>
       <w:r>
         <w:rPr>
           <w:i/>
           <w:iCs/>
         </w:rPr>
-        <w:t xml:space="preserve">📱 If hard to read:</w:t>
-      </w:r>
+        <w:t xml:space="preserve">Homebrew: not yet.</w:t>
+      </w:r>
+    </w:p>
+    <w:p>
+      <w:pPr>
+        <w:pStyle w:val="BodyText"/>
+      </w:pPr>
+      <w:r>
+        <w:rPr>
+          <w:b/>
+          <w:bCs/>
+        </w:rPr>
+        <w:t xml:space="preserve">Examples:</w:t>
+      </w:r>
+      <w:r>
+        <w:t xml:space="preserve"> </w:t>
+      </w:r>
+      <w:r>
+        <w:rPr>
+          <w:rStyle w:val="VerbatimChar"/>
+        </w:rPr>
+        <w:t xml:space="preserve">mnemonic --help</w:t>
+      </w:r>
+      <w:r>
+        <w:t xml:space="preserve"> </w:t>
+      </w:r>
+      <w:r>
+        <w:t xml:space="preserve">·</w:t>
+      </w:r>
+      <w:r>
+        <w:t xml:space="preserve"> </w:t>
+      </w:r>
+      <w:r>
+        <w:rPr>
+          <w:rStyle w:val="VerbatimChar"/>
+        </w:rPr>
+        <w:t xml:space="preserve">mnemonic pipeline</w:t>
+      </w:r>
+      <w:r>
+        <w:t xml:space="preserve"> </w:t>
+      </w:r>
+      <w:r>
+        <w:t xml:space="preserve">/</w:t>
+      </w:r>
+      <w:r>
+        <w:t xml:space="preserve"> </w:t>
+      </w:r>
+      <w:r>
+        <w:rPr>
+          <w:rStyle w:val="VerbatimChar"/>
+        </w:rPr>
+        <w:t xml:space="preserve">pipeline crisis</w:t>
+      </w:r>
+      <w:r>
+        <w:t xml:space="preserve"> </w:t>
+      </w:r>
+      <w:r>
+        <w:t xml:space="preserve">·</w:t>
+      </w:r>
+      <w:r>
+        <w:t xml:space="preserve"> </w:t>
+      </w:r>
+      <w:r>
+        <w:rPr>
+          <w:rStyle w:val="VerbatimChar"/>
+        </w:rPr>
+        <w:t xml:space="preserve">mnemonic search network</w:t>
+      </w:r>
+      <w:r>
+        <w:t xml:space="preserve"> </w:t>
+      </w:r>
+      <w:r>
+        <w:t xml:space="preserve">·</w:t>
+      </w:r>
+      <w:r>
+        <w:t xml:space="preserve"> </w:t>
+      </w:r>
+      <w:r>
+        <w:rPr>
+          <w:rStyle w:val="VerbatimChar"/>
+        </w:rPr>
+        <w:t xml:space="preserve">mnemonic search stress -o json</w:t>
+      </w:r>
+    </w:p>
+    <w:p>
+      <w:pPr>
+        <w:pStyle w:val="BodyText"/>
+      </w:pPr>
+      <w:r>
+        <w:rPr>
+          <w:rStyle w:val="VerbatimChar"/>
+          <w:b/>
+          <w:bCs/>
+        </w:rPr>
+        <w:t xml:space="preserve">--output</w:t>
+      </w:r>
+      <w:r>
+        <w:rPr>
+          <w:b/>
+          <w:bCs/>
+        </w:rPr>
+        <w:t xml:space="preserve">:</w:t>
+      </w:r>
+      <w:r>
+        <w:t xml:space="preserve"> </w:t>
+      </w:r>
+      <w:r>
+        <w:rPr>
+          <w:rStyle w:val="VerbatimChar"/>
+        </w:rPr>
+        <w:t xml:space="preserve">table</w:t>
+      </w:r>
+      <w:r>
+        <w:t xml:space="preserve"> </w:t>
+      </w:r>
+      <w:r>
+        <w:t xml:space="preserve">(default),</w:t>
+      </w:r>
+      <w:r>
+        <w:t xml:space="preserve"> </w:t>
+      </w:r>
+      <w:r>
+        <w:rPr>
+          <w:rStyle w:val="VerbatimChar"/>
+        </w:rPr>
+        <w:t xml:space="preserve">json</w:t>
+      </w:r>
+      <w:r>
+        <w:t xml:space="preserve">,</w:t>
+      </w:r>
+      <w:r>
+        <w:t xml:space="preserve"> </w:t>
+      </w:r>
+      <w:r>
+        <w:rPr>
+          <w:rStyle w:val="VerbatimChar"/>
+        </w:rPr>
+        <w:t xml:space="preserve">markdown</w:t>
+      </w:r>
+      <w:r>
+        <w:t xml:space="preserve">.</w:t>
+      </w:r>
+    </w:p>
+    <w:p>
+      <w:r>
+        <w:pict>
+          <v:rect style="width:0;height:1.5pt" o:hralign="center" o:hrstd="t" o:hr="t"/>
+        </w:pict>
+      </w:r>
+    </w:p>
+    <w:bookmarkEnd w:id="19"/>
+    <w:bookmarkStart w:id="20" w:name="mnemonic-selection-flowchart"/>
+    <w:p>
+      <w:pPr>
+        <w:pStyle w:val="Heading2"/>
+      </w:pPr>
+      <w:r>
+        <w:t xml:space="preserve">🔄 Mnemonic Selection Flowchart</w:t>
+      </w:r>
+    </w:p>
+    <w:p>
+      <w:pPr>
+        <w:pStyle w:val="FirstParagraph"/>
+      </w:pPr>
       <w:r>
         <w:rPr>
           <w:i/>
           <w:iCs/>
         </w:rPr>
+        <w:t xml:space="preserve">📱 If hard to read:</w:t>
+      </w:r>
+      <w:r>
+        <w:rPr>
+          <w:i/>
+          <w:iCs/>
+        </w:rPr>
         <w:t xml:space="preserve"> </w:t>
       </w:r>
       <w:hyperlink w:anchor="quick-reference--on-call-guide">
@@ -2433,8 +2722,8 @@
         <w:t xml:space="preserve">.</w:t>
       </w:r>
     </w:p>
-    <w:bookmarkEnd w:id="19"/>
-    <w:bookmarkStart w:id="20" w:name="table-of-contents"/>
+    <w:bookmarkEnd w:id="20"/>
+    <w:bookmarkStart w:id="21" w:name="table-of-contents"/>
     <w:p>
       <w:pPr>
         <w:pStyle w:val="Heading2"/>
@@ -2604,12 +2893,12 @@
           <w:numId w:val="1002"/>
         </w:numPr>
       </w:pPr>
-      <w:hyperlink w:anchor="mnemonic-selection-flowchart">
-        <w:r>
-          <w:rPr>
-            <w:rStyle w:val="Hyperlink"/>
-          </w:rPr>
-          <w:t xml:space="preserve">🔄 Mnemonic Selection Flowchart</w:t>
+      <w:hyperlink w:anchor="cli">
+        <w:r>
+          <w:rPr>
+            <w:rStyle w:val="Hyperlink"/>
+          </w:rPr>
+          <w:t xml:space="preserve">CLI</w:t>
         </w:r>
       </w:hyperlink>
     </w:p>
@@ -2621,12 +2910,12 @@
           <w:numId w:val="1002"/>
         </w:numPr>
       </w:pPr>
-      <w:hyperlink w:anchor="table-of-contents">
-        <w:r>
-          <w:rPr>
-            <w:rStyle w:val="Hyperlink"/>
-          </w:rPr>
-          <w:t xml:space="preserve">Table of Contents</w:t>
+      <w:hyperlink w:anchor="mnemonic-selection-flowchart">
+        <w:r>
+          <w:rPr>
+            <w:rStyle w:val="Hyperlink"/>
+          </w:rPr>
+          <w:t xml:space="preserve">🔄 Mnemonic Selection Flowchart</w:t>
         </w:r>
       </w:hyperlink>
     </w:p>
@@ -2638,6 +2927,23 @@
           <w:numId w:val="1002"/>
         </w:numPr>
       </w:pPr>
+      <w:hyperlink w:anchor="table-of-contents">
+        <w:r>
+          <w:rPr>
+            <w:rStyle w:val="Hyperlink"/>
+          </w:rPr>
+          <w:t xml:space="preserve">Table of Contents</w:t>
+        </w:r>
+      </w:hyperlink>
+    </w:p>
+    <w:p>
+      <w:pPr>
+        <w:pStyle w:val="Compact"/>
+        <w:numPr>
+          <w:ilvl w:val="1"/>
+          <w:numId w:val="1002"/>
+        </w:numPr>
+      </w:pPr>
       <w:hyperlink w:anchor="problem-solving-techniques">
         <w:r>
           <w:rPr>
@@ -3560,8 +3866,8 @@
         </w:r>
       </w:hyperlink>
     </w:p>
-    <w:bookmarkEnd w:id="20"/>
-    <w:bookmarkStart w:id="26" w:name="problem-solving-techniques"/>
+    <w:bookmarkEnd w:id="21"/>
+    <w:bookmarkStart w:id="27" w:name="problem-solving-techniques"/>
     <w:p>
       <w:pPr>
         <w:pStyle w:val="Heading2"/>
@@ -3582,7 +3888,7 @@
         <w:t xml:space="preserve">Start here for systematic approaches to complex problems.</w:t>
       </w:r>
     </w:p>
-    <w:bookmarkStart w:id="21" w:name="prepare"/>
+    <w:bookmarkStart w:id="22" w:name="prepare"/>
     <w:p>
       <w:pPr>
         <w:pStyle w:val="Heading3"/>
@@ -4639,8 +4945,8 @@
         <w:t xml:space="preserve">Deployment failures - Why? Pipeline failed. Why? Tests timed out. Why? Database slow. Why? Index missing. Why? Schema change didn’t include migration. Root cause: Missing migration validation step</w:t>
       </w:r>
     </w:p>
-    <w:bookmarkEnd w:id="21"/>
-    <w:bookmarkStart w:id="22" w:name="ishikawa-fishbone-diagram"/>
+    <w:bookmarkEnd w:id="22"/>
+    <w:bookmarkStart w:id="23" w:name="ishikawa-fishbone-diagram"/>
     <w:p>
       <w:pPr>
         <w:pStyle w:val="Heading3"/>
@@ -4947,8 +5253,8 @@
         <w:t xml:space="preserve">→ missing health-check in pipeline. Root cause: CI didn’t run post-deploy checks.</w:t>
       </w:r>
     </w:p>
-    <w:bookmarkEnd w:id="22"/>
-    <w:bookmarkStart w:id="23" w:name="d-approach"/>
+    <w:bookmarkEnd w:id="23"/>
+    <w:bookmarkStart w:id="24" w:name="d-approach"/>
     <w:p>
       <w:pPr>
         <w:pStyle w:val="Heading3"/>
@@ -5306,8 +5612,8 @@
         <w:t xml:space="preserve">: phishing → no MFA → insufficient training), Implement MFA, Validate with penetration test, Prevent (mandatory security awareness), Celebrate team response</w:t>
       </w:r>
     </w:p>
-    <w:bookmarkEnd w:id="23"/>
-    <w:bookmarkStart w:id="24" w:name="a3-problem-solving"/>
+    <w:bookmarkEnd w:id="24"/>
+    <w:bookmarkStart w:id="25" w:name="a3-problem-solving"/>
     <w:p>
       <w:pPr>
         <w:pStyle w:val="Heading3"/>
@@ -5606,8 +5912,8 @@
         <w:t xml:space="preserve">Sprint overruns - A3: Background (delivery slipping), Current state (scope creep, no Definition of Done), Goal (predictable sprints), Root cause (5 Whys → no intake prioritization), Countermeasures (backlog refinement + DoD), Plan (next 2 sprints). Share with product and eng leadership on one page.</w:t>
       </w:r>
     </w:p>
-    <w:bookmarkEnd w:id="24"/>
-    <w:bookmarkStart w:id="25" w:name="ps"/>
+    <w:bookmarkEnd w:id="25"/>
+    <w:bookmarkStart w:id="26" w:name="ps"/>
     <w:p>
       <w:pPr>
         <w:pStyle w:val="Heading3"/>
@@ -5648,9 +5954,9 @@
         <w:t xml:space="preserve">.</w:t>
       </w:r>
     </w:p>
-    <w:bookmarkEnd w:id="25"/>
     <w:bookmarkEnd w:id="26"/>
-    <w:bookmarkStart w:id="30" w:name="problem-analysis"/>
+    <w:bookmarkEnd w:id="27"/>
+    <w:bookmarkStart w:id="31" w:name="problem-analysis"/>
     <w:p>
       <w:pPr>
         <w:pStyle w:val="Heading2"/>
@@ -5671,7 +5977,7 @@
         <w:t xml:space="preserve">Frameworks for scope and impact.</w:t>
       </w:r>
     </w:p>
-    <w:bookmarkStart w:id="27" w:name="raci"/>
+    <w:bookmarkStart w:id="28" w:name="raci"/>
     <w:p>
       <w:pPr>
         <w:pStyle w:val="Heading3"/>
@@ -5958,8 +6264,8 @@
         <w:t xml:space="preserve">Cloud migration planning - Political (vendor lock-in concerns), Economic (cost optimization), Technological (API compatibility), Legal (data sovereignty requirements)</w:t>
       </w:r>
     </w:p>
-    <w:bookmarkEnd w:id="27"/>
-    <w:bookmarkStart w:id="29" w:name="swot"/>
+    <w:bookmarkEnd w:id="28"/>
+    <w:bookmarkStart w:id="30" w:name="swot"/>
     <w:p>
       <w:pPr>
         <w:pStyle w:val="Heading3"/>
@@ -6179,7 +6485,7 @@
       <w:pPr>
         <w:pStyle w:val="BodyText"/>
       </w:pPr>
-      <w:hyperlink r:id="rId28">
+      <w:hyperlink r:id="rId29">
         <w:r>
           <w:rPr>
             <w:rStyle w:val="Hyperlink"/>
@@ -6190,9 +6496,9 @@
         </w:r>
       </w:hyperlink>
     </w:p>
-    <w:bookmarkEnd w:id="29"/>
     <w:bookmarkEnd w:id="30"/>
-    <w:bookmarkStart w:id="34" w:name="problem-resolution-threats"/>
+    <w:bookmarkEnd w:id="31"/>
+    <w:bookmarkStart w:id="35" w:name="problem-resolution-threats"/>
     <w:p>
       <w:pPr>
         <w:pStyle w:val="Heading2"/>
@@ -6213,7 +6519,7 @@
         <w:t xml:space="preserve">Blockers before they derail.</w:t>
       </w:r>
     </w:p>
-    <w:bookmarkStart w:id="31" w:name="dice"/>
+    <w:bookmarkStart w:id="32" w:name="dice"/>
     <w:p>
       <w:pPr>
         <w:pStyle w:val="Heading3"/>
@@ -6328,8 +6634,8 @@
         <w:t xml:space="preserve">phase.</w:t>
       </w:r>
     </w:p>
-    <w:bookmarkEnd w:id="31"/>
-    <w:bookmarkStart w:id="32" w:name="fate"/>
+    <w:bookmarkEnd w:id="32"/>
+    <w:bookmarkStart w:id="33" w:name="fate"/>
     <w:p>
       <w:pPr>
         <w:pStyle w:val="Heading3"/>
@@ -6411,8 +6717,8 @@
         <w:t xml:space="preserve">to validate resources.</w:t>
       </w:r>
     </w:p>
-    <w:bookmarkEnd w:id="32"/>
-    <w:bookmarkStart w:id="33" w:name="pest"/>
+    <w:bookmarkEnd w:id="33"/>
+    <w:bookmarkStart w:id="34" w:name="pest"/>
     <w:p>
       <w:pPr>
         <w:pStyle w:val="Heading3"/>
@@ -6477,9 +6783,9 @@
         <w:t xml:space="preserve">External threats to solutions; how to combat/remove.</w:t>
       </w:r>
     </w:p>
-    <w:bookmarkEnd w:id="33"/>
     <w:bookmarkEnd w:id="34"/>
-    <w:bookmarkStart w:id="37" w:name="communication-conflict"/>
+    <w:bookmarkEnd w:id="35"/>
+    <w:bookmarkStart w:id="38" w:name="communication-conflict"/>
     <w:p>
       <w:pPr>
         <w:pStyle w:val="Heading2"/>
@@ -6500,7 +6806,7 @@
         <w:t xml:space="preserve">Calm, productive in difficult conversations.</w:t>
       </w:r>
     </w:p>
-    <w:bookmarkStart w:id="35" w:name="breathe"/>
+    <w:bookmarkStart w:id="36" w:name="breathe"/>
     <w:p>
       <w:pPr>
         <w:pStyle w:val="Heading3"/>
@@ -6874,8 +7180,8 @@
         <w:t xml:space="preserve">Heated debate about architecture decision - Put in perspective (not life-or-death), Acknowledge both viewpoints have merit, Don’t decide now, Step away for lunch break, Evaluate pros/cons offline, Return with structured comparison</w:t>
       </w:r>
     </w:p>
-    <w:bookmarkEnd w:id="35"/>
-    <w:bookmarkStart w:id="36" w:name="wait"/>
+    <w:bookmarkEnd w:id="36"/>
+    <w:bookmarkStart w:id="37" w:name="wait"/>
     <w:p>
       <w:pPr>
         <w:pStyle w:val="Heading3"/>
@@ -7062,9 +7368,9 @@
         <w:t xml:space="preserve">(defend or resolve?). BREATHE+PAUSE; respond later with facts.</w:t>
       </w:r>
     </w:p>
-    <w:bookmarkEnd w:id="36"/>
     <w:bookmarkEnd w:id="37"/>
-    <w:bookmarkStart w:id="47" w:name="stress-resilience"/>
+    <w:bookmarkEnd w:id="38"/>
+    <w:bookmarkStart w:id="48" w:name="stress-resilience"/>
     <w:p>
       <w:pPr>
         <w:pStyle w:val="Heading2"/>
@@ -7085,7 +7391,7 @@
         <w:t xml:space="preserve">Calm and connected under pressure.</w:t>
       </w:r>
     </w:p>
-    <w:bookmarkStart w:id="38" w:name="pace"/>
+    <w:bookmarkStart w:id="39" w:name="pace"/>
     <w:p>
       <w:pPr>
         <w:pStyle w:val="Heading3"/>
@@ -7150,8 +7456,8 @@
         <w:t xml:space="preserve">First in PACE→ARIES→CALM→SHINE; immediate stress.</w:t>
       </w:r>
     </w:p>
-    <w:bookmarkEnd w:id="38"/>
-    <w:bookmarkStart w:id="39" w:name="stop"/>
+    <w:bookmarkEnd w:id="39"/>
+    <w:bookmarkStart w:id="40" w:name="stop"/>
     <w:p>
       <w:pPr>
         <w:pStyle w:val="Heading3"/>
@@ -7449,8 +7755,8 @@
         <w:t xml:space="preserve">Production alert at 2 AM - Step back (don’t panic), Take deep breath (reduce adrenaline), Observe (read alert details), Pull back perspective (assess severity before waking team), Then proceed to TRACE for diagnostics</w:t>
       </w:r>
     </w:p>
-    <w:bookmarkEnd w:id="39"/>
-    <w:bookmarkStart w:id="40" w:name="aries"/>
+    <w:bookmarkEnd w:id="40"/>
+    <w:bookmarkStart w:id="41" w:name="aries"/>
     <w:p>
       <w:pPr>
         <w:pStyle w:val="Heading3"/>
@@ -7524,8 +7830,8 @@
         <w:t xml:space="preserve">Lifestyle in PACE→ARIES→CALM; long-term (2–4 weeks).</w:t>
       </w:r>
     </w:p>
-    <w:bookmarkEnd w:id="40"/>
-    <w:bookmarkStart w:id="41" w:name="help"/>
+    <w:bookmarkEnd w:id="41"/>
+    <w:bookmarkStart w:id="42" w:name="help"/>
     <w:p>
       <w:pPr>
         <w:pStyle w:val="Heading3"/>
@@ -7572,8 +7878,8 @@
         <w:t xml:space="preserve">P - Pace yourself and set limits</w:t>
       </w:r>
     </w:p>
-    <w:bookmarkEnd w:id="41"/>
-    <w:bookmarkStart w:id="42" w:name="handle"/>
+    <w:bookmarkEnd w:id="42"/>
+    <w:bookmarkStart w:id="43" w:name="handle"/>
     <w:p>
       <w:pPr>
         <w:pStyle w:val="Heading3"/>
@@ -7638,8 +7944,8 @@
         <w:t xml:space="preserve">E - Exercise regularly</w:t>
       </w:r>
     </w:p>
-    <w:bookmarkEnd w:id="42"/>
-    <w:bookmarkStart w:id="43" w:name="calm"/>
+    <w:bookmarkEnd w:id="43"/>
+    <w:bookmarkStart w:id="44" w:name="calm"/>
     <w:p>
       <w:pPr>
         <w:pStyle w:val="Heading3"/>
@@ -7784,8 +8090,8 @@
         <w:t xml:space="preserve">)</w:t>
       </w:r>
     </w:p>
-    <w:bookmarkEnd w:id="43"/>
-    <w:bookmarkStart w:id="44" w:name="push"/>
+    <w:bookmarkEnd w:id="44"/>
+    <w:bookmarkStart w:id="45" w:name="push"/>
     <w:p>
       <w:pPr>
         <w:pStyle w:val="Heading3"/>
@@ -7832,8 +8138,8 @@
         <w:t xml:space="preserve">H - Have a positive outlook  </w:t>
       </w:r>
     </w:p>
-    <w:bookmarkEnd w:id="44"/>
-    <w:bookmarkStart w:id="45" w:name="hope"/>
+    <w:bookmarkEnd w:id="45"/>
+    <w:bookmarkStart w:id="46" w:name="hope"/>
     <w:p>
       <w:pPr>
         <w:pStyle w:val="Heading3"/>
@@ -7880,8 +8186,8 @@
         <w:t xml:space="preserve">E - Exercise regularly  </w:t>
       </w:r>
     </w:p>
-    <w:bookmarkEnd w:id="45"/>
-    <w:bookmarkStart w:id="46" w:name="shine"/>
+    <w:bookmarkEnd w:id="46"/>
+    <w:bookmarkStart w:id="47" w:name="shine"/>
     <w:p>
       <w:pPr>
         <w:pStyle w:val="Heading3"/>
@@ -7969,9 +8275,9 @@
         <w:t xml:space="preserve">.</w:t>
       </w:r>
     </w:p>
-    <w:bookmarkEnd w:id="46"/>
     <w:bookmarkEnd w:id="47"/>
-    <w:bookmarkStart w:id="51" w:name="infrastructure-systems-engineering"/>
+    <w:bookmarkEnd w:id="48"/>
+    <w:bookmarkStart w:id="52" w:name="infrastructure-systems-engineering"/>
     <w:p>
       <w:pPr>
         <w:pStyle w:val="Heading2"/>
@@ -7992,7 +8298,7 @@
         <w:t xml:space="preserve">Infra and DevOps.</w:t>
       </w:r>
     </w:p>
-    <w:bookmarkStart w:id="48" w:name="trace-network-troubleshooting"/>
+    <w:bookmarkStart w:id="49" w:name="trace-network-troubleshooting"/>
     <w:p>
       <w:pPr>
         <w:pStyle w:val="Heading3"/>
@@ -8134,8 +8440,8 @@
         </w:r>
       </w:hyperlink>
     </w:p>
-    <w:bookmarkEnd w:id="48"/>
-    <w:bookmarkStart w:id="49" w:name="scale-infrastructure-design"/>
+    <w:bookmarkEnd w:id="49"/>
+    <w:bookmarkStart w:id="50" w:name="scale-infrastructure-design"/>
     <w:p>
       <w:pPr>
         <w:pStyle w:val="Heading3"/>
@@ -8305,8 +8611,8 @@
         </w:r>
       </w:hyperlink>
     </w:p>
-    <w:bookmarkEnd w:id="49"/>
-    <w:bookmarkStart w:id="50" w:name="debug-code-system-analysis"/>
+    <w:bookmarkEnd w:id="50"/>
+    <w:bookmarkStart w:id="51" w:name="debug-code-system-analysis"/>
     <w:p>
       <w:pPr>
         <w:pStyle w:val="Heading3"/>
@@ -8473,9 +8779,9 @@
         </w:r>
       </w:hyperlink>
     </w:p>
-    <w:bookmarkEnd w:id="50"/>
     <w:bookmarkEnd w:id="51"/>
-    <w:bookmarkStart w:id="58" w:name="proven-mnemonic-pipelines"/>
+    <w:bookmarkEnd w:id="52"/>
+    <w:bookmarkStart w:id="59" w:name="proven-mnemonic-pipelines"/>
     <w:p>
       <w:pPr>
         <w:pStyle w:val="Heading2"/>
@@ -8496,7 +8802,7 @@
         <w:t xml:space="preserve">Chains combine mnemonics into workflows for high-pressure scenarios; battle-tested.</w:t>
       </w:r>
     </w:p>
-    <w:bookmarkStart w:id="52" w:name="crisis-response-chain"/>
+    <w:bookmarkStart w:id="53" w:name="crisis-response-chain"/>
     <w:p>
       <w:pPr>
         <w:pStyle w:val="Heading3"/>
@@ -8660,8 +8966,8 @@
         <w:t xml:space="preserve">STOP stabilizes; TRACE gathers evidence; DEBUG structures analysis; 8D prevents recurrence.</w:t>
       </w:r>
     </w:p>
-    <w:bookmarkEnd w:id="52"/>
-    <w:bookmarkStart w:id="53" w:name="conflict-resolution-chain"/>
+    <w:bookmarkEnd w:id="53"/>
+    <w:bookmarkStart w:id="54" w:name="conflict-resolution-chain"/>
     <w:p>
       <w:pPr>
         <w:pStyle w:val="Heading3"/>
@@ -8825,8 +9131,8 @@
         <w:t xml:space="preserve">WAIT prevents escalation; BREATHE regulates; PAUSE creates space; RACI clarifies roles (often the root cause).</w:t>
       </w:r>
     </w:p>
-    <w:bookmarkEnd w:id="53"/>
-    <w:bookmarkStart w:id="54" w:name="root-cause-investigation-chain"/>
+    <w:bookmarkEnd w:id="54"/>
+    <w:bookmarkStart w:id="55" w:name="root-cause-investigation-chain"/>
     <w:p>
       <w:pPr>
         <w:pStyle w:val="Heading3"/>
@@ -8990,8 +9296,8 @@
         <w:t xml:space="preserve">ICEBERG structures; 5 Whys drill to root cause; PADDER plans; RACI ensures accountability.</w:t>
       </w:r>
     </w:p>
-    <w:bookmarkEnd w:id="54"/>
-    <w:bookmarkStart w:id="55" w:name="strategic-design-chain"/>
+    <w:bookmarkEnd w:id="55"/>
+    <w:bookmarkStart w:id="56" w:name="strategic-design-chain"/>
     <w:p>
       <w:pPr>
         <w:pStyle w:val="Heading3"/>
@@ -9155,8 +9461,8 @@
         <w:t xml:space="preserve">SCALE sets requirements; SWOT evaluates; PESTEL finds external risks; SET manages expectations.</w:t>
       </w:r>
     </w:p>
-    <w:bookmarkEnd w:id="55"/>
-    <w:bookmarkStart w:id="56" w:name="stress-burnout-recovery-chain"/>
+    <w:bookmarkEnd w:id="56"/>
+    <w:bookmarkStart w:id="57" w:name="stress-burnout-recovery-chain"/>
     <w:p>
       <w:pPr>
         <w:pStyle w:val="Heading3"/>
@@ -9320,8 +9626,8 @@
         <w:t xml:space="preserve">PACE (immediate); ARIES (lifestyle); CALM (resilience); SHINE (sustainable).</w:t>
       </w:r>
     </w:p>
-    <w:bookmarkEnd w:id="56"/>
-    <w:bookmarkStart w:id="57" w:name="rapid-triage-chain"/>
+    <w:bookmarkEnd w:id="57"/>
+    <w:bookmarkStart w:id="58" w:name="rapid-triage-chain"/>
     <w:p>
       <w:pPr>
         <w:pStyle w:val="Heading3"/>
@@ -9468,9 +9774,9 @@
         <w:t xml:space="preserve">IDEA (fast frame); DICE (blockers); FATE (resources).</w:t>
       </w:r>
     </w:p>
-    <w:bookmarkEnd w:id="57"/>
     <w:bookmarkEnd w:id="58"/>
-    <w:bookmarkStart w:id="59" w:name="pipeline-selection-matrix"/>
+    <w:bookmarkEnd w:id="59"/>
+    <w:bookmarkStart w:id="60" w:name="pipeline-selection-matrix"/>
     <w:p>
       <w:pPr>
         <w:pStyle w:val="Heading2"/>
@@ -10078,8 +10384,8 @@
         </w:pict>
       </w:r>
     </w:p>
-    <w:bookmarkEnd w:id="59"/>
-    <w:bookmarkStart w:id="60" w:name="pro-tips"/>
+    <w:bookmarkEnd w:id="60"/>
+    <w:bookmarkStart w:id="61" w:name="pro-tips"/>
     <w:p>
       <w:pPr>
         <w:pStyle w:val="Heading2"/>
@@ -10270,8 +10576,8 @@
         </w:pict>
       </w:r>
     </w:p>
-    <w:bookmarkEnd w:id="60"/>
-    <w:bookmarkStart w:id="61" w:name="common-mistakes"/>
+    <w:bookmarkEnd w:id="61"/>
+    <w:bookmarkStart w:id="62" w:name="common-mistakes"/>
     <w:p>
       <w:pPr>
         <w:pStyle w:val="Heading2"/>
@@ -10801,8 +11107,8 @@
         </w:r>
       </w:hyperlink>
     </w:p>
-    <w:bookmarkEnd w:id="61"/>
-    <w:bookmarkStart w:id="63" w:name="contributing"/>
+    <w:bookmarkEnd w:id="62"/>
+    <w:bookmarkStart w:id="64" w:name="contributing"/>
     <w:p>
       <w:pPr>
         <w:pStyle w:val="Heading2"/>
@@ -10875,7 +11181,7 @@
       <w:r>
         <w:t xml:space="preserve"> </w:t>
       </w:r>
-      <w:hyperlink r:id="rId62">
+      <w:hyperlink r:id="rId63">
         <w:r>
           <w:rPr>
             <w:rStyle w:val="Hyperlink"/>
@@ -10897,8 +11203,8 @@
         </w:pict>
       </w:r>
     </w:p>
-    <w:bookmarkEnd w:id="63"/>
-    <w:bookmarkStart w:id="76" w:name="release-versions"/>
+    <w:bookmarkEnd w:id="64"/>
+    <w:bookmarkStart w:id="77" w:name="release-versions"/>
     <w:p>
       <w:pPr>
         <w:pStyle w:val="Heading2"/>
@@ -10927,7 +11233,7 @@
       <w:r>
         <w:t xml:space="preserve"> </w:t>
       </w:r>
-      <w:hyperlink r:id="rId64">
+      <w:hyperlink r:id="rId65">
         <w:r>
           <w:rPr>
             <w:rStyle w:val="Hyperlink"/>
@@ -10950,7 +11256,7 @@
       <w:r>
         <w:t xml:space="preserve"> </w:t>
       </w:r>
-      <w:hyperlink r:id="rId65">
+      <w:hyperlink r:id="rId66">
         <w:r>
           <w:rPr>
             <w:rStyle w:val="Hyperlink"/>
@@ -10967,7 +11273,7 @@
       <w:r>
         <w:t xml:space="preserve"> </w:t>
       </w:r>
-      <w:hyperlink r:id="rId66">
+      <w:hyperlink r:id="rId67">
         <w:r>
           <w:rPr>
             <w:rStyle w:val="Hyperlink"/>
@@ -10996,7 +11302,7 @@
       <w:r>
         <w:t xml:space="preserve"> </w:t>
       </w:r>
-      <w:hyperlink r:id="rId67">
+      <w:hyperlink r:id="rId68">
         <w:r>
           <w:rPr>
             <w:rStyle w:val="Hyperlink"/>
@@ -11007,7 +11313,7 @@
       <w:r>
         <w:t xml:space="preserve"> </w:t>
       </w:r>
-      <w:hyperlink r:id="rId68">
+      <w:hyperlink r:id="rId69">
         <w:r>
           <w:rPr>
             <w:rStyle w:val="Hyperlink"/>
@@ -11018,7 +11324,7 @@
       <w:r>
         <w:t xml:space="preserve"> </w:t>
       </w:r>
-      <w:hyperlink r:id="rId69">
+      <w:hyperlink r:id="rId70">
         <w:r>
           <w:rPr>
             <w:rStyle w:val="Hyperlink"/>
@@ -11029,7 +11335,7 @@
       <w:r>
         <w:t xml:space="preserve"> </w:t>
       </w:r>
-      <w:hyperlink r:id="rId70">
+      <w:hyperlink r:id="rId71">
         <w:r>
           <w:rPr>
             <w:rStyle w:val="Hyperlink"/>
@@ -11046,7 +11352,7 @@
       <w:r>
         <w:t xml:space="preserve"> </w:t>
       </w:r>
-      <w:hyperlink r:id="rId71">
+      <w:hyperlink r:id="rId72">
         <w:r>
           <w:rPr>
             <w:rStyle w:val="Hyperlink"/>
@@ -11057,7 +11363,7 @@
       <w:r>
         <w:t xml:space="preserve"> </w:t>
       </w:r>
-      <w:hyperlink r:id="rId72">
+      <w:hyperlink r:id="rId73">
         <w:r>
           <w:rPr>
             <w:rStyle w:val="Hyperlink"/>
@@ -11068,7 +11374,7 @@
       <w:r>
         <w:t xml:space="preserve"> </w:t>
       </w:r>
-      <w:hyperlink r:id="rId73">
+      <w:hyperlink r:id="rId74">
         <w:r>
           <w:rPr>
             <w:rStyle w:val="Hyperlink"/>
@@ -11079,7 +11385,7 @@
       <w:r>
         <w:t xml:space="preserve"> </w:t>
       </w:r>
-      <w:hyperlink r:id="rId74">
+      <w:hyperlink r:id="rId75">
         <w:r>
           <w:rPr>
             <w:rStyle w:val="Hyperlink"/>
@@ -11093,7 +11399,7 @@
       <w:r>
         <w:t xml:space="preserve"> </w:t>
       </w:r>
-      <w:hyperlink r:id="rId75">
+      <w:hyperlink r:id="rId76">
         <w:r>
           <w:rPr>
             <w:rStyle w:val="Hyperlink"/>
@@ -11125,8 +11431,8 @@
         </w:pict>
       </w:r>
     </w:p>
-    <w:bookmarkEnd w:id="76"/>
-    <w:bookmarkStart w:id="87" w:name="sources-references"/>
+    <w:bookmarkEnd w:id="77"/>
+    <w:bookmarkStart w:id="88" w:name="sources-references"/>
     <w:p>
       <w:pPr>
         <w:pStyle w:val="Heading2"/>
@@ -11135,7 +11441,7 @@
         <w:t xml:space="preserve">Sources &amp; References</w:t>
       </w:r>
     </w:p>
-    <w:bookmarkStart w:id="80" w:name="problem-solving-methodologies"/>
+    <w:bookmarkStart w:id="81" w:name="problem-solving-methodologies"/>
     <w:p>
       <w:pPr>
         <w:pStyle w:val="Heading3"/>
@@ -11181,7 +11487,7 @@
       <w:r>
         <w:t xml:space="preserve"> </w:t>
       </w:r>
-      <w:hyperlink r:id="rId77">
+      <w:hyperlink r:id="rId78">
         <w:r>
           <w:rPr>
             <w:rStyle w:val="Hyperlink"/>
@@ -11236,7 +11542,7 @@
       <w:r>
         <w:t xml:space="preserve"> </w:t>
       </w:r>
-      <w:hyperlink r:id="rId78">
+      <w:hyperlink r:id="rId79">
         <w:r>
           <w:rPr>
             <w:rStyle w:val="Hyperlink"/>
@@ -11269,7 +11575,7 @@
       <w:r>
         <w:t xml:space="preserve"> </w:t>
       </w:r>
-      <w:hyperlink r:id="rId79">
+      <w:hyperlink r:id="rId80">
         <w:r>
           <w:rPr>
             <w:rStyle w:val="Hyperlink"/>
@@ -11300,8 +11606,8 @@
         <w:t xml:space="preserve">ℹ — Curated/educational problem-solving mnemonics for this collection.</w:t>
       </w:r>
     </w:p>
-    <w:bookmarkEnd w:id="80"/>
-    <w:bookmarkStart w:id="84" w:name="strategic-analysis-frameworks"/>
+    <w:bookmarkEnd w:id="81"/>
+    <w:bookmarkStart w:id="85" w:name="strategic-analysis-frameworks"/>
     <w:p>
       <w:pPr>
         <w:pStyle w:val="Heading3"/>
@@ -11347,7 +11653,7 @@
       <w:r>
         <w:t xml:space="preserve"> </w:t>
       </w:r>
-      <w:hyperlink r:id="rId81">
+      <w:hyperlink r:id="rId82">
         <w:r>
           <w:rPr>
             <w:rStyle w:val="Hyperlink"/>
@@ -11402,7 +11708,7 @@
       <w:r>
         <w:t xml:space="preserve"> </w:t>
       </w:r>
-      <w:hyperlink r:id="rId82">
+      <w:hyperlink r:id="rId83">
         <w:r>
           <w:rPr>
             <w:rStyle w:val="Hyperlink"/>
@@ -11435,7 +11741,7 @@
       <w:r>
         <w:t xml:space="preserve"> </w:t>
       </w:r>
-      <w:hyperlink r:id="rId83">
+      <w:hyperlink r:id="rId84">
         <w:r>
           <w:rPr>
             <w:rStyle w:val="Hyperlink"/>
@@ -11481,7 +11787,7 @@
       <w:r>
         <w:t xml:space="preserve"> </w:t>
       </w:r>
-      <w:hyperlink r:id="rId28">
+      <w:hyperlink r:id="rId29">
         <w:r>
           <w:rPr>
             <w:rStyle w:val="Hyperlink"/>
@@ -11490,8 +11796,8 @@
         </w:r>
       </w:hyperlink>
     </w:p>
-    <w:bookmarkEnd w:id="84"/>
-    <w:bookmarkStart w:id="85" w:name="problem-resolution-threats-triage"/>
+    <w:bookmarkEnd w:id="85"/>
+    <w:bookmarkStart w:id="86" w:name="problem-resolution-threats-triage"/>
     <w:p>
       <w:pPr>
         <w:pStyle w:val="Heading3"/>
@@ -11522,8 +11828,8 @@
         <w:t xml:space="preserve">ℹ — Educational mnemonics for blockers and resource checks in this collection.</w:t>
       </w:r>
     </w:p>
-    <w:bookmarkEnd w:id="85"/>
-    <w:bookmarkStart w:id="86" w:name="X26575901e59616899e8b3847496560b142cc09a"/>
+    <w:bookmarkEnd w:id="86"/>
+    <w:bookmarkStart w:id="87" w:name="X26575901e59616899e8b3847496560b142cc09a"/>
     <w:p>
       <w:pPr>
         <w:pStyle w:val="Heading3"/>
@@ -11594,9 +11900,9 @@
         <w:t xml:space="preserve">✓ documented; ⚠ adapted; ℹ curated. Mix of established frameworks and educational compilations.</w:t>
       </w:r>
     </w:p>
-    <w:bookmarkEnd w:id="86"/>
     <w:bookmarkEnd w:id="87"/>
     <w:bookmarkEnd w:id="88"/>
+    <w:bookmarkEnd w:id="89"/>
     <w:sectPr>
       <w:footnotePr>
         <w:numRestart w:val="eachSect"/>

</xml_diff>

<commit_message>
v2.5: downloadable docs synced, stress bloat removed, release
- README, Complete Guide, Quick Ref: v2.5; ZIPs, PDF/DOCX/RTF rebuilt
- Stress bloat: HELP, HANDLE, PUSH, HOPE removed (mnemonics-index, mnemonic_cli)
- CHANGELOG [2.5.0]
</commit_message>
<xml_diff>
--- a/releases/Awesome-Mnemonics-Complete-Guide.docx
+++ b/releases/Awesome-Mnemonics-Complete-Guide.docx
@@ -28,7 +28,7 @@
         </w:p>
       </w:sdtContent>
     </w:sdt>
-    <w:bookmarkStart w:id="89" w:name="awesome-mnemonics---complete-guide"/>
+    <w:bookmarkStart w:id="85" w:name="awesome-mnemonics---complete-guide"/>
     <w:p>
       <w:pPr>
         <w:pStyle w:val="Heading1"/>
@@ -98,7 +98,7 @@
           <w:i/>
           <w:iCs/>
         </w:rPr>
-        <w:t xml:space="preserve">Release v2.1 — 2026-01-25</w:t>
+        <w:t xml:space="preserve">Release v2.5 — 2026-01-25</w:t>
       </w:r>
     </w:p>
     <w:p>
@@ -1935,122 +1935,6 @@
             <w:pPr>
               <w:pStyle w:val="Compact"/>
             </w:pPr>
-            <w:hyperlink w:anchor="help">
-              <w:r>
-                <w:rPr>
-                  <w:rStyle w:val="Hyperlink"/>
-                </w:rPr>
-                <w:t xml:space="preserve">HELP</w:t>
-              </w:r>
-            </w:hyperlink>
-          </w:p>
-        </w:tc>
-        <w:tc>
-          <w:tcPr/>
-          <w:p>
-            <w:pPr>
-              <w:pStyle w:val="Compact"/>
-            </w:pPr>
-            <w:r>
-              <w:t xml:space="preserve">Stress management strategies—Handle one at a time, Exercise, Learn to relax, Pace yourself</w:t>
-            </w:r>
-          </w:p>
-        </w:tc>
-      </w:tr>
-      <w:tr>
-        <w:tc>
-          <w:tcPr/>
-          <w:p>
-            <w:pPr>
-              <w:pStyle w:val="Compact"/>
-            </w:pPr>
-            <w:hyperlink w:anchor="handle">
-              <w:r>
-                <w:rPr>
-                  <w:rStyle w:val="Hyperlink"/>
-                </w:rPr>
-                <w:t xml:space="preserve">HANDLE</w:t>
-              </w:r>
-            </w:hyperlink>
-          </w:p>
-        </w:tc>
-        <w:tc>
-          <w:tcPr/>
-          <w:p>
-            <w:pPr>
-              <w:pStyle w:val="Compact"/>
-            </w:pPr>
-            <w:r>
-              <w:t xml:space="preserve">Six stress-management strategies including positive attitude and support system</w:t>
-            </w:r>
-          </w:p>
-        </w:tc>
-      </w:tr>
-      <w:tr>
-        <w:tc>
-          <w:tcPr/>
-          <w:p>
-            <w:pPr>
-              <w:pStyle w:val="Compact"/>
-            </w:pPr>
-            <w:hyperlink w:anchor="push">
-              <w:r>
-                <w:rPr>
-                  <w:rStyle w:val="Hyperlink"/>
-                </w:rPr>
-                <w:t xml:space="preserve">PUSH</w:t>
-              </w:r>
-            </w:hyperlink>
-          </w:p>
-        </w:tc>
-        <w:tc>
-          <w:tcPr/>
-          <w:p>
-            <w:pPr>
-              <w:pStyle w:val="Compact"/>
-            </w:pPr>
-            <w:r>
-              <w:t xml:space="preserve">Build positivity—Practice Gratitude, Use affirmations, Spend time with positive people, Have positive outlook</w:t>
-            </w:r>
-          </w:p>
-        </w:tc>
-      </w:tr>
-      <w:tr>
-        <w:tc>
-          <w:tcPr/>
-          <w:p>
-            <w:pPr>
-              <w:pStyle w:val="Compact"/>
-            </w:pPr>
-            <w:hyperlink w:anchor="hope">
-              <w:r>
-                <w:rPr>
-                  <w:rStyle w:val="Hyperlink"/>
-                </w:rPr>
-                <w:t xml:space="preserve">HOPE</w:t>
-              </w:r>
-            </w:hyperlink>
-          </w:p>
-        </w:tc>
-        <w:tc>
-          <w:tcPr/>
-          <w:p>
-            <w:pPr>
-              <w:pStyle w:val="Compact"/>
-            </w:pPr>
-            <w:r>
-              <w:t xml:space="preserve">Harness positive thoughts, Open up, Prioritize self-care, Exercise regularly</w:t>
-            </w:r>
-          </w:p>
-        </w:tc>
-      </w:tr>
-      <w:tr>
-        <w:tc>
-          <w:tcPr/>
-          <w:p>
-            <w:pPr>
-              <w:pStyle w:val="Compact"/>
-            </w:pPr>
             <w:hyperlink w:anchor="shine">
               <w:r>
                 <w:rPr>
@@ -3403,12 +3287,12 @@
           <w:numId w:val="1008"/>
         </w:numPr>
       </w:pPr>
-      <w:hyperlink w:anchor="help">
-        <w:r>
-          <w:rPr>
-            <w:rStyle w:val="Hyperlink"/>
-          </w:rPr>
-          <w:t xml:space="preserve">HELP</w:t>
+      <w:hyperlink w:anchor="calm">
+        <w:r>
+          <w:rPr>
+            <w:rStyle w:val="Hyperlink"/>
+          </w:rPr>
+          <w:t xml:space="preserve">CALM</w:t>
         </w:r>
       </w:hyperlink>
     </w:p>
@@ -3420,74 +3304,6 @@
           <w:numId w:val="1008"/>
         </w:numPr>
       </w:pPr>
-      <w:hyperlink w:anchor="handle">
-        <w:r>
-          <w:rPr>
-            <w:rStyle w:val="Hyperlink"/>
-          </w:rPr>
-          <w:t xml:space="preserve">HANDLE</w:t>
-        </w:r>
-      </w:hyperlink>
-    </w:p>
-    <w:p>
-      <w:pPr>
-        <w:pStyle w:val="Compact"/>
-        <w:numPr>
-          <w:ilvl w:val="2"/>
-          <w:numId w:val="1008"/>
-        </w:numPr>
-      </w:pPr>
-      <w:hyperlink w:anchor="calm">
-        <w:r>
-          <w:rPr>
-            <w:rStyle w:val="Hyperlink"/>
-          </w:rPr>
-          <w:t xml:space="preserve">CALM</w:t>
-        </w:r>
-      </w:hyperlink>
-    </w:p>
-    <w:p>
-      <w:pPr>
-        <w:pStyle w:val="Compact"/>
-        <w:numPr>
-          <w:ilvl w:val="2"/>
-          <w:numId w:val="1008"/>
-        </w:numPr>
-      </w:pPr>
-      <w:hyperlink w:anchor="push">
-        <w:r>
-          <w:rPr>
-            <w:rStyle w:val="Hyperlink"/>
-          </w:rPr>
-          <w:t xml:space="preserve">PUSH</w:t>
-        </w:r>
-      </w:hyperlink>
-    </w:p>
-    <w:p>
-      <w:pPr>
-        <w:pStyle w:val="Compact"/>
-        <w:numPr>
-          <w:ilvl w:val="2"/>
-          <w:numId w:val="1008"/>
-        </w:numPr>
-      </w:pPr>
-      <w:hyperlink w:anchor="hope">
-        <w:r>
-          <w:rPr>
-            <w:rStyle w:val="Hyperlink"/>
-          </w:rPr>
-          <w:t xml:space="preserve">HOPE</w:t>
-        </w:r>
-      </w:hyperlink>
-    </w:p>
-    <w:p>
-      <w:pPr>
-        <w:pStyle w:val="Compact"/>
-        <w:numPr>
-          <w:ilvl w:val="2"/>
-          <w:numId w:val="1008"/>
-        </w:numPr>
-      </w:pPr>
       <w:hyperlink w:anchor="shine">
         <w:r>
           <w:rPr>
@@ -7370,7 +7186,7 @@
     </w:p>
     <w:bookmarkEnd w:id="37"/>
     <w:bookmarkEnd w:id="38"/>
-    <w:bookmarkStart w:id="48" w:name="stress-resilience"/>
+    <w:bookmarkStart w:id="44" w:name="stress-resilience"/>
     <w:p>
       <w:pPr>
         <w:pStyle w:val="Heading2"/>
@@ -7831,13 +7647,13 @@
       </w:r>
     </w:p>
     <w:bookmarkEnd w:id="41"/>
-    <w:bookmarkStart w:id="42" w:name="help"/>
+    <w:bookmarkStart w:id="42" w:name="calm"/>
     <w:p>
       <w:pPr>
         <w:pStyle w:val="Heading3"/>
       </w:pPr>
       <w:r>
-        <w:t xml:space="preserve">HELP</w:t>
+        <w:t xml:space="preserve">CALM</w:t>
       </w:r>
     </w:p>
     <w:p>
@@ -7848,7 +7664,7 @@
         <w:rPr>
           <w:rStyle w:val="VerbatimChar"/>
         </w:rPr>
-        <w:t xml:space="preserve">H - Handle problems one at a time</w:t>
+        <w:t xml:space="preserve">C - Confidence: Believe in your abilities and strengths</w:t>
       </w:r>
       <w:r>
         <w:br/>
@@ -7857,7 +7673,7 @@
         <w:rPr>
           <w:rStyle w:val="VerbatimChar"/>
         </w:rPr>
-        <w:t xml:space="preserve">E - Exercise regularly</w:t>
+        <w:t xml:space="preserve">A - Awareness: Stay conscious of your thoughts and feelings</w:t>
       </w:r>
       <w:r>
         <w:br/>
@@ -7866,7 +7682,7 @@
         <w:rPr>
           <w:rStyle w:val="VerbatimChar"/>
         </w:rPr>
-        <w:t xml:space="preserve">L - Learn to relax</w:t>
+        <w:t xml:space="preserve">L - Logic: Use rational thinking to overcome doubts</w:t>
       </w:r>
       <w:r>
         <w:br/>
@@ -7875,17 +7691,98 @@
         <w:rPr>
           <w:rStyle w:val="VerbatimChar"/>
         </w:rPr>
-        <w:t xml:space="preserve">P - Pace yourself and set limits</w:t>
-      </w:r>
+        <w:t xml:space="preserve">M - Mindfulness: Practice being present and focused</w:t>
+      </w:r>
+    </w:p>
+    <w:p>
+      <w:pPr>
+        <w:pStyle w:val="FirstParagraph"/>
+      </w:pPr>
+      <w:r>
+        <w:rPr>
+          <w:b/>
+          <w:bCs/>
+        </w:rPr>
+        <w:t xml:space="preserve">💡 When to use:</w:t>
+      </w:r>
+      <w:r>
+        <w:t xml:space="preserve"> </w:t>
+      </w:r>
+      <w:r>
+        <w:t xml:space="preserve">- Builds long-term resilience and confidence</w:t>
+      </w:r>
+      <w:r>
+        <w:t xml:space="preserve"> </w:t>
+      </w:r>
+      <w:r>
+        <w:t xml:space="preserve">- Confidence connects to SHINE (positive self-image)</w:t>
+      </w:r>
+      <w:r>
+        <w:t xml:space="preserve"> </w:t>
+      </w:r>
+      <w:r>
+        <w:t xml:space="preserve">- Use after PACE or ARIES for comprehensive stress management</w:t>
+      </w:r>
+    </w:p>
+    <w:p>
+      <w:pPr>
+        <w:pStyle w:val="BodyText"/>
+      </w:pPr>
+      <w:r>
+        <w:rPr>
+          <w:b/>
+          <w:bCs/>
+        </w:rPr>
+        <w:t xml:space="preserve">🔗 Combines well with:</w:t>
+      </w:r>
+      <w:r>
+        <w:t xml:space="preserve"> </w:t>
+      </w:r>
+      <w:hyperlink w:anchor="shine">
+        <w:r>
+          <w:rPr>
+            <w:rStyle w:val="Hyperlink"/>
+          </w:rPr>
+          <w:t xml:space="preserve">SHINE</w:t>
+        </w:r>
+      </w:hyperlink>
+      <w:r>
+        <w:t xml:space="preserve">,</w:t>
+      </w:r>
+      <w:r>
+        <w:t xml:space="preserve"> </w:t>
+      </w:r>
+      <w:hyperlink w:anchor="pace">
+        <w:r>
+          <w:rPr>
+            <w:rStyle w:val="Hyperlink"/>
+          </w:rPr>
+          <w:t xml:space="preserve">PACE</w:t>
+        </w:r>
+      </w:hyperlink>
+      <w:r>
+        <w:t xml:space="preserve">,</w:t>
+      </w:r>
+      <w:r>
+        <w:t xml:space="preserve"> </w:t>
+      </w:r>
+      <w:hyperlink w:anchor="aries">
+        <w:r>
+          <w:rPr>
+            <w:rStyle w:val="Hyperlink"/>
+          </w:rPr>
+          <w:t xml:space="preserve">ARIES</w:t>
+        </w:r>
+      </w:hyperlink>
     </w:p>
     <w:bookmarkEnd w:id="42"/>
-    <w:bookmarkStart w:id="43" w:name="handle"/>
+    <w:bookmarkStart w:id="43" w:name="shine"/>
     <w:p>
       <w:pPr>
         <w:pStyle w:val="Heading3"/>
       </w:pPr>
       <w:r>
-        <w:t xml:space="preserve">HANDLE</w:t>
+        <w:t xml:space="preserve">SHINE</w:t>
       </w:r>
     </w:p>
     <w:p>
@@ -7896,7 +7793,7 @@
         <w:rPr>
           <w:rStyle w:val="VerbatimChar"/>
         </w:rPr>
-        <w:t xml:space="preserve">H - Have a positive attitude</w:t>
+        <w:t xml:space="preserve">S - Stay present, in the moment  </w:t>
       </w:r>
       <w:r>
         <w:br/>
@@ -7905,7 +7802,7 @@
         <w:rPr>
           <w:rStyle w:val="VerbatimChar"/>
         </w:rPr>
-        <w:t xml:space="preserve">A - Avoid unnecessary stress</w:t>
+        <w:t xml:space="preserve">H - Have a healthy positive perspective  </w:t>
       </w:r>
       <w:r>
         <w:br/>
@@ -7914,7 +7811,7 @@
         <w:rPr>
           <w:rStyle w:val="VerbatimChar"/>
         </w:rPr>
-        <w:t xml:space="preserve">N - Nurture a strong support system</w:t>
+        <w:t xml:space="preserve">I - Identify and do positive activities   </w:t>
       </w:r>
       <w:r>
         <w:br/>
@@ -7923,7 +7820,7 @@
         <w:rPr>
           <w:rStyle w:val="VerbatimChar"/>
         </w:rPr>
-        <w:t xml:space="preserve">D - Deal with problems directly</w:t>
+        <w:t xml:space="preserve">N - Nourish positive relationships  </w:t>
       </w:r>
       <w:r>
         <w:br/>
@@ -7932,7 +7829,82 @@
         <w:rPr>
           <w:rStyle w:val="VerbatimChar"/>
         </w:rPr>
-        <w:t xml:space="preserve">L - Learn to relax</w:t>
+        <w:t xml:space="preserve">E - Express yourself  </w:t>
+      </w:r>
+    </w:p>
+    <w:p>
+      <w:pPr>
+        <w:pStyle w:val="FirstParagraph"/>
+      </w:pPr>
+      <w:r>
+        <w:rPr>
+          <w:b/>
+          <w:bCs/>
+        </w:rPr>
+        <w:t xml:space="preserve">💡 When to use:</w:t>
+      </w:r>
+      <w:r>
+        <w:t xml:space="preserve"> </w:t>
+      </w:r>
+      <w:r>
+        <w:t xml:space="preserve">End of PACE→ARIES→CALM→SHINE; ongoing positivity; links to</w:t>
+      </w:r>
+      <w:r>
+        <w:t xml:space="preserve"> </w:t>
+      </w:r>
+      <w:hyperlink w:anchor="calm">
+        <w:r>
+          <w:rPr>
+            <w:rStyle w:val="Hyperlink"/>
+          </w:rPr>
+          <w:t xml:space="preserve">CALM</w:t>
+        </w:r>
+      </w:hyperlink>
+      <w:r>
+        <w:t xml:space="preserve">.</w:t>
+      </w:r>
+    </w:p>
+    <w:bookmarkEnd w:id="43"/>
+    <w:bookmarkEnd w:id="44"/>
+    <w:bookmarkStart w:id="48" w:name="infrastructure-systems-engineering"/>
+    <w:p>
+      <w:pPr>
+        <w:pStyle w:val="Heading2"/>
+      </w:pPr>
+      <w:r>
+        <w:t xml:space="preserve">🔧 Infrastructure &amp; Systems Engineering</w:t>
+      </w:r>
+    </w:p>
+    <w:p>
+      <w:pPr>
+        <w:pStyle w:val="FirstParagraph"/>
+      </w:pPr>
+      <w:r>
+        <w:rPr>
+          <w:i/>
+          <w:iCs/>
+        </w:rPr>
+        <w:t xml:space="preserve">Infra and DevOps.</w:t>
+      </w:r>
+    </w:p>
+    <w:bookmarkStart w:id="45" w:name="trace-network-troubleshooting"/>
+    <w:p>
+      <w:pPr>
+        <w:pStyle w:val="Heading3"/>
+      </w:pPr>
+      <w:r>
+        <w:t xml:space="preserve">TRACE (Network Troubleshooting)</w:t>
+      </w:r>
+    </w:p>
+    <w:p>
+      <w:pPr>
+        <w:pStyle w:val="SourceCode"/>
+      </w:pPr>
+      <w:r>
+        <w:rPr>
+          <w:rStyle w:val="VerbatimChar"/>
+        </w:rPr>
+        <w:t xml:space="preserve">T - Test connectivity (ping, traceroute)</w:t>
       </w:r>
       <w:r>
         <w:br/>
@@ -7941,17 +7913,130 @@
         <w:rPr>
           <w:rStyle w:val="VerbatimChar"/>
         </w:rPr>
-        <w:t xml:space="preserve">E - Exercise regularly</w:t>
-      </w:r>
-    </w:p>
-    <w:bookmarkEnd w:id="43"/>
-    <w:bookmarkStart w:id="44" w:name="calm"/>
+        <w:t xml:space="preserve">R - Review logs and metrics</w:t>
+      </w:r>
+      <w:r>
+        <w:br/>
+      </w:r>
+      <w:r>
+        <w:rPr>
+          <w:rStyle w:val="VerbatimChar"/>
+        </w:rPr>
+        <w:t xml:space="preserve">A - Analyze packet captures</w:t>
+      </w:r>
+      <w:r>
+        <w:br/>
+      </w:r>
+      <w:r>
+        <w:rPr>
+          <w:rStyle w:val="VerbatimChar"/>
+        </w:rPr>
+        <w:t xml:space="preserve">C - Check configurations</w:t>
+      </w:r>
+      <w:r>
+        <w:br/>
+      </w:r>
+      <w:r>
+        <w:rPr>
+          <w:rStyle w:val="VerbatimChar"/>
+        </w:rPr>
+        <w:t xml:space="preserve">E - Escalate with documented evidence</w:t>
+      </w:r>
+    </w:p>
+    <w:p>
+      <w:pPr>
+        <w:pStyle w:val="FirstParagraph"/>
+      </w:pPr>
+      <w:r>
+        <w:rPr>
+          <w:b/>
+          <w:bCs/>
+        </w:rPr>
+        <w:t xml:space="preserve">💡 When to use:</w:t>
+      </w:r>
+      <w:r>
+        <w:t xml:space="preserve"> </w:t>
+      </w:r>
+      <w:r>
+        <w:t xml:space="preserve">With</w:t>
+      </w:r>
+      <w:r>
+        <w:t xml:space="preserve"> </w:t>
+      </w:r>
+      <w:hyperlink w:anchor="prepare">
+        <w:r>
+          <w:rPr>
+            <w:rStyle w:val="Hyperlink"/>
+          </w:rPr>
+          <w:t xml:space="preserve">PREPARE</w:t>
+        </w:r>
+      </w:hyperlink>
+      <w:r>
+        <w:t xml:space="preserve"> </w:t>
+      </w:r>
+      <w:r>
+        <w:t xml:space="preserve">and</w:t>
+      </w:r>
+      <w:r>
+        <w:t xml:space="preserve"> </w:t>
+      </w:r>
+      <w:hyperlink w:anchor="Xca622d85a42eb59a37ad21938087cef4d373dc5">
+        <w:r>
+          <w:rPr>
+            <w:rStyle w:val="Hyperlink"/>
+          </w:rPr>
+          <w:t xml:space="preserve">8D</w:t>
+        </w:r>
+      </w:hyperlink>
+      <w:r>
+        <w:t xml:space="preserve">; T for quick, A for deep; document for 8D D2.</w:t>
+      </w:r>
+    </w:p>
+    <w:p>
+      <w:pPr>
+        <w:pStyle w:val="BodyText"/>
+      </w:pPr>
+      <w:r>
+        <w:rPr>
+          <w:b/>
+          <w:bCs/>
+        </w:rPr>
+        <w:t xml:space="preserve">🔗 Combines well with:</w:t>
+      </w:r>
+      <w:r>
+        <w:t xml:space="preserve"> </w:t>
+      </w:r>
+      <w:hyperlink w:anchor="prepare">
+        <w:r>
+          <w:rPr>
+            <w:rStyle w:val="Hyperlink"/>
+          </w:rPr>
+          <w:t xml:space="preserve">PREPARE</w:t>
+        </w:r>
+      </w:hyperlink>
+      <w:r>
+        <w:t xml:space="preserve">,</w:t>
+      </w:r>
+      <w:r>
+        <w:t xml:space="preserve"> </w:t>
+      </w:r>
+      <w:hyperlink w:anchor="Xca622d85a42eb59a37ad21938087cef4d373dc5">
+        <w:r>
+          <w:rPr>
+            <w:rStyle w:val="Hyperlink"/>
+          </w:rPr>
+          <w:t xml:space="preserve">8D</w:t>
+        </w:r>
+      </w:hyperlink>
+    </w:p>
+    <w:bookmarkEnd w:id="45"/>
+    <w:bookmarkStart w:id="46" w:name="scale-infrastructure-design"/>
     <w:p>
       <w:pPr>
         <w:pStyle w:val="Heading3"/>
       </w:pPr>
       <w:r>
-        <w:t xml:space="preserve">CALM</w:t>
+        <w:t xml:space="preserve">SCALE (Infrastructure Design)</w:t>
       </w:r>
     </w:p>
     <w:p>
@@ -7962,7 +8047,7 @@
         <w:rPr>
           <w:rStyle w:val="VerbatimChar"/>
         </w:rPr>
-        <w:t xml:space="preserve">C - Confidence: Believe in your abilities and strengths</w:t>
+        <w:t xml:space="preserve">S - Security by design</w:t>
       </w:r>
       <w:r>
         <w:br/>
@@ -7971,7 +8056,7 @@
         <w:rPr>
           <w:rStyle w:val="VerbatimChar"/>
         </w:rPr>
-        <w:t xml:space="preserve">A - Awareness: Stay conscious of your thoughts and feelings</w:t>
+        <w:t xml:space="preserve">C - Capacity planning</w:t>
       </w:r>
       <w:r>
         <w:br/>
@@ -7980,7 +8065,7 @@
         <w:rPr>
           <w:rStyle w:val="VerbatimChar"/>
         </w:rPr>
-        <w:t xml:space="preserve">L - Logic: Use rational thinking to overcome doubts</w:t>
+        <w:t xml:space="preserve">A - Automation-first</w:t>
       </w:r>
       <w:r>
         <w:br/>
@@ -7989,7 +8074,16 @@
         <w:rPr>
           <w:rStyle w:val="VerbatimChar"/>
         </w:rPr>
-        <w:t xml:space="preserve">M - Mindfulness: Practice being present and focused</w:t>
+        <w:t xml:space="preserve">L - Load balancing</w:t>
+      </w:r>
+      <w:r>
+        <w:br/>
+      </w:r>
+      <w:r>
+        <w:rPr>
+          <w:rStyle w:val="VerbatimChar"/>
+        </w:rPr>
+        <w:t xml:space="preserve">E - Error handling/resilience</w:t>
       </w:r>
     </w:p>
     <w:p>
@@ -8006,20 +8100,53 @@
       <w:r>
         <w:t xml:space="preserve"> </w:t>
       </w:r>
-      <w:r>
-        <w:t xml:space="preserve">- Builds long-term resilience and confidence</w:t>
-      </w:r>
-      <w:r>
-        <w:t xml:space="preserve"> </w:t>
-      </w:r>
-      <w:r>
-        <w:t xml:space="preserve">- Confidence connects to HOPE and SHINE (both build positive self-image)</w:t>
-      </w:r>
-      <w:r>
-        <w:t xml:space="preserve"> </w:t>
-      </w:r>
-      <w:r>
-        <w:t xml:space="preserve">- Use after PACE or ARIES for comprehensive stress management</w:t>
+      <w:hyperlink w:anchor="swot">
+        <w:r>
+          <w:rPr>
+            <w:rStyle w:val="Hyperlink"/>
+          </w:rPr>
+          <w:t xml:space="preserve">SWOT</w:t>
+        </w:r>
+      </w:hyperlink>
+      <w:r>
+        <w:t xml:space="preserve"> </w:t>
+      </w:r>
+      <w:r>
+        <w:t xml:space="preserve">for design validation;</w:t>
+      </w:r>
+      <w:r>
+        <w:t xml:space="preserve"> </w:t>
+      </w:r>
+      <w:hyperlink w:anchor="pestel">
+        <w:r>
+          <w:rPr>
+            <w:rStyle w:val="Hyperlink"/>
+          </w:rPr>
+          <w:t xml:space="preserve">PESTEL</w:t>
+        </w:r>
+      </w:hyperlink>
+      <w:r>
+        <w:t xml:space="preserve"> </w:t>
+      </w:r>
+      <w:r>
+        <w:t xml:space="preserve">for external factors;</w:t>
+      </w:r>
+      <w:r>
+        <w:t xml:space="preserve"> </w:t>
+      </w:r>
+      <w:hyperlink w:anchor="set-systems-engineering-triangle">
+        <w:r>
+          <w:rPr>
+            <w:rStyle w:val="Hyperlink"/>
+          </w:rPr>
+          <w:t xml:space="preserve">SET</w:t>
+        </w:r>
+      </w:hyperlink>
+      <w:r>
+        <w:t xml:space="preserve"> </w:t>
+      </w:r>
+      <w:r>
+        <w:t xml:space="preserve">for trade-offs per component.</w:t>
       </w:r>
     </w:p>
     <w:p>
@@ -8036,15 +8163,12 @@
       <w:r>
         <w:t xml:space="preserve"> </w:t>
       </w:r>
-      <w:r>
-        <w:t xml:space="preserve">Positivity (</w:t>
-      </w:r>
-      <w:hyperlink w:anchor="hope">
-        <w:r>
-          <w:rPr>
-            <w:rStyle w:val="Hyperlink"/>
-          </w:rPr>
-          <w:t xml:space="preserve">HOPE</w:t>
+      <w:hyperlink w:anchor="swot">
+        <w:r>
+          <w:rPr>
+            <w:rStyle w:val="Hyperlink"/>
+          </w:rPr>
+          <w:t xml:space="preserve">SWOT</w:t>
         </w:r>
       </w:hyperlink>
       <w:r>
@@ -8053,23 +8177,12 @@
       <w:r>
         <w:t xml:space="preserve"> </w:t>
       </w:r>
-      <w:hyperlink w:anchor="shine">
-        <w:r>
-          <w:rPr>
-            <w:rStyle w:val="Hyperlink"/>
-          </w:rPr>
-          <w:t xml:space="preserve">SHINE</w:t>
-        </w:r>
-      </w:hyperlink>
-      <w:r>
-        <w:t xml:space="preserve">), Stress Management (</w:t>
-      </w:r>
-      <w:hyperlink w:anchor="pace">
-        <w:r>
-          <w:rPr>
-            <w:rStyle w:val="Hyperlink"/>
-          </w:rPr>
-          <w:t xml:space="preserve">PACE</w:t>
+      <w:hyperlink w:anchor="pestel">
+        <w:r>
+          <w:rPr>
+            <w:rStyle w:val="Hyperlink"/>
+          </w:rPr>
+          <w:t xml:space="preserve">PESTEL</w:t>
         </w:r>
       </w:hyperlink>
       <w:r>
@@ -8078,26 +8191,23 @@
       <w:r>
         <w:t xml:space="preserve"> </w:t>
       </w:r>
-      <w:hyperlink w:anchor="aries">
-        <w:r>
-          <w:rPr>
-            <w:rStyle w:val="Hyperlink"/>
-          </w:rPr>
-          <w:t xml:space="preserve">ARIES</w:t>
-        </w:r>
-      </w:hyperlink>
-      <w:r>
-        <w:t xml:space="preserve">)</w:t>
-      </w:r>
-    </w:p>
-    <w:bookmarkEnd w:id="44"/>
-    <w:bookmarkStart w:id="45" w:name="push"/>
+      <w:hyperlink w:anchor="set-systems-engineering-triangle">
+        <w:r>
+          <w:rPr>
+            <w:rStyle w:val="Hyperlink"/>
+          </w:rPr>
+          <w:t xml:space="preserve">SET</w:t>
+        </w:r>
+      </w:hyperlink>
+    </w:p>
+    <w:bookmarkEnd w:id="46"/>
+    <w:bookmarkStart w:id="47" w:name="debug-code-system-analysis"/>
     <w:p>
       <w:pPr>
         <w:pStyle w:val="Heading3"/>
       </w:pPr>
       <w:r>
-        <w:t xml:space="preserve">PUSH</w:t>
+        <w:t xml:space="preserve">DEBUG (Code &amp; System Analysis)</w:t>
       </w:r>
     </w:p>
     <w:p>
@@ -8108,7 +8218,7 @@
         <w:rPr>
           <w:rStyle w:val="VerbatimChar"/>
         </w:rPr>
-        <w:t xml:space="preserve">P - Practice Gratitude   </w:t>
+        <w:t xml:space="preserve">D - Define the problem (what changed?)</w:t>
       </w:r>
       <w:r>
         <w:br/>
@@ -8117,7 +8227,7 @@
         <w:rPr>
           <w:rStyle w:val="VerbatimChar"/>
         </w:rPr>
-        <w:t xml:space="preserve">U - Use positive affirmations  </w:t>
+        <w:t xml:space="preserve">E - Examine error messages/logs</w:t>
       </w:r>
       <w:r>
         <w:br/>
@@ -8126,7 +8236,7 @@
         <w:rPr>
           <w:rStyle w:val="VerbatimChar"/>
         </w:rPr>
-        <w:t xml:space="preserve">S - Spend time with positive people  </w:t>
+        <w:t xml:space="preserve">B - Break down into components</w:t>
       </w:r>
       <w:r>
         <w:br/>
@@ -8135,28 +8245,7 @@
         <w:rPr>
           <w:rStyle w:val="VerbatimChar"/>
         </w:rPr>
-        <w:t xml:space="preserve">H - Have a positive outlook  </w:t>
-      </w:r>
-    </w:p>
-    <w:bookmarkEnd w:id="45"/>
-    <w:bookmarkStart w:id="46" w:name="hope"/>
-    <w:p>
-      <w:pPr>
-        <w:pStyle w:val="Heading3"/>
-      </w:pPr>
-      <w:r>
-        <w:t xml:space="preserve">HOPE</w:t>
-      </w:r>
-    </w:p>
-    <w:p>
-      <w:pPr>
-        <w:pStyle w:val="SourceCode"/>
-      </w:pPr>
-      <w:r>
-        <w:rPr>
-          <w:rStyle w:val="VerbatimChar"/>
-        </w:rPr>
-        <w:t xml:space="preserve">H - Harness positive thoughts  </w:t>
+        <w:t xml:space="preserve">U - Understand data flow</w:t>
       </w:r>
       <w:r>
         <w:br/>
@@ -8165,82 +8254,7 @@
         <w:rPr>
           <w:rStyle w:val="VerbatimChar"/>
         </w:rPr>
-        <w:t xml:space="preserve">O - Open up to others   </w:t>
-      </w:r>
-      <w:r>
-        <w:br/>
-      </w:r>
-      <w:r>
-        <w:rPr>
-          <w:rStyle w:val="VerbatimChar"/>
-        </w:rPr>
-        <w:t xml:space="preserve">P - Prioritize self-care  </w:t>
-      </w:r>
-      <w:r>
-        <w:br/>
-      </w:r>
-      <w:r>
-        <w:rPr>
-          <w:rStyle w:val="VerbatimChar"/>
-        </w:rPr>
-        <w:t xml:space="preserve">E - Exercise regularly  </w:t>
-      </w:r>
-    </w:p>
-    <w:bookmarkEnd w:id="46"/>
-    <w:bookmarkStart w:id="47" w:name="shine"/>
-    <w:p>
-      <w:pPr>
-        <w:pStyle w:val="Heading3"/>
-      </w:pPr>
-      <w:r>
-        <w:t xml:space="preserve">SHINE</w:t>
-      </w:r>
-    </w:p>
-    <w:p>
-      <w:pPr>
-        <w:pStyle w:val="SourceCode"/>
-      </w:pPr>
-      <w:r>
-        <w:rPr>
-          <w:rStyle w:val="VerbatimChar"/>
-        </w:rPr>
-        <w:t xml:space="preserve">S - Stay present, in the moment  </w:t>
-      </w:r>
-      <w:r>
-        <w:br/>
-      </w:r>
-      <w:r>
-        <w:rPr>
-          <w:rStyle w:val="VerbatimChar"/>
-        </w:rPr>
-        <w:t xml:space="preserve">H - Have a healthy positive perspective  </w:t>
-      </w:r>
-      <w:r>
-        <w:br/>
-      </w:r>
-      <w:r>
-        <w:rPr>
-          <w:rStyle w:val="VerbatimChar"/>
-        </w:rPr>
-        <w:t xml:space="preserve">I - Identify and do positive activities   </w:t>
-      </w:r>
-      <w:r>
-        <w:br/>
-      </w:r>
-      <w:r>
-        <w:rPr>
-          <w:rStyle w:val="VerbatimChar"/>
-        </w:rPr>
-        <w:t xml:space="preserve">N - Nourish positive relationships  </w:t>
-      </w:r>
-      <w:r>
-        <w:br/>
-      </w:r>
-      <w:r>
-        <w:rPr>
-          <w:rStyle w:val="VerbatimChar"/>
-        </w:rPr>
-        <w:t xml:space="preserve">E - Express yourself  </w:t>
+        <w:t xml:space="preserve">G - Generate hypothesis and test</w:t>
       </w:r>
     </w:p>
     <w:p>
@@ -8257,33 +8271,112 @@
       <w:r>
         <w:t xml:space="preserve"> </w:t>
       </w:r>
-      <w:r>
-        <w:t xml:space="preserve">End of PACE→ARIES→CALM→SHINE; ongoing positivity; links to</w:t>
-      </w:r>
-      <w:r>
-        <w:t xml:space="preserve"> </w:t>
-      </w:r>
-      <w:hyperlink w:anchor="calm">
-        <w:r>
-          <w:rPr>
-            <w:rStyle w:val="Hyperlink"/>
-          </w:rPr>
-          <w:t xml:space="preserve">CALM</w:t>
-        </w:r>
-      </w:hyperlink>
-      <w:r>
-        <w:t xml:space="preserve">.</w:t>
-      </w:r>
+      <w:hyperlink w:anchor="X8e9980d9c4ce21ef012162e30a699f691edb98f">
+        <w:r>
+          <w:rPr>
+            <w:rStyle w:val="Hyperlink"/>
+          </w:rPr>
+          <w:t xml:space="preserve">5 Whys</w:t>
+        </w:r>
+      </w:hyperlink>
+      <w:r>
+        <w:t xml:space="preserve"> </w:t>
+      </w:r>
+      <w:r>
+        <w:t xml:space="preserve">+</w:t>
+      </w:r>
+      <w:r>
+        <w:t xml:space="preserve"> </w:t>
+      </w:r>
+      <w:hyperlink w:anchor="iceberg">
+        <w:r>
+          <w:rPr>
+            <w:rStyle w:val="Hyperlink"/>
+          </w:rPr>
+          <w:t xml:space="preserve">ICEBERG</w:t>
+        </w:r>
+      </w:hyperlink>
+      <w:r>
+        <w:t xml:space="preserve">; start with D (often misstated); with</w:t>
+      </w:r>
+      <w:r>
+        <w:t xml:space="preserve"> </w:t>
+      </w:r>
+      <w:hyperlink w:anchor="trace-network-troubleshooting">
+        <w:r>
+          <w:rPr>
+            <w:rStyle w:val="Hyperlink"/>
+          </w:rPr>
+          <w:t xml:space="preserve">TRACE</w:t>
+        </w:r>
+      </w:hyperlink>
+      <w:r>
+        <w:t xml:space="preserve"> </w:t>
+      </w:r>
+      <w:r>
+        <w:t xml:space="preserve">for network/system.</w:t>
+      </w:r>
+    </w:p>
+    <w:p>
+      <w:pPr>
+        <w:pStyle w:val="BodyText"/>
+      </w:pPr>
+      <w:r>
+        <w:rPr>
+          <w:b/>
+          <w:bCs/>
+        </w:rPr>
+        <w:t xml:space="preserve">🔗 Combines well with:</w:t>
+      </w:r>
+      <w:r>
+        <w:t xml:space="preserve"> </w:t>
+      </w:r>
+      <w:hyperlink w:anchor="X8e9980d9c4ce21ef012162e30a699f691edb98f">
+        <w:r>
+          <w:rPr>
+            <w:rStyle w:val="Hyperlink"/>
+          </w:rPr>
+          <w:t xml:space="preserve">5 Whys</w:t>
+        </w:r>
+      </w:hyperlink>
+      <w:r>
+        <w:t xml:space="preserve">,</w:t>
+      </w:r>
+      <w:r>
+        <w:t xml:space="preserve"> </w:t>
+      </w:r>
+      <w:hyperlink w:anchor="iceberg">
+        <w:r>
+          <w:rPr>
+            <w:rStyle w:val="Hyperlink"/>
+          </w:rPr>
+          <w:t xml:space="preserve">ICEBERG</w:t>
+        </w:r>
+      </w:hyperlink>
+      <w:r>
+        <w:t xml:space="preserve">,</w:t>
+      </w:r>
+      <w:r>
+        <w:t xml:space="preserve"> </w:t>
+      </w:r>
+      <w:hyperlink w:anchor="trace-network-troubleshooting">
+        <w:r>
+          <w:rPr>
+            <w:rStyle w:val="Hyperlink"/>
+          </w:rPr>
+          <w:t xml:space="preserve">TRACE</w:t>
+        </w:r>
+      </w:hyperlink>
     </w:p>
     <w:bookmarkEnd w:id="47"/>
     <w:bookmarkEnd w:id="48"/>
-    <w:bookmarkStart w:id="52" w:name="infrastructure-systems-engineering"/>
+    <w:bookmarkStart w:id="55" w:name="proven-mnemonic-pipelines"/>
     <w:p>
       <w:pPr>
         <w:pStyle w:val="Heading2"/>
       </w:pPr>
       <w:r>
-        <w:t xml:space="preserve">🔧 Infrastructure &amp; Systems Engineering</w:t>
+        <w:t xml:space="preserve">🔗 Proven Mnemonic Pipelines</w:t>
       </w:r>
     </w:p>
     <w:p>
@@ -8295,63 +8388,20 @@
           <w:i/>
           <w:iCs/>
         </w:rPr>
-        <w:t xml:space="preserve">Infra and DevOps.</w:t>
-      </w:r>
-    </w:p>
-    <w:bookmarkStart w:id="49" w:name="trace-network-troubleshooting"/>
+        <w:t xml:space="preserve">Chains combine mnemonics into workflows for high-pressure scenarios; battle-tested.</w:t>
+      </w:r>
+    </w:p>
+    <w:bookmarkStart w:id="49" w:name="crisis-response-chain"/>
     <w:p>
       <w:pPr>
         <w:pStyle w:val="Heading3"/>
       </w:pPr>
       <w:r>
-        <w:t xml:space="preserve">TRACE (Network Troubleshooting)</w:t>
-      </w:r>
-    </w:p>
-    <w:p>
-      <w:pPr>
-        <w:pStyle w:val="SourceCode"/>
-      </w:pPr>
-      <w:r>
-        <w:rPr>
-          <w:rStyle w:val="VerbatimChar"/>
-        </w:rPr>
-        <w:t xml:space="preserve">T - Test connectivity (ping, traceroute)</w:t>
-      </w:r>
-      <w:r>
-        <w:br/>
-      </w:r>
-      <w:r>
-        <w:rPr>
-          <w:rStyle w:val="VerbatimChar"/>
-        </w:rPr>
-        <w:t xml:space="preserve">R - Review logs and metrics</w:t>
-      </w:r>
-      <w:r>
-        <w:br/>
-      </w:r>
-      <w:r>
-        <w:rPr>
-          <w:rStyle w:val="VerbatimChar"/>
-        </w:rPr>
-        <w:t xml:space="preserve">A - Analyze packet captures</w:t>
-      </w:r>
-      <w:r>
-        <w:br/>
-      </w:r>
-      <w:r>
-        <w:rPr>
-          <w:rStyle w:val="VerbatimChar"/>
-        </w:rPr>
-        <w:t xml:space="preserve">C - Check configurations</w:t>
-      </w:r>
-      <w:r>
-        <w:br/>
-      </w:r>
-      <w:r>
-        <w:rPr>
-          <w:rStyle w:val="VerbatimChar"/>
-        </w:rPr>
-        <w:t xml:space="preserve">E - Escalate with documented evidence</w:t>
+        <w:rPr>
+          <w:b/>
+          <w:bCs/>
+        </w:rPr>
+        <w:t xml:space="preserve">1. CRISIS RESPONSE CHAIN</w:t>
       </w:r>
     </w:p>
     <w:p>
@@ -8363,30 +8413,104 @@
           <w:b/>
           <w:bCs/>
         </w:rPr>
-        <w:t xml:space="preserve">💡 When to use:</w:t>
-      </w:r>
-      <w:r>
-        <w:t xml:space="preserve"> </w:t>
-      </w:r>
-      <w:r>
-        <w:t xml:space="preserve">With</w:t>
-      </w:r>
-      <w:r>
-        <w:t xml:space="preserve"> </w:t>
-      </w:r>
-      <w:hyperlink w:anchor="prepare">
-        <w:r>
-          <w:rPr>
-            <w:rStyle w:val="Hyperlink"/>
-          </w:rPr>
-          <w:t xml:space="preserve">PREPARE</w:t>
-        </w:r>
-      </w:hyperlink>
-      <w:r>
-        <w:t xml:space="preserve"> </w:t>
-      </w:r>
-      <w:r>
-        <w:t xml:space="preserve">and</w:t>
+        <w:t xml:space="preserve">STOP → TRACE → DEBUG → 8D</w:t>
+      </w:r>
+    </w:p>
+    <w:p>
+      <w:pPr>
+        <w:pStyle w:val="BodyText"/>
+      </w:pPr>
+      <w:r>
+        <w:rPr>
+          <w:b/>
+          <w:bCs/>
+        </w:rPr>
+        <w:t xml:space="preserve">When:</w:t>
+      </w:r>
+      <w:r>
+        <w:t xml:space="preserve"> </w:t>
+      </w:r>
+      <w:r>
+        <w:t xml:space="preserve">Production outages, system failures, critical incidents ·</w:t>
+      </w:r>
+      <w:r>
+        <w:t xml:space="preserve"> </w:t>
+      </w:r>
+      <w:r>
+        <w:rPr>
+          <w:b/>
+          <w:bCs/>
+        </w:rPr>
+        <w:t xml:space="preserve">Time:</w:t>
+      </w:r>
+      <w:r>
+        <w:t xml:space="preserve"> </w:t>
+      </w:r>
+      <w:r>
+        <w:t xml:space="preserve">1–4 hr</w:t>
+      </w:r>
+    </w:p>
+    <w:p>
+      <w:pPr>
+        <w:pStyle w:val="BodyText"/>
+      </w:pPr>
+      <w:r>
+        <w:rPr>
+          <w:b/>
+          <w:bCs/>
+        </w:rPr>
+        <w:t xml:space="preserve">Flow:</w:t>
+      </w:r>
+      <w:r>
+        <w:t xml:space="preserve"> </w:t>
+      </w:r>
+      <w:hyperlink w:anchor="stop">
+        <w:r>
+          <w:rPr>
+            <w:rStyle w:val="Hyperlink"/>
+          </w:rPr>
+          <w:t xml:space="preserve">STOP</w:t>
+        </w:r>
+      </w:hyperlink>
+      <w:r>
+        <w:t xml:space="preserve"> </w:t>
+      </w:r>
+      <w:r>
+        <w:t xml:space="preserve">→</w:t>
+      </w:r>
+      <w:r>
+        <w:t xml:space="preserve"> </w:t>
+      </w:r>
+      <w:hyperlink w:anchor="trace-network-troubleshooting">
+        <w:r>
+          <w:rPr>
+            <w:rStyle w:val="Hyperlink"/>
+          </w:rPr>
+          <w:t xml:space="preserve">TRACE</w:t>
+        </w:r>
+      </w:hyperlink>
+      <w:r>
+        <w:t xml:space="preserve"> </w:t>
+      </w:r>
+      <w:r>
+        <w:t xml:space="preserve">→</w:t>
+      </w:r>
+      <w:r>
+        <w:t xml:space="preserve"> </w:t>
+      </w:r>
+      <w:hyperlink w:anchor="debug-code--system-analysis">
+        <w:r>
+          <w:rPr>
+            <w:rStyle w:val="Hyperlink"/>
+          </w:rPr>
+          <w:t xml:space="preserve">DEBUG</w:t>
+        </w:r>
+      </w:hyperlink>
+      <w:r>
+        <w:t xml:space="preserve"> </w:t>
+      </w:r>
+      <w:r>
+        <w:t xml:space="preserve">→</w:t>
       </w:r>
       <w:r>
         <w:t xml:space="preserve"> </w:t>
@@ -8400,409 +8524,39 @@
         </w:r>
       </w:hyperlink>
       <w:r>
-        <w:t xml:space="preserve">; T for quick, A for deep; document for 8D D2.</w:t>
-      </w:r>
-    </w:p>
-    <w:p>
-      <w:pPr>
-        <w:pStyle w:val="BodyText"/>
-      </w:pPr>
-      <w:r>
-        <w:rPr>
-          <w:b/>
-          <w:bCs/>
-        </w:rPr>
-        <w:t xml:space="preserve">🔗 Combines well with:</w:t>
-      </w:r>
-      <w:r>
-        <w:t xml:space="preserve"> </w:t>
-      </w:r>
-      <w:hyperlink w:anchor="prepare">
-        <w:r>
-          <w:rPr>
-            <w:rStyle w:val="Hyperlink"/>
-          </w:rPr>
-          <w:t xml:space="preserve">PREPARE</w:t>
-        </w:r>
-      </w:hyperlink>
-      <w:r>
-        <w:t xml:space="preserve">,</w:t>
-      </w:r>
-      <w:r>
-        <w:t xml:space="preserve"> </w:t>
-      </w:r>
-      <w:hyperlink w:anchor="Xca622d85a42eb59a37ad21938087cef4d373dc5">
-        <w:r>
-          <w:rPr>
-            <w:rStyle w:val="Hyperlink"/>
-          </w:rPr>
-          <w:t xml:space="preserve">8D</w:t>
-        </w:r>
-      </w:hyperlink>
-    </w:p>
-    <w:bookmarkEnd w:id="49"/>
-    <w:bookmarkStart w:id="50" w:name="scale-infrastructure-design"/>
-    <w:p>
-      <w:pPr>
-        <w:pStyle w:val="Heading3"/>
-      </w:pPr>
-      <w:r>
-        <w:t xml:space="preserve">SCALE (Infrastructure Design)</w:t>
-      </w:r>
-    </w:p>
-    <w:p>
-      <w:pPr>
-        <w:pStyle w:val="SourceCode"/>
-      </w:pPr>
-      <w:r>
-        <w:rPr>
-          <w:rStyle w:val="VerbatimChar"/>
-        </w:rPr>
-        <w:t xml:space="preserve">S - Security by design</w:t>
-      </w:r>
-      <w:r>
-        <w:br/>
-      </w:r>
-      <w:r>
-        <w:rPr>
-          <w:rStyle w:val="VerbatimChar"/>
-        </w:rPr>
-        <w:t xml:space="preserve">C - Capacity planning</w:t>
-      </w:r>
-      <w:r>
-        <w:br/>
-      </w:r>
-      <w:r>
-        <w:rPr>
-          <w:rStyle w:val="VerbatimChar"/>
-        </w:rPr>
-        <w:t xml:space="preserve">A - Automation-first</w:t>
-      </w:r>
-      <w:r>
-        <w:br/>
-      </w:r>
-      <w:r>
-        <w:rPr>
-          <w:rStyle w:val="VerbatimChar"/>
-        </w:rPr>
-        <w:t xml:space="preserve">L - Load balancing</w:t>
-      </w:r>
-      <w:r>
-        <w:br/>
-      </w:r>
-      <w:r>
-        <w:rPr>
-          <w:rStyle w:val="VerbatimChar"/>
-        </w:rPr>
-        <w:t xml:space="preserve">E - Error handling/resilience</w:t>
-      </w:r>
-    </w:p>
-    <w:p>
-      <w:pPr>
-        <w:pStyle w:val="FirstParagraph"/>
-      </w:pPr>
-      <w:r>
-        <w:rPr>
-          <w:b/>
-          <w:bCs/>
-        </w:rPr>
-        <w:t xml:space="preserve">💡 When to use:</w:t>
-      </w:r>
-      <w:r>
-        <w:t xml:space="preserve"> </w:t>
-      </w:r>
-      <w:hyperlink w:anchor="swot">
-        <w:r>
-          <w:rPr>
-            <w:rStyle w:val="Hyperlink"/>
-          </w:rPr>
-          <w:t xml:space="preserve">SWOT</w:t>
-        </w:r>
-      </w:hyperlink>
-      <w:r>
-        <w:t xml:space="preserve"> </w:t>
-      </w:r>
-      <w:r>
-        <w:t xml:space="preserve">for design validation;</w:t>
-      </w:r>
-      <w:r>
-        <w:t xml:space="preserve"> </w:t>
-      </w:r>
-      <w:hyperlink w:anchor="pestel">
-        <w:r>
-          <w:rPr>
-            <w:rStyle w:val="Hyperlink"/>
-          </w:rPr>
-          <w:t xml:space="preserve">PESTEL</w:t>
-        </w:r>
-      </w:hyperlink>
-      <w:r>
-        <w:t xml:space="preserve"> </w:t>
-      </w:r>
-      <w:r>
-        <w:t xml:space="preserve">for external factors;</w:t>
-      </w:r>
-      <w:r>
-        <w:t xml:space="preserve"> </w:t>
-      </w:r>
-      <w:hyperlink w:anchor="set-systems-engineering-triangle">
-        <w:r>
-          <w:rPr>
-            <w:rStyle w:val="Hyperlink"/>
-          </w:rPr>
-          <w:t xml:space="preserve">SET</w:t>
-        </w:r>
-      </w:hyperlink>
-      <w:r>
-        <w:t xml:space="preserve"> </w:t>
-      </w:r>
-      <w:r>
-        <w:t xml:space="preserve">for trade-offs per component.</w:t>
-      </w:r>
-    </w:p>
-    <w:p>
-      <w:pPr>
-        <w:pStyle w:val="BodyText"/>
-      </w:pPr>
-      <w:r>
-        <w:rPr>
-          <w:b/>
-          <w:bCs/>
-        </w:rPr>
-        <w:t xml:space="preserve">🔗 Combines well with:</w:t>
-      </w:r>
-      <w:r>
-        <w:t xml:space="preserve"> </w:t>
-      </w:r>
-      <w:hyperlink w:anchor="swot">
-        <w:r>
-          <w:rPr>
-            <w:rStyle w:val="Hyperlink"/>
-          </w:rPr>
-          <w:t xml:space="preserve">SWOT</w:t>
-        </w:r>
-      </w:hyperlink>
-      <w:r>
-        <w:t xml:space="preserve">,</w:t>
-      </w:r>
-      <w:r>
-        <w:t xml:space="preserve"> </w:t>
-      </w:r>
-      <w:hyperlink w:anchor="pestel">
-        <w:r>
-          <w:rPr>
-            <w:rStyle w:val="Hyperlink"/>
-          </w:rPr>
-          <w:t xml:space="preserve">PESTEL</w:t>
-        </w:r>
-      </w:hyperlink>
-      <w:r>
-        <w:t xml:space="preserve">,</w:t>
-      </w:r>
-      <w:r>
-        <w:t xml:space="preserve"> </w:t>
-      </w:r>
-      <w:hyperlink w:anchor="set-systems-engineering-triangle">
-        <w:r>
-          <w:rPr>
-            <w:rStyle w:val="Hyperlink"/>
-          </w:rPr>
-          <w:t xml:space="preserve">SET</w:t>
-        </w:r>
-      </w:hyperlink>
-    </w:p>
-    <w:bookmarkEnd w:id="50"/>
-    <w:bookmarkStart w:id="51" w:name="debug-code-system-analysis"/>
-    <w:p>
-      <w:pPr>
-        <w:pStyle w:val="Heading3"/>
-      </w:pPr>
-      <w:r>
-        <w:t xml:space="preserve">DEBUG (Code &amp; System Analysis)</w:t>
-      </w:r>
-    </w:p>
-    <w:p>
-      <w:pPr>
-        <w:pStyle w:val="SourceCode"/>
-      </w:pPr>
-      <w:r>
-        <w:rPr>
-          <w:rStyle w:val="VerbatimChar"/>
-        </w:rPr>
-        <w:t xml:space="preserve">D - Define the problem (what changed?)</w:t>
-      </w:r>
-      <w:r>
-        <w:br/>
-      </w:r>
-      <w:r>
-        <w:rPr>
-          <w:rStyle w:val="VerbatimChar"/>
-        </w:rPr>
-        <w:t xml:space="preserve">E - Examine error messages/logs</w:t>
-      </w:r>
-      <w:r>
-        <w:br/>
-      </w:r>
-      <w:r>
-        <w:rPr>
-          <w:rStyle w:val="VerbatimChar"/>
-        </w:rPr>
-        <w:t xml:space="preserve">B - Break down into components</w:t>
-      </w:r>
-      <w:r>
-        <w:br/>
-      </w:r>
-      <w:r>
-        <w:rPr>
-          <w:rStyle w:val="VerbatimChar"/>
-        </w:rPr>
-        <w:t xml:space="preserve">U - Understand data flow</w:t>
-      </w:r>
-      <w:r>
-        <w:br/>
-      </w:r>
-      <w:r>
-        <w:rPr>
-          <w:rStyle w:val="VerbatimChar"/>
-        </w:rPr>
-        <w:t xml:space="preserve">G - Generate hypothesis and test</w:t>
-      </w:r>
-    </w:p>
-    <w:p>
-      <w:pPr>
-        <w:pStyle w:val="FirstParagraph"/>
-      </w:pPr>
-      <w:r>
-        <w:rPr>
-          <w:b/>
-          <w:bCs/>
-        </w:rPr>
-        <w:t xml:space="preserve">💡 When to use:</w:t>
-      </w:r>
-      <w:r>
-        <w:t xml:space="preserve"> </w:t>
-      </w:r>
-      <w:hyperlink w:anchor="X8e9980d9c4ce21ef012162e30a699f691edb98f">
-        <w:r>
-          <w:rPr>
-            <w:rStyle w:val="Hyperlink"/>
-          </w:rPr>
-          <w:t xml:space="preserve">5 Whys</w:t>
-        </w:r>
-      </w:hyperlink>
-      <w:r>
-        <w:t xml:space="preserve"> </w:t>
-      </w:r>
-      <w:r>
-        <w:t xml:space="preserve">+</w:t>
-      </w:r>
-      <w:r>
-        <w:t xml:space="preserve"> </w:t>
-      </w:r>
-      <w:hyperlink w:anchor="iceberg">
-        <w:r>
-          <w:rPr>
-            <w:rStyle w:val="Hyperlink"/>
-          </w:rPr>
-          <w:t xml:space="preserve">ICEBERG</w:t>
-        </w:r>
-      </w:hyperlink>
-      <w:r>
-        <w:t xml:space="preserve">; start with D (often misstated); with</w:t>
-      </w:r>
-      <w:r>
-        <w:t xml:space="preserve"> </w:t>
-      </w:r>
-      <w:hyperlink w:anchor="trace-network-troubleshooting">
-        <w:r>
-          <w:rPr>
-            <w:rStyle w:val="Hyperlink"/>
-          </w:rPr>
-          <w:t xml:space="preserve">TRACE</w:t>
-        </w:r>
-      </w:hyperlink>
-      <w:r>
-        <w:t xml:space="preserve"> </w:t>
-      </w:r>
-      <w:r>
-        <w:t xml:space="preserve">for network/system.</w:t>
-      </w:r>
-    </w:p>
-    <w:p>
-      <w:pPr>
-        <w:pStyle w:val="BodyText"/>
-      </w:pPr>
-      <w:r>
-        <w:rPr>
-          <w:b/>
-          <w:bCs/>
-        </w:rPr>
-        <w:t xml:space="preserve">🔗 Combines well with:</w:t>
-      </w:r>
-      <w:r>
-        <w:t xml:space="preserve"> </w:t>
-      </w:r>
-      <w:hyperlink w:anchor="X8e9980d9c4ce21ef012162e30a699f691edb98f">
-        <w:r>
-          <w:rPr>
-            <w:rStyle w:val="Hyperlink"/>
-          </w:rPr>
-          <w:t xml:space="preserve">5 Whys</w:t>
-        </w:r>
-      </w:hyperlink>
-      <w:r>
-        <w:t xml:space="preserve">,</w:t>
-      </w:r>
-      <w:r>
-        <w:t xml:space="preserve"> </w:t>
-      </w:r>
-      <w:hyperlink w:anchor="iceberg">
-        <w:r>
-          <w:rPr>
-            <w:rStyle w:val="Hyperlink"/>
-          </w:rPr>
-          <w:t xml:space="preserve">ICEBERG</w:t>
-        </w:r>
-      </w:hyperlink>
-      <w:r>
-        <w:t xml:space="preserve">,</w:t>
-      </w:r>
-      <w:r>
-        <w:t xml:space="preserve"> </w:t>
-      </w:r>
-      <w:hyperlink w:anchor="trace-network-troubleshooting">
-        <w:r>
-          <w:rPr>
-            <w:rStyle w:val="Hyperlink"/>
-          </w:rPr>
-          <w:t xml:space="preserve">TRACE</w:t>
-        </w:r>
-      </w:hyperlink>
-    </w:p>
-    <w:bookmarkEnd w:id="51"/>
-    <w:bookmarkEnd w:id="52"/>
-    <w:bookmarkStart w:id="59" w:name="proven-mnemonic-pipelines"/>
-    <w:p>
-      <w:pPr>
-        <w:pStyle w:val="Heading2"/>
-      </w:pPr>
-      <w:r>
-        <w:t xml:space="preserve">🔗 Proven Mnemonic Pipelines</w:t>
-      </w:r>
-    </w:p>
-    <w:p>
-      <w:pPr>
-        <w:pStyle w:val="FirstParagraph"/>
-      </w:pPr>
+        <w:t xml:space="preserve">.</w:t>
+      </w:r>
+      <w:r>
+        <w:t xml:space="preserve"> </w:t>
+      </w:r>
       <w:r>
         <w:rPr>
           <w:i/>
           <w:iCs/>
         </w:rPr>
-        <w:t xml:space="preserve">Chains combine mnemonics into workflows for high-pressure scenarios; battle-tested.</w:t>
-      </w:r>
-    </w:p>
-    <w:bookmarkStart w:id="53" w:name="crisis-response-chain"/>
+        <w:t xml:space="preserve">Step details in each mnemonic above.</w:t>
+      </w:r>
+    </w:p>
+    <w:p>
+      <w:pPr>
+        <w:pStyle w:val="BodyText"/>
+      </w:pPr>
+      <w:r>
+        <w:rPr>
+          <w:b/>
+          <w:bCs/>
+        </w:rPr>
+        <w:t xml:space="preserve">Why:</w:t>
+      </w:r>
+      <w:r>
+        <w:t xml:space="preserve"> </w:t>
+      </w:r>
+      <w:r>
+        <w:t xml:space="preserve">STOP stabilizes; TRACE gathers evidence; DEBUG structures analysis; 8D prevents recurrence.</w:t>
+      </w:r>
+    </w:p>
+    <w:bookmarkEnd w:id="49"/>
+    <w:bookmarkStart w:id="50" w:name="conflict-resolution-chain"/>
     <w:p>
       <w:pPr>
         <w:pStyle w:val="Heading3"/>
@@ -8812,7 +8566,7 @@
           <w:b/>
           <w:bCs/>
         </w:rPr>
-        <w:t xml:space="preserve">1. CRISIS RESPONSE CHAIN</w:t>
+        <w:t xml:space="preserve">2. CONFLICT RESOLUTION CHAIN</w:t>
       </w:r>
     </w:p>
     <w:p>
@@ -8824,7 +8578,7 @@
           <w:b/>
           <w:bCs/>
         </w:rPr>
-        <w:t xml:space="preserve">STOP → TRACE → DEBUG → 8D</w:t>
+        <w:t xml:space="preserve">WAIT → BREATHE → PAUSE → RACI</w:t>
       </w:r>
     </w:p>
     <w:p>
@@ -8842,7 +8596,7 @@
         <w:t xml:space="preserve"> </w:t>
       </w:r>
       <w:r>
-        <w:t xml:space="preserve">Production outages, system failures, critical incidents ·</w:t>
+        <w:t xml:space="preserve">Team disagreements, tense meetings, stakeholder conflicts ·</w:t>
       </w:r>
       <w:r>
         <w:t xml:space="preserve"> </w:t>
@@ -8858,7 +8612,7 @@
         <w:t xml:space="preserve"> </w:t>
       </w:r>
       <w:r>
-        <w:t xml:space="preserve">1–4 hr</w:t>
+        <w:t xml:space="preserve">5–20 min</w:t>
       </w:r>
     </w:p>
     <w:p>
@@ -8875,12 +8629,12 @@
       <w:r>
         <w:t xml:space="preserve"> </w:t>
       </w:r>
-      <w:hyperlink w:anchor="stop">
-        <w:r>
-          <w:rPr>
-            <w:rStyle w:val="Hyperlink"/>
-          </w:rPr>
-          <w:t xml:space="preserve">STOP</w:t>
+      <w:hyperlink w:anchor="wait">
+        <w:r>
+          <w:rPr>
+            <w:rStyle w:val="Hyperlink"/>
+          </w:rPr>
+          <w:t xml:space="preserve">WAIT</w:t>
         </w:r>
       </w:hyperlink>
       <w:r>
@@ -8892,12 +8646,12 @@
       <w:r>
         <w:t xml:space="preserve"> </w:t>
       </w:r>
-      <w:hyperlink w:anchor="trace-network-troubleshooting">
-        <w:r>
-          <w:rPr>
-            <w:rStyle w:val="Hyperlink"/>
-          </w:rPr>
-          <w:t xml:space="preserve">TRACE</w:t>
+      <w:hyperlink w:anchor="breathe">
+        <w:r>
+          <w:rPr>
+            <w:rStyle w:val="Hyperlink"/>
+          </w:rPr>
+          <w:t xml:space="preserve">BREATHE</w:t>
         </w:r>
       </w:hyperlink>
       <w:r>
@@ -8909,12 +8663,12 @@
       <w:r>
         <w:t xml:space="preserve"> </w:t>
       </w:r>
-      <w:hyperlink w:anchor="debug-code--system-analysis">
-        <w:r>
-          <w:rPr>
-            <w:rStyle w:val="Hyperlink"/>
-          </w:rPr>
-          <w:t xml:space="preserve">DEBUG</w:t>
+      <w:hyperlink w:anchor="pause">
+        <w:r>
+          <w:rPr>
+            <w:rStyle w:val="Hyperlink"/>
+          </w:rPr>
+          <w:t xml:space="preserve">PAUSE</w:t>
         </w:r>
       </w:hyperlink>
       <w:r>
@@ -8926,12 +8680,12 @@
       <w:r>
         <w:t xml:space="preserve"> </w:t>
       </w:r>
-      <w:hyperlink w:anchor="Xca622d85a42eb59a37ad21938087cef4d373dc5">
-        <w:r>
-          <w:rPr>
-            <w:rStyle w:val="Hyperlink"/>
-          </w:rPr>
-          <w:t xml:space="preserve">8D</w:t>
+      <w:hyperlink w:anchor="raci">
+        <w:r>
+          <w:rPr>
+            <w:rStyle w:val="Hyperlink"/>
+          </w:rPr>
+          <w:t xml:space="preserve">RACI</w:t>
         </w:r>
       </w:hyperlink>
       <w:r>
@@ -8963,11 +8717,11 @@
         <w:t xml:space="preserve"> </w:t>
       </w:r>
       <w:r>
-        <w:t xml:space="preserve">STOP stabilizes; TRACE gathers evidence; DEBUG structures analysis; 8D prevents recurrence.</w:t>
-      </w:r>
-    </w:p>
-    <w:bookmarkEnd w:id="53"/>
-    <w:bookmarkStart w:id="54" w:name="conflict-resolution-chain"/>
+        <w:t xml:space="preserve">WAIT prevents escalation; BREATHE regulates; PAUSE creates space; RACI clarifies roles (often the root cause).</w:t>
+      </w:r>
+    </w:p>
+    <w:bookmarkEnd w:id="50"/>
+    <w:bookmarkStart w:id="51" w:name="root-cause-investigation-chain"/>
     <w:p>
       <w:pPr>
         <w:pStyle w:val="Heading3"/>
@@ -8977,7 +8731,7 @@
           <w:b/>
           <w:bCs/>
         </w:rPr>
-        <w:t xml:space="preserve">2. CONFLICT RESOLUTION CHAIN</w:t>
+        <w:t xml:space="preserve">3. ROOT CAUSE INVESTIGATION CHAIN</w:t>
       </w:r>
     </w:p>
     <w:p>
@@ -8989,7 +8743,7 @@
           <w:b/>
           <w:bCs/>
         </w:rPr>
-        <w:t xml:space="preserve">WAIT → BREATHE → PAUSE → RACI</w:t>
+        <w:t xml:space="preserve">ICEBERG → 5 Whys → PADDER → RACI</w:t>
       </w:r>
     </w:p>
     <w:p>
@@ -9007,7 +8761,7 @@
         <w:t xml:space="preserve"> </w:t>
       </w:r>
       <w:r>
-        <w:t xml:space="preserve">Team disagreements, tense meetings, stakeholder conflicts ·</w:t>
+        <w:t xml:space="preserve">Recurring issues, complex systems, post-incident ·</w:t>
       </w:r>
       <w:r>
         <w:t xml:space="preserve"> </w:t>
@@ -9023,7 +8777,7 @@
         <w:t xml:space="preserve"> </w:t>
       </w:r>
       <w:r>
-        <w:t xml:space="preserve">5–20 min</w:t>
+        <w:t xml:space="preserve">1–2 hr</w:t>
       </w:r>
     </w:p>
     <w:p>
@@ -9040,12 +8794,12 @@
       <w:r>
         <w:t xml:space="preserve"> </w:t>
       </w:r>
-      <w:hyperlink w:anchor="wait">
-        <w:r>
-          <w:rPr>
-            <w:rStyle w:val="Hyperlink"/>
-          </w:rPr>
-          <w:t xml:space="preserve">WAIT</w:t>
+      <w:hyperlink w:anchor="iceberg">
+        <w:r>
+          <w:rPr>
+            <w:rStyle w:val="Hyperlink"/>
+          </w:rPr>
+          <w:t xml:space="preserve">ICEBERG</w:t>
         </w:r>
       </w:hyperlink>
       <w:r>
@@ -9057,12 +8811,12 @@
       <w:r>
         <w:t xml:space="preserve"> </w:t>
       </w:r>
-      <w:hyperlink w:anchor="breathe">
-        <w:r>
-          <w:rPr>
-            <w:rStyle w:val="Hyperlink"/>
-          </w:rPr>
-          <w:t xml:space="preserve">BREATHE</w:t>
+      <w:hyperlink w:anchor="X8e9980d9c4ce21ef012162e30a699f691edb98f">
+        <w:r>
+          <w:rPr>
+            <w:rStyle w:val="Hyperlink"/>
+          </w:rPr>
+          <w:t xml:space="preserve">5 Whys</w:t>
         </w:r>
       </w:hyperlink>
       <w:r>
@@ -9074,12 +8828,12 @@
       <w:r>
         <w:t xml:space="preserve"> </w:t>
       </w:r>
-      <w:hyperlink w:anchor="pause">
-        <w:r>
-          <w:rPr>
-            <w:rStyle w:val="Hyperlink"/>
-          </w:rPr>
-          <w:t xml:space="preserve">PAUSE</w:t>
+      <w:hyperlink w:anchor="padder">
+        <w:r>
+          <w:rPr>
+            <w:rStyle w:val="Hyperlink"/>
+          </w:rPr>
+          <w:t xml:space="preserve">PADDER</w:t>
         </w:r>
       </w:hyperlink>
       <w:r>
@@ -9128,11 +8882,11 @@
         <w:t xml:space="preserve"> </w:t>
       </w:r>
       <w:r>
-        <w:t xml:space="preserve">WAIT prevents escalation; BREATHE regulates; PAUSE creates space; RACI clarifies roles (often the root cause).</w:t>
-      </w:r>
-    </w:p>
-    <w:bookmarkEnd w:id="54"/>
-    <w:bookmarkStart w:id="55" w:name="root-cause-investigation-chain"/>
+        <w:t xml:space="preserve">ICEBERG structures; 5 Whys drill to root cause; PADDER plans; RACI ensures accountability.</w:t>
+      </w:r>
+    </w:p>
+    <w:bookmarkEnd w:id="51"/>
+    <w:bookmarkStart w:id="52" w:name="strategic-design-chain"/>
     <w:p>
       <w:pPr>
         <w:pStyle w:val="Heading3"/>
@@ -9142,7 +8896,7 @@
           <w:b/>
           <w:bCs/>
         </w:rPr>
-        <w:t xml:space="preserve">3. ROOT CAUSE INVESTIGATION CHAIN</w:t>
+        <w:t xml:space="preserve">4. STRATEGIC DESIGN CHAIN</w:t>
       </w:r>
     </w:p>
     <w:p>
@@ -9154,7 +8908,7 @@
           <w:b/>
           <w:bCs/>
         </w:rPr>
-        <w:t xml:space="preserve">ICEBERG → 5 Whys → PADDER → RACI</w:t>
+        <w:t xml:space="preserve">SCALE → SWOT → PESTEL → SET</w:t>
       </w:r>
     </w:p>
     <w:p>
@@ -9172,7 +8926,7 @@
         <w:t xml:space="preserve"> </w:t>
       </w:r>
       <w:r>
-        <w:t xml:space="preserve">Recurring issues, complex systems, post-incident ·</w:t>
+        <w:t xml:space="preserve">Infrastructure planning, architecture reviews, capacity ·</w:t>
       </w:r>
       <w:r>
         <w:t xml:space="preserve"> </w:t>
@@ -9188,7 +8942,7 @@
         <w:t xml:space="preserve"> </w:t>
       </w:r>
       <w:r>
-        <w:t xml:space="preserve">1–2 hr</w:t>
+        <w:t xml:space="preserve">2–4 hr</w:t>
       </w:r>
     </w:p>
     <w:p>
@@ -9205,12 +8959,12 @@
       <w:r>
         <w:t xml:space="preserve"> </w:t>
       </w:r>
-      <w:hyperlink w:anchor="iceberg">
-        <w:r>
-          <w:rPr>
-            <w:rStyle w:val="Hyperlink"/>
-          </w:rPr>
-          <w:t xml:space="preserve">ICEBERG</w:t>
+      <w:hyperlink w:anchor="scale-infrastructure-design">
+        <w:r>
+          <w:rPr>
+            <w:rStyle w:val="Hyperlink"/>
+          </w:rPr>
+          <w:t xml:space="preserve">SCALE</w:t>
         </w:r>
       </w:hyperlink>
       <w:r>
@@ -9222,12 +8976,12 @@
       <w:r>
         <w:t xml:space="preserve"> </w:t>
       </w:r>
-      <w:hyperlink w:anchor="X8e9980d9c4ce21ef012162e30a699f691edb98f">
-        <w:r>
-          <w:rPr>
-            <w:rStyle w:val="Hyperlink"/>
-          </w:rPr>
-          <w:t xml:space="preserve">5 Whys</w:t>
+      <w:hyperlink w:anchor="swot">
+        <w:r>
+          <w:rPr>
+            <w:rStyle w:val="Hyperlink"/>
+          </w:rPr>
+          <w:t xml:space="preserve">SWOT</w:t>
         </w:r>
       </w:hyperlink>
       <w:r>
@@ -9239,12 +8993,12 @@
       <w:r>
         <w:t xml:space="preserve"> </w:t>
       </w:r>
-      <w:hyperlink w:anchor="padder">
-        <w:r>
-          <w:rPr>
-            <w:rStyle w:val="Hyperlink"/>
-          </w:rPr>
-          <w:t xml:space="preserve">PADDER</w:t>
+      <w:hyperlink w:anchor="pestel">
+        <w:r>
+          <w:rPr>
+            <w:rStyle w:val="Hyperlink"/>
+          </w:rPr>
+          <w:t xml:space="preserve">PESTEL</w:t>
         </w:r>
       </w:hyperlink>
       <w:r>
@@ -9256,12 +9010,12 @@
       <w:r>
         <w:t xml:space="preserve"> </w:t>
       </w:r>
-      <w:hyperlink w:anchor="raci">
-        <w:r>
-          <w:rPr>
-            <w:rStyle w:val="Hyperlink"/>
-          </w:rPr>
-          <w:t xml:space="preserve">RACI</w:t>
+      <w:hyperlink w:anchor="set-systems-engineering-triangle">
+        <w:r>
+          <w:rPr>
+            <w:rStyle w:val="Hyperlink"/>
+          </w:rPr>
+          <w:t xml:space="preserve">SET</w:t>
         </w:r>
       </w:hyperlink>
       <w:r>
@@ -9293,11 +9047,11 @@
         <w:t xml:space="preserve"> </w:t>
       </w:r>
       <w:r>
-        <w:t xml:space="preserve">ICEBERG structures; 5 Whys drill to root cause; PADDER plans; RACI ensures accountability.</w:t>
-      </w:r>
-    </w:p>
-    <w:bookmarkEnd w:id="55"/>
-    <w:bookmarkStart w:id="56" w:name="strategic-design-chain"/>
+        <w:t xml:space="preserve">SCALE sets requirements; SWOT evaluates; PESTEL finds external risks; SET manages expectations.</w:t>
+      </w:r>
+    </w:p>
+    <w:bookmarkEnd w:id="52"/>
+    <w:bookmarkStart w:id="53" w:name="stress-burnout-recovery-chain"/>
     <w:p>
       <w:pPr>
         <w:pStyle w:val="Heading3"/>
@@ -9307,7 +9061,7 @@
           <w:b/>
           <w:bCs/>
         </w:rPr>
-        <w:t xml:space="preserve">4. STRATEGIC DESIGN CHAIN</w:t>
+        <w:t xml:space="preserve">5. STRESS BURNOUT RECOVERY CHAIN</w:t>
       </w:r>
     </w:p>
     <w:p>
@@ -9319,7 +9073,7 @@
           <w:b/>
           <w:bCs/>
         </w:rPr>
-        <w:t xml:space="preserve">SCALE → SWOT → PESTEL → SET</w:t>
+        <w:t xml:space="preserve">PACE → ARIES → CALM → SHINE</w:t>
       </w:r>
     </w:p>
     <w:p>
@@ -9337,7 +9091,7 @@
         <w:t xml:space="preserve"> </w:t>
       </w:r>
       <w:r>
-        <w:t xml:space="preserve">Infrastructure planning, architecture reviews, capacity ·</w:t>
+        <w:t xml:space="preserve">Long-term stress, approaching burnout, lifestyle reset ·</w:t>
       </w:r>
       <w:r>
         <w:t xml:space="preserve"> </w:t>
@@ -9353,7 +9107,7 @@
         <w:t xml:space="preserve"> </w:t>
       </w:r>
       <w:r>
-        <w:t xml:space="preserve">2–4 hr</w:t>
+        <w:t xml:space="preserve">2–4 weeks (habit formation)</w:t>
       </w:r>
     </w:p>
     <w:p>
@@ -9370,12 +9124,12 @@
       <w:r>
         <w:t xml:space="preserve"> </w:t>
       </w:r>
-      <w:hyperlink w:anchor="scale-infrastructure-design">
-        <w:r>
-          <w:rPr>
-            <w:rStyle w:val="Hyperlink"/>
-          </w:rPr>
-          <w:t xml:space="preserve">SCALE</w:t>
+      <w:hyperlink w:anchor="pace">
+        <w:r>
+          <w:rPr>
+            <w:rStyle w:val="Hyperlink"/>
+          </w:rPr>
+          <w:t xml:space="preserve">PACE</w:t>
         </w:r>
       </w:hyperlink>
       <w:r>
@@ -9387,12 +9141,12 @@
       <w:r>
         <w:t xml:space="preserve"> </w:t>
       </w:r>
-      <w:hyperlink w:anchor="swot">
-        <w:r>
-          <w:rPr>
-            <w:rStyle w:val="Hyperlink"/>
-          </w:rPr>
-          <w:t xml:space="preserve">SWOT</w:t>
+      <w:hyperlink w:anchor="aries">
+        <w:r>
+          <w:rPr>
+            <w:rStyle w:val="Hyperlink"/>
+          </w:rPr>
+          <w:t xml:space="preserve">ARIES</w:t>
         </w:r>
       </w:hyperlink>
       <w:r>
@@ -9404,12 +9158,12 @@
       <w:r>
         <w:t xml:space="preserve"> </w:t>
       </w:r>
-      <w:hyperlink w:anchor="pestel">
-        <w:r>
-          <w:rPr>
-            <w:rStyle w:val="Hyperlink"/>
-          </w:rPr>
-          <w:t xml:space="preserve">PESTEL</w:t>
+      <w:hyperlink w:anchor="calm">
+        <w:r>
+          <w:rPr>
+            <w:rStyle w:val="Hyperlink"/>
+          </w:rPr>
+          <w:t xml:space="preserve">CALM</w:t>
         </w:r>
       </w:hyperlink>
       <w:r>
@@ -9421,12 +9175,12 @@
       <w:r>
         <w:t xml:space="preserve"> </w:t>
       </w:r>
-      <w:hyperlink w:anchor="set-systems-engineering-triangle">
-        <w:r>
-          <w:rPr>
-            <w:rStyle w:val="Hyperlink"/>
-          </w:rPr>
-          <w:t xml:space="preserve">SET</w:t>
+      <w:hyperlink w:anchor="shine">
+        <w:r>
+          <w:rPr>
+            <w:rStyle w:val="Hyperlink"/>
+          </w:rPr>
+          <w:t xml:space="preserve">SHINE</w:t>
         </w:r>
       </w:hyperlink>
       <w:r>
@@ -9458,11 +9212,11 @@
         <w:t xml:space="preserve"> </w:t>
       </w:r>
       <w:r>
-        <w:t xml:space="preserve">SCALE sets requirements; SWOT evaluates; PESTEL finds external risks; SET manages expectations.</w:t>
-      </w:r>
-    </w:p>
-    <w:bookmarkEnd w:id="56"/>
-    <w:bookmarkStart w:id="57" w:name="stress-burnout-recovery-chain"/>
+        <w:t xml:space="preserve">PACE (immediate); ARIES (lifestyle); CALM (resilience); SHINE (sustainable).</w:t>
+      </w:r>
+    </w:p>
+    <w:bookmarkEnd w:id="53"/>
+    <w:bookmarkStart w:id="54" w:name="rapid-triage-chain"/>
     <w:p>
       <w:pPr>
         <w:pStyle w:val="Heading3"/>
@@ -9472,7 +9226,7 @@
           <w:b/>
           <w:bCs/>
         </w:rPr>
-        <w:t xml:space="preserve">5. STRESS BURNOUT RECOVERY CHAIN</w:t>
+        <w:t xml:space="preserve">6. RAPID TRIAGE CHAIN</w:t>
       </w:r>
     </w:p>
     <w:p>
@@ -9484,7 +9238,7 @@
           <w:b/>
           <w:bCs/>
         </w:rPr>
-        <w:t xml:space="preserve">PACE → ARIES → CALM → SHINE</w:t>
+        <w:t xml:space="preserve">IDEA → DICE → FATE</w:t>
       </w:r>
     </w:p>
     <w:p>
@@ -9502,7 +9256,7 @@
         <w:t xml:space="preserve"> </w:t>
       </w:r>
       <w:r>
-        <w:t xml:space="preserve">Long-term stress, approaching burnout, lifestyle reset ·</w:t>
+        <w:t xml:space="preserve">Quick wins, time-critical decisions, feasibility check ·</w:t>
       </w:r>
       <w:r>
         <w:t xml:space="preserve"> </w:t>
@@ -9518,7 +9272,7 @@
         <w:t xml:space="preserve"> </w:t>
       </w:r>
       <w:r>
-        <w:t xml:space="preserve">2–4 weeks (habit formation)</w:t>
+        <w:t xml:space="preserve">10–30 min</w:t>
       </w:r>
     </w:p>
     <w:p>
@@ -9535,12 +9289,12 @@
       <w:r>
         <w:t xml:space="preserve"> </w:t>
       </w:r>
-      <w:hyperlink w:anchor="pace">
-        <w:r>
-          <w:rPr>
-            <w:rStyle w:val="Hyperlink"/>
-          </w:rPr>
-          <w:t xml:space="preserve">PACE</w:t>
+      <w:hyperlink w:anchor="idea">
+        <w:r>
+          <w:rPr>
+            <w:rStyle w:val="Hyperlink"/>
+          </w:rPr>
+          <w:t xml:space="preserve">IDEA</w:t>
         </w:r>
       </w:hyperlink>
       <w:r>
@@ -9552,12 +9306,12 @@
       <w:r>
         <w:t xml:space="preserve"> </w:t>
       </w:r>
-      <w:hyperlink w:anchor="aries">
-        <w:r>
-          <w:rPr>
-            <w:rStyle w:val="Hyperlink"/>
-          </w:rPr>
-          <w:t xml:space="preserve">ARIES</w:t>
+      <w:hyperlink w:anchor="dice">
+        <w:r>
+          <w:rPr>
+            <w:rStyle w:val="Hyperlink"/>
+          </w:rPr>
+          <w:t xml:space="preserve">DICE</w:t>
         </w:r>
       </w:hyperlink>
       <w:r>
@@ -9569,29 +9323,12 @@
       <w:r>
         <w:t xml:space="preserve"> </w:t>
       </w:r>
-      <w:hyperlink w:anchor="calm">
-        <w:r>
-          <w:rPr>
-            <w:rStyle w:val="Hyperlink"/>
-          </w:rPr>
-          <w:t xml:space="preserve">CALM</w:t>
-        </w:r>
-      </w:hyperlink>
-      <w:r>
-        <w:t xml:space="preserve"> </w:t>
-      </w:r>
-      <w:r>
-        <w:t xml:space="preserve">→</w:t>
-      </w:r>
-      <w:r>
-        <w:t xml:space="preserve"> </w:t>
-      </w:r>
-      <w:hyperlink w:anchor="shine">
-        <w:r>
-          <w:rPr>
-            <w:rStyle w:val="Hyperlink"/>
-          </w:rPr>
-          <w:t xml:space="preserve">SHINE</w:t>
+      <w:hyperlink w:anchor="fate">
+        <w:r>
+          <w:rPr>
+            <w:rStyle w:val="Hyperlink"/>
+          </w:rPr>
+          <w:t xml:space="preserve">FATE</w:t>
         </w:r>
       </w:hyperlink>
       <w:r>
@@ -9623,160 +9360,12 @@
         <w:t xml:space="preserve"> </w:t>
       </w:r>
       <w:r>
-        <w:t xml:space="preserve">PACE (immediate); ARIES (lifestyle); CALM (resilience); SHINE (sustainable).</w:t>
-      </w:r>
-    </w:p>
-    <w:bookmarkEnd w:id="57"/>
-    <w:bookmarkStart w:id="58" w:name="rapid-triage-chain"/>
-    <w:p>
-      <w:pPr>
-        <w:pStyle w:val="Heading3"/>
-      </w:pPr>
-      <w:r>
-        <w:rPr>
-          <w:b/>
-          <w:bCs/>
-        </w:rPr>
-        <w:t xml:space="preserve">6. RAPID TRIAGE CHAIN</w:t>
-      </w:r>
-    </w:p>
-    <w:p>
-      <w:pPr>
-        <w:pStyle w:val="FirstParagraph"/>
-      </w:pPr>
-      <w:r>
-        <w:rPr>
-          <w:b/>
-          <w:bCs/>
-        </w:rPr>
-        <w:t xml:space="preserve">IDEA → DICE → FATE</w:t>
-      </w:r>
-    </w:p>
-    <w:p>
-      <w:pPr>
-        <w:pStyle w:val="BodyText"/>
-      </w:pPr>
-      <w:r>
-        <w:rPr>
-          <w:b/>
-          <w:bCs/>
-        </w:rPr>
-        <w:t xml:space="preserve">When:</w:t>
-      </w:r>
-      <w:r>
-        <w:t xml:space="preserve"> </w:t>
-      </w:r>
-      <w:r>
-        <w:t xml:space="preserve">Quick wins, time-critical decisions, feasibility check ·</w:t>
-      </w:r>
-      <w:r>
-        <w:t xml:space="preserve"> </w:t>
-      </w:r>
-      <w:r>
-        <w:rPr>
-          <w:b/>
-          <w:bCs/>
-        </w:rPr>
-        <w:t xml:space="preserve">Time:</w:t>
-      </w:r>
-      <w:r>
-        <w:t xml:space="preserve"> </w:t>
-      </w:r>
-      <w:r>
-        <w:t xml:space="preserve">10–30 min</w:t>
-      </w:r>
-    </w:p>
-    <w:p>
-      <w:pPr>
-        <w:pStyle w:val="BodyText"/>
-      </w:pPr>
-      <w:r>
-        <w:rPr>
-          <w:b/>
-          <w:bCs/>
-        </w:rPr>
-        <w:t xml:space="preserve">Flow:</w:t>
-      </w:r>
-      <w:r>
-        <w:t xml:space="preserve"> </w:t>
-      </w:r>
-      <w:hyperlink w:anchor="idea">
-        <w:r>
-          <w:rPr>
-            <w:rStyle w:val="Hyperlink"/>
-          </w:rPr>
-          <w:t xml:space="preserve">IDEA</w:t>
-        </w:r>
-      </w:hyperlink>
-      <w:r>
-        <w:t xml:space="preserve"> </w:t>
-      </w:r>
-      <w:r>
-        <w:t xml:space="preserve">→</w:t>
-      </w:r>
-      <w:r>
-        <w:t xml:space="preserve"> </w:t>
-      </w:r>
-      <w:hyperlink w:anchor="dice">
-        <w:r>
-          <w:rPr>
-            <w:rStyle w:val="Hyperlink"/>
-          </w:rPr>
-          <w:t xml:space="preserve">DICE</w:t>
-        </w:r>
-      </w:hyperlink>
-      <w:r>
-        <w:t xml:space="preserve"> </w:t>
-      </w:r>
-      <w:r>
-        <w:t xml:space="preserve">→</w:t>
-      </w:r>
-      <w:r>
-        <w:t xml:space="preserve"> </w:t>
-      </w:r>
-      <w:hyperlink w:anchor="fate">
-        <w:r>
-          <w:rPr>
-            <w:rStyle w:val="Hyperlink"/>
-          </w:rPr>
-          <w:t xml:space="preserve">FATE</w:t>
-        </w:r>
-      </w:hyperlink>
-      <w:r>
-        <w:t xml:space="preserve">.</w:t>
-      </w:r>
-      <w:r>
-        <w:t xml:space="preserve"> </w:t>
-      </w:r>
-      <w:r>
-        <w:rPr>
-          <w:i/>
-          <w:iCs/>
-        </w:rPr>
-        <w:t xml:space="preserve">Step details in each mnemonic above.</w:t>
-      </w:r>
-    </w:p>
-    <w:p>
-      <w:pPr>
-        <w:pStyle w:val="BodyText"/>
-      </w:pPr>
-      <w:r>
-        <w:rPr>
-          <w:b/>
-          <w:bCs/>
-        </w:rPr>
-        <w:t xml:space="preserve">Why:</w:t>
-      </w:r>
-      <w:r>
-        <w:t xml:space="preserve"> </w:t>
-      </w:r>
-      <w:r>
         <w:t xml:space="preserve">IDEA (fast frame); DICE (blockers); FATE (resources).</w:t>
       </w:r>
     </w:p>
-    <w:bookmarkEnd w:id="58"/>
-    <w:bookmarkEnd w:id="59"/>
-    <w:bookmarkStart w:id="60" w:name="pipeline-selection-matrix"/>
+    <w:bookmarkEnd w:id="54"/>
+    <w:bookmarkEnd w:id="55"/>
+    <w:bookmarkStart w:id="56" w:name="pipeline-selection-matrix"/>
     <w:p>
       <w:pPr>
         <w:pStyle w:val="Heading2"/>
@@ -10384,8 +9973,8 @@
         </w:pict>
       </w:r>
     </w:p>
-    <w:bookmarkEnd w:id="60"/>
-    <w:bookmarkStart w:id="61" w:name="pro-tips"/>
+    <w:bookmarkEnd w:id="56"/>
+    <w:bookmarkStart w:id="57" w:name="pro-tips"/>
     <w:p>
       <w:pPr>
         <w:pStyle w:val="Heading2"/>
@@ -10576,8 +10165,8 @@
         </w:pict>
       </w:r>
     </w:p>
-    <w:bookmarkEnd w:id="61"/>
-    <w:bookmarkStart w:id="62" w:name="common-mistakes"/>
+    <w:bookmarkEnd w:id="57"/>
+    <w:bookmarkStart w:id="58" w:name="common-mistakes"/>
     <w:p>
       <w:pPr>
         <w:pStyle w:val="Heading2"/>
@@ -11107,8 +10696,8 @@
         </w:r>
       </w:hyperlink>
     </w:p>
-    <w:bookmarkEnd w:id="62"/>
-    <w:bookmarkStart w:id="64" w:name="contributing"/>
+    <w:bookmarkEnd w:id="58"/>
+    <w:bookmarkStart w:id="60" w:name="contributing"/>
     <w:p>
       <w:pPr>
         <w:pStyle w:val="Heading2"/>
@@ -11181,7 +10770,7 @@
       <w:r>
         <w:t xml:space="preserve"> </w:t>
       </w:r>
-      <w:hyperlink r:id="rId63">
+      <w:hyperlink r:id="rId59">
         <w:r>
           <w:rPr>
             <w:rStyle w:val="Hyperlink"/>
@@ -11203,8 +10792,8 @@
         </w:pict>
       </w:r>
     </w:p>
-    <w:bookmarkEnd w:id="64"/>
-    <w:bookmarkStart w:id="77" w:name="release-versions"/>
+    <w:bookmarkEnd w:id="60"/>
+    <w:bookmarkStart w:id="73" w:name="release-versions"/>
     <w:p>
       <w:pPr>
         <w:pStyle w:val="Heading2"/>
@@ -11233,26 +10822,94 @@
       <w:r>
         <w:t xml:space="preserve"> </w:t>
       </w:r>
+      <w:hyperlink r:id="rId61">
+        <w:r>
+          <w:rPr>
+            <w:rStyle w:val="Hyperlink"/>
+          </w:rPr>
+          <w:t xml:space="preserve">CHANGELOG</w:t>
+        </w:r>
+      </w:hyperlink>
+    </w:p>
+    <w:p>
+      <w:pPr>
+        <w:pStyle w:val="BodyText"/>
+      </w:pPr>
+      <w:r>
+        <w:rPr>
+          <w:b/>
+          <w:bCs/>
+        </w:rPr>
+        <w:t xml:space="preserve">ZIP (all formats):</w:t>
+      </w:r>
+      <w:r>
+        <w:t xml:space="preserve"> </w:t>
+      </w:r>
+      <w:hyperlink r:id="rId62">
+        <w:r>
+          <w:rPr>
+            <w:rStyle w:val="Hyperlink"/>
+          </w:rPr>
+          <w:t xml:space="preserve">Complete</w:t>
+        </w:r>
+      </w:hyperlink>
+      <w:r>
+        <w:t xml:space="preserve"> </w:t>
+      </w:r>
+      <w:r>
+        <w:t xml:space="preserve">·</w:t>
+      </w:r>
+      <w:r>
+        <w:t xml:space="preserve"> </w:t>
+      </w:r>
+      <w:hyperlink r:id="rId63">
+        <w:r>
+          <w:rPr>
+            <w:rStyle w:val="Hyperlink"/>
+          </w:rPr>
+          <w:t xml:space="preserve">Quick Reference</w:t>
+        </w:r>
+      </w:hyperlink>
+    </w:p>
+    <w:p>
+      <w:pPr>
+        <w:pStyle w:val="BodyText"/>
+      </w:pPr>
+      <w:r>
+        <w:rPr>
+          <w:b/>
+          <w:bCs/>
+        </w:rPr>
+        <w:t xml:space="preserve">By format:</w:t>
+      </w:r>
+      <w:r>
+        <w:t xml:space="preserve"> </w:t>
+      </w:r>
+      <w:r>
+        <w:t xml:space="preserve">Complete —</w:t>
+      </w:r>
+      <w:r>
+        <w:t xml:space="preserve"> </w:t>
+      </w:r>
+      <w:hyperlink r:id="rId64">
+        <w:r>
+          <w:rPr>
+            <w:rStyle w:val="Hyperlink"/>
+          </w:rPr>
+          <w:t xml:space="preserve">PDF</w:t>
+        </w:r>
+      </w:hyperlink>
+      <w:r>
+        <w:t xml:space="preserve"> </w:t>
+      </w:r>
       <w:hyperlink r:id="rId65">
         <w:r>
           <w:rPr>
             <w:rStyle w:val="Hyperlink"/>
           </w:rPr>
-          <w:t xml:space="preserve">CHANGELOG</w:t>
-        </w:r>
-      </w:hyperlink>
-    </w:p>
-    <w:p>
-      <w:pPr>
-        <w:pStyle w:val="BodyText"/>
-      </w:pPr>
-      <w:r>
-        <w:rPr>
-          <w:b/>
-          <w:bCs/>
-        </w:rPr>
-        <w:t xml:space="preserve">ZIP (all formats):</w:t>
-      </w:r>
+          <w:t xml:space="preserve">DOCX</w:t>
+        </w:r>
+      </w:hyperlink>
       <w:r>
         <w:t xml:space="preserve"> </w:t>
       </w:r>
@@ -11261,15 +10918,9 @@
           <w:rPr>
             <w:rStyle w:val="Hyperlink"/>
           </w:rPr>
-          <w:t xml:space="preserve">Complete</w:t>
-        </w:r>
-      </w:hyperlink>
-      <w:r>
-        <w:t xml:space="preserve"> </w:t>
-      </w:r>
-      <w:r>
-        <w:t xml:space="preserve">·</w:t>
-      </w:r>
+          <w:t xml:space="preserve">RTF</w:t>
+        </w:r>
+      </w:hyperlink>
       <w:r>
         <w:t xml:space="preserve"> </w:t>
       </w:r>
@@ -11278,26 +10929,14 @@
           <w:rPr>
             <w:rStyle w:val="Hyperlink"/>
           </w:rPr>
-          <w:t xml:space="preserve">Quick Reference</w:t>
-        </w:r>
-      </w:hyperlink>
-    </w:p>
-    <w:p>
-      <w:pPr>
-        <w:pStyle w:val="BodyText"/>
-      </w:pPr>
-      <w:r>
-        <w:rPr>
-          <w:b/>
-          <w:bCs/>
-        </w:rPr>
-        <w:t xml:space="preserve">By format:</w:t>
-      </w:r>
-      <w:r>
-        <w:t xml:space="preserve"> </w:t>
-      </w:r>
-      <w:r>
-        <w:t xml:space="preserve">Complete —</w:t>
+          <w:t xml:space="preserve">MD</w:t>
+        </w:r>
+      </w:hyperlink>
+      <w:r>
+        <w:t xml:space="preserve"> </w:t>
+      </w:r>
+      <w:r>
+        <w:t xml:space="preserve">· Quick —</w:t>
       </w:r>
       <w:r>
         <w:t xml:space="preserve"> </w:t>
@@ -11344,62 +10983,12 @@
         </w:r>
       </w:hyperlink>
       <w:r>
-        <w:t xml:space="preserve"> </w:t>
-      </w:r>
-      <w:r>
-        <w:t xml:space="preserve">· Quick —</w:t>
+        <w:t xml:space="preserve">.</w:t>
       </w:r>
       <w:r>
         <w:t xml:space="preserve"> </w:t>
       </w:r>
       <w:hyperlink r:id="rId72">
-        <w:r>
-          <w:rPr>
-            <w:rStyle w:val="Hyperlink"/>
-          </w:rPr>
-          <w:t xml:space="preserve">PDF</w:t>
-        </w:r>
-      </w:hyperlink>
-      <w:r>
-        <w:t xml:space="preserve"> </w:t>
-      </w:r>
-      <w:hyperlink r:id="rId73">
-        <w:r>
-          <w:rPr>
-            <w:rStyle w:val="Hyperlink"/>
-          </w:rPr>
-          <w:t xml:space="preserve">DOCX</w:t>
-        </w:r>
-      </w:hyperlink>
-      <w:r>
-        <w:t xml:space="preserve"> </w:t>
-      </w:r>
-      <w:hyperlink r:id="rId74">
-        <w:r>
-          <w:rPr>
-            <w:rStyle w:val="Hyperlink"/>
-          </w:rPr>
-          <w:t xml:space="preserve">RTF</w:t>
-        </w:r>
-      </w:hyperlink>
-      <w:r>
-        <w:t xml:space="preserve"> </w:t>
-      </w:r>
-      <w:hyperlink r:id="rId75">
-        <w:r>
-          <w:rPr>
-            <w:rStyle w:val="Hyperlink"/>
-          </w:rPr>
-          <w:t xml:space="preserve">MD</w:t>
-        </w:r>
-      </w:hyperlink>
-      <w:r>
-        <w:t xml:space="preserve">.</w:t>
-      </w:r>
-      <w:r>
-        <w:t xml:space="preserve"> </w:t>
-      </w:r>
-      <w:hyperlink r:id="rId76">
         <w:r>
           <w:rPr>
             <w:rStyle w:val="Hyperlink"/>
@@ -11431,8 +11020,8 @@
         </w:pict>
       </w:r>
     </w:p>
-    <w:bookmarkEnd w:id="77"/>
-    <w:bookmarkStart w:id="88" w:name="sources-references"/>
+    <w:bookmarkEnd w:id="73"/>
+    <w:bookmarkStart w:id="84" w:name="sources-references"/>
     <w:p>
       <w:pPr>
         <w:pStyle w:val="Heading2"/>
@@ -11441,7 +11030,7 @@
         <w:t xml:space="preserve">Sources &amp; References</w:t>
       </w:r>
     </w:p>
-    <w:bookmarkStart w:id="81" w:name="problem-solving-methodologies"/>
+    <w:bookmarkStart w:id="77" w:name="problem-solving-methodologies"/>
     <w:p>
       <w:pPr>
         <w:pStyle w:val="Heading3"/>
@@ -11487,7 +11076,7 @@
       <w:r>
         <w:t xml:space="preserve"> </w:t>
       </w:r>
-      <w:hyperlink r:id="rId78">
+      <w:hyperlink r:id="rId74">
         <w:r>
           <w:rPr>
             <w:rStyle w:val="Hyperlink"/>
@@ -11542,7 +11131,7 @@
       <w:r>
         <w:t xml:space="preserve"> </w:t>
       </w:r>
-      <w:hyperlink r:id="rId79">
+      <w:hyperlink r:id="rId75">
         <w:r>
           <w:rPr>
             <w:rStyle w:val="Hyperlink"/>
@@ -11575,7 +11164,7 @@
       <w:r>
         <w:t xml:space="preserve"> </w:t>
       </w:r>
-      <w:hyperlink r:id="rId80">
+      <w:hyperlink r:id="rId76">
         <w:r>
           <w:rPr>
             <w:rStyle w:val="Hyperlink"/>
@@ -11606,8 +11195,8 @@
         <w:t xml:space="preserve">ℹ — Curated/educational problem-solving mnemonics for this collection.</w:t>
       </w:r>
     </w:p>
-    <w:bookmarkEnd w:id="81"/>
-    <w:bookmarkStart w:id="85" w:name="strategic-analysis-frameworks"/>
+    <w:bookmarkEnd w:id="77"/>
+    <w:bookmarkStart w:id="81" w:name="strategic-analysis-frameworks"/>
     <w:p>
       <w:pPr>
         <w:pStyle w:val="Heading3"/>
@@ -11653,7 +11242,7 @@
       <w:r>
         <w:t xml:space="preserve"> </w:t>
       </w:r>
-      <w:hyperlink r:id="rId82">
+      <w:hyperlink r:id="rId78">
         <w:r>
           <w:rPr>
             <w:rStyle w:val="Hyperlink"/>
@@ -11708,7 +11297,7 @@
       <w:r>
         <w:t xml:space="preserve"> </w:t>
       </w:r>
-      <w:hyperlink r:id="rId83">
+      <w:hyperlink r:id="rId79">
         <w:r>
           <w:rPr>
             <w:rStyle w:val="Hyperlink"/>
@@ -11741,7 +11330,7 @@
       <w:r>
         <w:t xml:space="preserve"> </w:t>
       </w:r>
-      <w:hyperlink r:id="rId84">
+      <w:hyperlink r:id="rId80">
         <w:r>
           <w:rPr>
             <w:rStyle w:val="Hyperlink"/>
@@ -11796,8 +11385,8 @@
         </w:r>
       </w:hyperlink>
     </w:p>
-    <w:bookmarkEnd w:id="85"/>
-    <w:bookmarkStart w:id="86" w:name="problem-resolution-threats-triage"/>
+    <w:bookmarkEnd w:id="81"/>
+    <w:bookmarkStart w:id="82" w:name="problem-resolution-threats-triage"/>
     <w:p>
       <w:pPr>
         <w:pStyle w:val="Heading3"/>
@@ -11828,8 +11417,8 @@
         <w:t xml:space="preserve">ℹ — Educational mnemonics for blockers and resource checks in this collection.</w:t>
       </w:r>
     </w:p>
-    <w:bookmarkEnd w:id="86"/>
-    <w:bookmarkStart w:id="87" w:name="X26575901e59616899e8b3847496560b142cc09a"/>
+    <w:bookmarkEnd w:id="82"/>
+    <w:bookmarkStart w:id="83" w:name="X26575901e59616899e8b3847496560b142cc09a"/>
     <w:p>
       <w:pPr>
         <w:pStyle w:val="Heading3"/>
@@ -11851,7 +11440,7 @@
           <w:b/>
           <w:bCs/>
         </w:rPr>
-        <w:t xml:space="preserve">BREATHE, PAUSE, WAIT, PACE, STOP, ARIES, HELP, HANDLE, CALM, PUSH, HOPE, SHINE</w:t>
+        <w:t xml:space="preserve">BREATHE, PAUSE, WAIT, PACE, STOP, ARIES, CALM, SHINE</w:t>
       </w:r>
       <w:r>
         <w:t xml:space="preserve"> </w:t>
@@ -11900,9 +11489,9 @@
         <w:t xml:space="preserve">✓ documented; ⚠ adapted; ℹ curated. Mix of established frameworks and educational compilations.</w:t>
       </w:r>
     </w:p>
-    <w:bookmarkEnd w:id="87"/>
-    <w:bookmarkEnd w:id="88"/>
-    <w:bookmarkEnd w:id="89"/>
+    <w:bookmarkEnd w:id="83"/>
+    <w:bookmarkEnd w:id="84"/>
+    <w:bookmarkEnd w:id="85"/>
     <w:sectPr>
       <w:footnotePr>
         <w:numRestart w:val="eachSect"/>

</xml_diff>

<commit_message>
Release v2.6: downloadable docs synced, domain addenda, Quick Start, Evidence tier, Tools & docs, Awesome-list clarity
</commit_message>
<xml_diff>
--- a/releases/Awesome-Mnemonics-Complete-Guide.docx
+++ b/releases/Awesome-Mnemonics-Complete-Guide.docx
@@ -28,7 +28,7 @@
         </w:p>
       </w:sdtContent>
     </w:sdt>
-    <w:bookmarkStart w:id="85" w:name="awesome-mnemonics---complete-guide"/>
+    <w:bookmarkStart w:id="87" w:name="awesome-mnemonics---complete-guide"/>
     <w:p>
       <w:pPr>
         <w:pStyle w:val="Heading1"/>
@@ -51,7 +51,13 @@
           <w:b/>
           <w:bCs/>
         </w:rPr>
-        <w:t xml:space="preserve">Memory hacks that compress complex workflows into actionable acronyms. Use during incidents, RCAs (root cause analysis), design decisions, or high-stress situations.</w:t>
+        <w:t xml:space="preserve">A curated list of problem-solving and stress-management mnemonics.</w:t>
+      </w:r>
+      <w:r>
+        <w:t xml:space="preserve"> </w:t>
+      </w:r>
+      <w:r>
+        <w:t xml:space="preserve">Acronyms that compress workflows into actionable steps—for incidents, RCAs (root cause analysis), design decisions, and high-stress situations.</w:t>
       </w:r>
     </w:p>
     <w:p>
@@ -69,7 +75,7 @@
         <w:t xml:space="preserve"> </w:t>
       </w:r>
       <w:r>
-        <w:t xml:space="preserve">Established frameworks (e.g. 8D, SWOT, PESTEL, RACI, SET) and curated mnemonics for learning and incident use.</w:t>
+        <w:t xml:space="preserve">Includes established frameworks (8D, SWOT, PESTEL, RACI, SET) and curated mnemonics.</w:t>
       </w:r>
       <w:r>
         <w:t xml:space="preserve"> </w:t>
@@ -98,7 +104,7 @@
           <w:i/>
           <w:iCs/>
         </w:rPr>
-        <w:t xml:space="preserve">Release v2.5 — 2026-01-25</w:t>
+        <w:t xml:space="preserve">Release v2.6 — 2026-01-25</w:t>
       </w:r>
     </w:p>
     <w:p>
@@ -704,18 +710,6 @@
       </w:pPr>
       <w:r>
         <w:rPr>
-          <w:i/>
-          <w:iCs/>
-        </w:rPr>
-        <w:t xml:space="preserve">(If icons don’t display: 🚨=crisis, 🔍=root cause, 👥=conflict, 📊=planning, 🏗️=design, 🐛=debug, 😰=stress.)</w:t>
-      </w:r>
-    </w:p>
-    <w:p>
-      <w:pPr>
-        <w:pStyle w:val="BodyText"/>
-      </w:pPr>
-      <w:r>
-        <w:rPr>
           <w:b/>
           <w:bCs/>
         </w:rPr>
@@ -792,12 +786,12 @@
       <w:r>
         <w:t xml:space="preserve"> </w:t>
       </w:r>
-      <w:hyperlink w:anchor="awesome-mnemonics---complete-guide">
-        <w:r>
-          <w:rPr>
-            <w:rStyle w:val="Hyperlink"/>
-          </w:rPr>
-          <w:t xml:space="preserve">📥 Top</w:t>
+      <w:hyperlink w:anchor="awesome-mnemonics">
+        <w:r>
+          <w:rPr>
+            <w:rStyle w:val="Hyperlink"/>
+          </w:rPr>
+          <w:t xml:space="preserve">📥 Downloads</w:t>
         </w:r>
       </w:hyperlink>
     </w:p>
@@ -827,7 +821,7 @@
           <w:i/>
           <w:iCs/>
         </w:rPr>
-        <w:t xml:space="preserve">Lookup by area; when-to-use guidance.</w:t>
+        <w:t xml:space="preserve">Browse by category; each entry links to full definition and when-to-use guidance.</w:t>
       </w:r>
     </w:p>
     <w:bookmarkStart w:id="11" w:name="ops"/>
@@ -2007,14 +2001,6 @@
         <w:t xml:space="preserve"> </w:t>
       </w:r>
       <w:r>
-        <w:t xml:space="preserve">Social proof helps enterprise adoption; your org helps others.</w:t>
-      </w:r>
-    </w:p>
-    <w:p>
-      <w:pPr>
-        <w:pStyle w:val="BodyText"/>
-      </w:pPr>
-      <w:r>
         <w:t xml:space="preserve">One-line PR, e.g. </w:t>
       </w:r>
       <w:r>
@@ -2072,19 +2058,7 @@
         <w:t xml:space="preserve"> </w:t>
       </w:r>
       <w:r>
-        <w:t xml:space="preserve">— pipeline and search from</w:t>
-      </w:r>
-      <w:r>
-        <w:t xml:space="preserve"> </w:t>
-      </w:r>
-      <w:r>
-        <w:rPr>
-          <w:rStyle w:val="VerbatimChar"/>
-        </w:rPr>
-        <w:t xml:space="preserve">mnemonics-index.yaml</w:t>
-      </w:r>
-      <w:r>
-        <w:t xml:space="preserve">.</w:t>
+        <w:t xml:space="preserve">— look up pipelines and search mnemonics by topic.</w:t>
       </w:r>
     </w:p>
     <w:p>
@@ -2233,6 +2207,42 @@
           <w:rStyle w:val="VerbatimChar"/>
         </w:rPr>
         <w:t xml:space="preserve">mnemonic search stress -o json</w:t>
+      </w:r>
+    </w:p>
+    <w:p>
+      <w:pPr>
+        <w:pStyle w:val="BodyText"/>
+      </w:pPr>
+      <w:r>
+        <w:rPr>
+          <w:b/>
+          <w:bCs/>
+        </w:rPr>
+        <w:t xml:space="preserve">Alias (optional):</w:t>
+      </w:r>
+      <w:r>
+        <w:t xml:space="preserve"> </w:t>
+      </w:r>
+      <w:r>
+        <w:rPr>
+          <w:rStyle w:val="VerbatimChar"/>
+        </w:rPr>
+        <w:t xml:space="preserve">alias incident='mnemonic pipeline crisis'</w:t>
+      </w:r>
+      <w:r>
+        <w:t xml:space="preserve"> </w:t>
+      </w:r>
+      <w:r>
+        <w:t xml:space="preserve">in</w:t>
+      </w:r>
+      <w:r>
+        <w:t xml:space="preserve"> </w:t>
+      </w:r>
+      <w:r>
+        <w:rPr>
+          <w:rStyle w:val="VerbatimChar"/>
+        </w:rPr>
+        <w:t xml:space="preserve">~/.zshrc</w:t>
       </w:r>
     </w:p>
     <w:p>
@@ -2302,318 +2312,13 @@
       </w:r>
     </w:p>
     <w:bookmarkEnd w:id="19"/>
-    <w:bookmarkStart w:id="20" w:name="mnemonic-selection-flowchart"/>
+    <w:bookmarkStart w:id="21" w:name="quick-start-sre-infra"/>
     <w:p>
       <w:pPr>
         <w:pStyle w:val="Heading2"/>
       </w:pPr>
       <w:r>
-        <w:t xml:space="preserve">🔄 Mnemonic Selection Flowchart</w:t>
-      </w:r>
-    </w:p>
-    <w:p>
-      <w:pPr>
-        <w:pStyle w:val="FirstParagraph"/>
-      </w:pPr>
-      <w:r>
-        <w:rPr>
-          <w:i/>
-          <w:iCs/>
-        </w:rPr>
-        <w:t xml:space="preserve">📱 If hard to read:</w:t>
-      </w:r>
-      <w:r>
-        <w:rPr>
-          <w:i/>
-          <w:iCs/>
-        </w:rPr>
-        <w:t xml:space="preserve"> </w:t>
-      </w:r>
-      <w:hyperlink w:anchor="quick-reference--on-call-guide">
-        <w:r>
-          <w:rPr>
-            <w:rStyle w:val="Hyperlink"/>
-            <w:i/>
-            <w:iCs/>
-          </w:rPr>
-          <w:t xml:space="preserve">Quick Reference</w:t>
-        </w:r>
-      </w:hyperlink>
-      <w:r>
-        <w:rPr>
-          <w:i/>
-          <w:iCs/>
-        </w:rPr>
-        <w:t xml:space="preserve"> </w:t>
-      </w:r>
-      <w:r>
-        <w:rPr>
-          <w:i/>
-          <w:iCs/>
-        </w:rPr>
-        <w:t xml:space="preserve">or</w:t>
-      </w:r>
-      <w:r>
-        <w:rPr>
-          <w:i/>
-          <w:iCs/>
-        </w:rPr>
-        <w:t xml:space="preserve"> </w:t>
-      </w:r>
-      <w:hyperlink w:anchor="categorized-index">
-        <w:r>
-          <w:rPr>
-            <w:rStyle w:val="Hyperlink"/>
-            <w:i/>
-            <w:iCs/>
-          </w:rPr>
-          <w:t xml:space="preserve">Index</w:t>
-        </w:r>
-      </w:hyperlink>
-      <w:r>
-        <w:rPr>
-          <w:i/>
-          <w:iCs/>
-        </w:rPr>
-        <w:t xml:space="preserve">.</w:t>
-      </w:r>
-    </w:p>
-    <w:p>
-      <w:pPr>
-        <w:pStyle w:val="SourceCode"/>
-      </w:pPr>
-      <w:r>
-        <w:rPr>
-          <w:rStyle w:val="VerbatimChar"/>
-        </w:rPr>
-        <w:t xml:space="preserve">                    ┌─────────────┐</w:t>
-      </w:r>
-      <w:r>
-        <w:br/>
-      </w:r>
-      <w:r>
-        <w:rPr>
-          <w:rStyle w:val="VerbatimChar"/>
-        </w:rPr>
-        <w:t xml:space="preserve">                    │  Problem?   │</w:t>
-      </w:r>
-      <w:r>
-        <w:br/>
-      </w:r>
-      <w:r>
-        <w:rPr>
-          <w:rStyle w:val="VerbatimChar"/>
-        </w:rPr>
-        <w:t xml:space="preserve">                    └──────┬──────┘</w:t>
-      </w:r>
-      <w:r>
-        <w:br/>
-      </w:r>
-      <w:r>
-        <w:rPr>
-          <w:rStyle w:val="VerbatimChar"/>
-        </w:rPr>
-        <w:t xml:space="preserve">                           │</w:t>
-      </w:r>
-      <w:r>
-        <w:br/>
-      </w:r>
-      <w:r>
-        <w:rPr>
-          <w:rStyle w:val="VerbatimChar"/>
-        </w:rPr>
-        <w:t xml:space="preserve">              ┌────────────┼────────────┐</w:t>
-      </w:r>
-      <w:r>
-        <w:br/>
-      </w:r>
-      <w:r>
-        <w:rPr>
-          <w:rStyle w:val="VerbatimChar"/>
-        </w:rPr>
-        <w:t xml:space="preserve">              │            │            │</w:t>
-      </w:r>
-      <w:r>
-        <w:br/>
-      </w:r>
-      <w:r>
-        <w:rPr>
-          <w:rStyle w:val="VerbatimChar"/>
-        </w:rPr>
-        <w:t xml:space="preserve">         ┌────▼───┐   ┌────▼───┐   ┌────▼────┐</w:t>
-      </w:r>
-      <w:r>
-        <w:br/>
-      </w:r>
-      <w:r>
-        <w:rPr>
-          <w:rStyle w:val="VerbatimChar"/>
-        </w:rPr>
-        <w:t xml:space="preserve">         │ Quick? │   │Complex?│   │ Stress? │</w:t>
-      </w:r>
-      <w:r>
-        <w:br/>
-      </w:r>
-      <w:r>
-        <w:rPr>
-          <w:rStyle w:val="VerbatimChar"/>
-        </w:rPr>
-        <w:t xml:space="preserve">         └────┬───┘   └────┬───┘   └────┬────┘</w:t>
-      </w:r>
-      <w:r>
-        <w:br/>
-      </w:r>
-      <w:r>
-        <w:rPr>
-          <w:rStyle w:val="VerbatimChar"/>
-        </w:rPr>
-        <w:t xml:space="preserve">              │            │            │</w:t>
-      </w:r>
-      <w:r>
-        <w:br/>
-      </w:r>
-      <w:r>
-        <w:rPr>
-          <w:rStyle w:val="VerbatimChar"/>
-        </w:rPr>
-        <w:t xml:space="preserve">         ┌────▼────┐  ┌────▼─────┐  ┌───▼────┐</w:t>
-      </w:r>
-      <w:r>
-        <w:br/>
-      </w:r>
-      <w:r>
-        <w:rPr>
-          <w:rStyle w:val="VerbatimChar"/>
-        </w:rPr>
-        <w:t xml:space="preserve">         │  IDEA   │  │PREPARE/  │  │ STOP → │</w:t>
-      </w:r>
-      <w:r>
-        <w:br/>
-      </w:r>
-      <w:r>
-        <w:rPr>
-          <w:rStyle w:val="VerbatimChar"/>
-        </w:rPr>
-        <w:t xml:space="preserve">         │    +    │  │ICEBERG+  │  │ PACE   │</w:t>
-      </w:r>
-      <w:r>
-        <w:br/>
-      </w:r>
-      <w:r>
-        <w:rPr>
-          <w:rStyle w:val="VerbatimChar"/>
-        </w:rPr>
-        <w:t xml:space="preserve">         │  STOP   │  │ 5 Whys   │  └────────┘</w:t>
-      </w:r>
-      <w:r>
-        <w:br/>
-      </w:r>
-      <w:r>
-        <w:rPr>
-          <w:rStyle w:val="VerbatimChar"/>
-        </w:rPr>
-        <w:t xml:space="preserve">         └─────────┘  └──────────┘</w:t>
-      </w:r>
-    </w:p>
-    <w:p>
-      <w:pPr>
-        <w:pStyle w:val="FirstParagraph"/>
-      </w:pPr>
-      <w:r>
-        <w:rPr>
-          <w:b/>
-          <w:bCs/>
-        </w:rPr>
-        <w:t xml:space="preserve">Flowchart (text summary):</w:t>
-      </w:r>
-      <w:r>
-        <w:t xml:space="preserve"> </w:t>
-      </w:r>
-      <w:r>
-        <w:rPr>
-          <w:b/>
-          <w:bCs/>
-        </w:rPr>
-        <w:t xml:space="preserve">Quick?</w:t>
-      </w:r>
-      <w:r>
-        <w:t xml:space="preserve"> </w:t>
-      </w:r>
-      <w:r>
-        <w:t xml:space="preserve">→ IDEA+STOP ·</w:t>
-      </w:r>
-      <w:r>
-        <w:t xml:space="preserve"> </w:t>
-      </w:r>
-      <w:r>
-        <w:rPr>
-          <w:b/>
-          <w:bCs/>
-        </w:rPr>
-        <w:t xml:space="preserve">Complex?</w:t>
-      </w:r>
-      <w:r>
-        <w:t xml:space="preserve"> </w:t>
-      </w:r>
-      <w:r>
-        <w:t xml:space="preserve">→ PREPARE/ICEBERG+5 Whys ·</w:t>
-      </w:r>
-      <w:r>
-        <w:t xml:space="preserve"> </w:t>
-      </w:r>
-      <w:r>
-        <w:rPr>
-          <w:b/>
-          <w:bCs/>
-        </w:rPr>
-        <w:t xml:space="preserve">Stress?</w:t>
-      </w:r>
-      <w:r>
-        <w:t xml:space="preserve"> </w:t>
-      </w:r>
-      <w:r>
-        <w:t xml:space="preserve">→ STOP→PACE. Use</w:t>
-      </w:r>
-      <w:r>
-        <w:t xml:space="preserve"> </w:t>
-      </w:r>
-      <w:hyperlink w:anchor="quick-reference--on-call-guide">
-        <w:r>
-          <w:rPr>
-            <w:rStyle w:val="Hyperlink"/>
-          </w:rPr>
-          <w:t xml:space="preserve">Quick Reference</w:t>
-        </w:r>
-      </w:hyperlink>
-      <w:r>
-        <w:t xml:space="preserve"> </w:t>
-      </w:r>
-      <w:r>
-        <w:t xml:space="preserve">or</w:t>
-      </w:r>
-      <w:r>
-        <w:t xml:space="preserve"> </w:t>
-      </w:r>
-      <w:hyperlink w:anchor="categorized-index">
-        <w:r>
-          <w:rPr>
-            <w:rStyle w:val="Hyperlink"/>
-          </w:rPr>
-          <w:t xml:space="preserve">Categorized Index</w:t>
-        </w:r>
-      </w:hyperlink>
-      <w:r>
-        <w:t xml:space="preserve">.</w:t>
-      </w:r>
-    </w:p>
-    <w:bookmarkEnd w:id="20"/>
-    <w:bookmarkStart w:id="21" w:name="table-of-contents"/>
-    <w:p>
-      <w:pPr>
-        <w:pStyle w:val="Heading2"/>
-      </w:pPr>
-      <w:r>
-        <w:t xml:space="preserve">Table of Contents</w:t>
+        <w:t xml:space="preserve">Quick Start (SRE / Infra)</w:t>
       </w:r>
     </w:p>
     <w:p>
@@ -2624,6 +2329,365 @@
           <w:numId w:val="1001"/>
         </w:numPr>
       </w:pPr>
+      <w:r>
+        <w:rPr>
+          <w:b/>
+          <w:bCs/>
+        </w:rPr>
+        <w:t xml:space="preserve">Runbook</w:t>
+      </w:r>
+      <w:r>
+        <w:t xml:space="preserve"> </w:t>
+      </w:r>
+      <w:r>
+        <w:t xml:space="preserve">— Copy</w:t>
+      </w:r>
+      <w:r>
+        <w:t xml:space="preserve"> </w:t>
+      </w:r>
+      <w:hyperlink r:id="rId20">
+        <w:r>
+          <w:rPr>
+            <w:rStyle w:val="Hyperlink"/>
+          </w:rPr>
+          <w:t xml:space="preserve">incident-response-runbook.md</w:t>
+        </w:r>
+      </w:hyperlink>
+      <w:r>
+        <w:t xml:space="preserve"> </w:t>
+      </w:r>
+      <w:r>
+        <w:t xml:space="preserve">(STOP→TRACE→DEBUG→8D) into Confluence, wiki, or runbook store.</w:t>
+      </w:r>
+    </w:p>
+    <w:p>
+      <w:pPr>
+        <w:pStyle w:val="Compact"/>
+        <w:numPr>
+          <w:ilvl w:val="0"/>
+          <w:numId w:val="1001"/>
+        </w:numPr>
+      </w:pPr>
+      <w:r>
+        <w:rPr>
+          <w:b/>
+          <w:bCs/>
+        </w:rPr>
+        <w:t xml:space="preserve">CLI</w:t>
+      </w:r>
+      <w:r>
+        <w:t xml:space="preserve"> </w:t>
+      </w:r>
+      <w:r>
+        <w:t xml:space="preserve">—</w:t>
+      </w:r>
+      <w:r>
+        <w:t xml:space="preserve"> </w:t>
+      </w:r>
+      <w:r>
+        <w:rPr>
+          <w:rStyle w:val="VerbatimChar"/>
+        </w:rPr>
+        <w:t xml:space="preserve">pip install git+https://github.com/StewAlexander-com/Awesome-Mnemonics.git</w:t>
+      </w:r>
+      <w:r>
+        <w:t xml:space="preserve"> </w:t>
+      </w:r>
+      <w:r>
+        <w:t xml:space="preserve">then</w:t>
+      </w:r>
+      <w:r>
+        <w:t xml:space="preserve"> </w:t>
+      </w:r>
+      <w:r>
+        <w:rPr>
+          <w:rStyle w:val="VerbatimChar"/>
+        </w:rPr>
+        <w:t xml:space="preserve">mnemonic pipeline crisis</w:t>
+      </w:r>
+      <w:r>
+        <w:t xml:space="preserve"> </w:t>
+      </w:r>
+      <w:r>
+        <w:t xml:space="preserve">(or</w:t>
+      </w:r>
+      <w:r>
+        <w:t xml:space="preserve"> </w:t>
+      </w:r>
+      <w:r>
+        <w:rPr>
+          <w:rStyle w:val="VerbatimChar"/>
+        </w:rPr>
+        <w:t xml:space="preserve">mnemonic search &lt;topic&gt;</w:t>
+      </w:r>
+      <w:r>
+        <w:t xml:space="preserve">).</w:t>
+      </w:r>
+    </w:p>
+    <w:p>
+      <w:pPr>
+        <w:pStyle w:val="Compact"/>
+        <w:numPr>
+          <w:ilvl w:val="0"/>
+          <w:numId w:val="1001"/>
+        </w:numPr>
+      </w:pPr>
+      <w:r>
+        <w:rPr>
+          <w:b/>
+          <w:bCs/>
+        </w:rPr>
+        <w:t xml:space="preserve">Alias</w:t>
+      </w:r>
+      <w:r>
+        <w:t xml:space="preserve"> </w:t>
+      </w:r>
+      <w:r>
+        <w:t xml:space="preserve">—</w:t>
+      </w:r>
+      <w:r>
+        <w:t xml:space="preserve"> </w:t>
+      </w:r>
+      <w:r>
+        <w:rPr>
+          <w:rStyle w:val="VerbatimChar"/>
+        </w:rPr>
+        <w:t xml:space="preserve">alias incident='mnemonic pipeline crisis'</w:t>
+      </w:r>
+      <w:r>
+        <w:t xml:space="preserve"> </w:t>
+      </w:r>
+      <w:r>
+        <w:t xml:space="preserve">in</w:t>
+      </w:r>
+      <w:r>
+        <w:t xml:space="preserve"> </w:t>
+      </w:r>
+      <w:r>
+        <w:rPr>
+          <w:rStyle w:val="VerbatimChar"/>
+        </w:rPr>
+        <w:t xml:space="preserve">~/.zshrc</w:t>
+      </w:r>
+    </w:p>
+    <w:p>
+      <w:r>
+        <w:pict>
+          <v:rect style="width:0;height:1.5pt" o:hralign="center" o:hrstd="t" o:hr="t"/>
+        </w:pict>
+      </w:r>
+    </w:p>
+    <w:bookmarkEnd w:id="21"/>
+    <w:bookmarkStart w:id="22" w:name="mnemonic-selection-flowchart"/>
+    <w:p>
+      <w:pPr>
+        <w:pStyle w:val="Heading2"/>
+      </w:pPr>
+      <w:r>
+        <w:t xml:space="preserve">🔄 Mnemonic Selection Flowchart</w:t>
+      </w:r>
+    </w:p>
+    <w:p>
+      <w:pPr>
+        <w:pStyle w:val="SourceCode"/>
+      </w:pPr>
+      <w:r>
+        <w:rPr>
+          <w:rStyle w:val="VerbatimChar"/>
+        </w:rPr>
+        <w:t xml:space="preserve">                    ┌─────────────┐</w:t>
+      </w:r>
+      <w:r>
+        <w:br/>
+      </w:r>
+      <w:r>
+        <w:rPr>
+          <w:rStyle w:val="VerbatimChar"/>
+        </w:rPr>
+        <w:t xml:space="preserve">                    │  Problem?   │</w:t>
+      </w:r>
+      <w:r>
+        <w:br/>
+      </w:r>
+      <w:r>
+        <w:rPr>
+          <w:rStyle w:val="VerbatimChar"/>
+        </w:rPr>
+        <w:t xml:space="preserve">                    └──────┬──────┘</w:t>
+      </w:r>
+      <w:r>
+        <w:br/>
+      </w:r>
+      <w:r>
+        <w:rPr>
+          <w:rStyle w:val="VerbatimChar"/>
+        </w:rPr>
+        <w:t xml:space="preserve">                           │</w:t>
+      </w:r>
+      <w:r>
+        <w:br/>
+      </w:r>
+      <w:r>
+        <w:rPr>
+          <w:rStyle w:val="VerbatimChar"/>
+        </w:rPr>
+        <w:t xml:space="preserve">              ┌────────────┼────────────┐</w:t>
+      </w:r>
+      <w:r>
+        <w:br/>
+      </w:r>
+      <w:r>
+        <w:rPr>
+          <w:rStyle w:val="VerbatimChar"/>
+        </w:rPr>
+        <w:t xml:space="preserve">              │            │            │</w:t>
+      </w:r>
+      <w:r>
+        <w:br/>
+      </w:r>
+      <w:r>
+        <w:rPr>
+          <w:rStyle w:val="VerbatimChar"/>
+        </w:rPr>
+        <w:t xml:space="preserve">         ┌────▼───┐   ┌────▼───┐   ┌────▼────┐</w:t>
+      </w:r>
+      <w:r>
+        <w:br/>
+      </w:r>
+      <w:r>
+        <w:rPr>
+          <w:rStyle w:val="VerbatimChar"/>
+        </w:rPr>
+        <w:t xml:space="preserve">         │ Quick? │   │Complex?│   │ Stress? │</w:t>
+      </w:r>
+      <w:r>
+        <w:br/>
+      </w:r>
+      <w:r>
+        <w:rPr>
+          <w:rStyle w:val="VerbatimChar"/>
+        </w:rPr>
+        <w:t xml:space="preserve">         └────┬───┘   └────┬───┘   └────┬────┘</w:t>
+      </w:r>
+      <w:r>
+        <w:br/>
+      </w:r>
+      <w:r>
+        <w:rPr>
+          <w:rStyle w:val="VerbatimChar"/>
+        </w:rPr>
+        <w:t xml:space="preserve">              │            │            │</w:t>
+      </w:r>
+      <w:r>
+        <w:br/>
+      </w:r>
+      <w:r>
+        <w:rPr>
+          <w:rStyle w:val="VerbatimChar"/>
+        </w:rPr>
+        <w:t xml:space="preserve">         ┌────▼────┐  ┌────▼─────┐  ┌───▼────┐</w:t>
+      </w:r>
+      <w:r>
+        <w:br/>
+      </w:r>
+      <w:r>
+        <w:rPr>
+          <w:rStyle w:val="VerbatimChar"/>
+        </w:rPr>
+        <w:t xml:space="preserve">         │  IDEA   │  │PREPARE/  │  │ STOP → │</w:t>
+      </w:r>
+      <w:r>
+        <w:br/>
+      </w:r>
+      <w:r>
+        <w:rPr>
+          <w:rStyle w:val="VerbatimChar"/>
+        </w:rPr>
+        <w:t xml:space="preserve">         │    +    │  │ICEBERG+  │  │ PACE   │</w:t>
+      </w:r>
+      <w:r>
+        <w:br/>
+      </w:r>
+      <w:r>
+        <w:rPr>
+          <w:rStyle w:val="VerbatimChar"/>
+        </w:rPr>
+        <w:t xml:space="preserve">         │  STOP   │  │ 5 Whys   │  └────────┘</w:t>
+      </w:r>
+      <w:r>
+        <w:br/>
+      </w:r>
+      <w:r>
+        <w:rPr>
+          <w:rStyle w:val="VerbatimChar"/>
+        </w:rPr>
+        <w:t xml:space="preserve">         └─────────┘  └──────────┘</w:t>
+      </w:r>
+    </w:p>
+    <w:p>
+      <w:pPr>
+        <w:pStyle w:val="FirstParagraph"/>
+      </w:pPr>
+      <w:r>
+        <w:rPr>
+          <w:b/>
+          <w:bCs/>
+        </w:rPr>
+        <w:t xml:space="preserve">Summary:</w:t>
+      </w:r>
+      <w:r>
+        <w:t xml:space="preserve"> </w:t>
+      </w:r>
+      <w:r>
+        <w:t xml:space="preserve">Quick? → IDEA+STOP · Complex? → PREPARE/ICEBERG+5 Whys · Stress? → STOP→PACE.</w:t>
+      </w:r>
+      <w:r>
+        <w:t xml:space="preserve"> </w:t>
+      </w:r>
+      <w:hyperlink w:anchor="quick-reference--on-call-guide">
+        <w:r>
+          <w:rPr>
+            <w:rStyle w:val="Hyperlink"/>
+          </w:rPr>
+          <w:t xml:space="preserve">Quick Reference</w:t>
+        </w:r>
+      </w:hyperlink>
+      <w:r>
+        <w:t xml:space="preserve"> </w:t>
+      </w:r>
+      <w:r>
+        <w:t xml:space="preserve">|</w:t>
+      </w:r>
+      <w:r>
+        <w:t xml:space="preserve"> </w:t>
+      </w:r>
+      <w:hyperlink w:anchor="categorized-index">
+        <w:r>
+          <w:rPr>
+            <w:rStyle w:val="Hyperlink"/>
+          </w:rPr>
+          <w:t xml:space="preserve">Index</w:t>
+        </w:r>
+      </w:hyperlink>
+    </w:p>
+    <w:bookmarkEnd w:id="22"/>
+    <w:bookmarkStart w:id="23" w:name="table-of-contents"/>
+    <w:p>
+      <w:pPr>
+        <w:pStyle w:val="Heading2"/>
+      </w:pPr>
+      <w:r>
+        <w:t xml:space="preserve">Table of Contents</w:t>
+      </w:r>
+    </w:p>
+    <w:p>
+      <w:pPr>
+        <w:pStyle w:val="Compact"/>
+        <w:numPr>
+          <w:ilvl w:val="0"/>
+          <w:numId w:val="1002"/>
+        </w:numPr>
+      </w:pPr>
       <w:hyperlink w:anchor="awesome-mnemonics---complete-guide">
         <w:r>
           <w:rPr>
@@ -2638,7 +2702,7 @@
         <w:pStyle w:val="Compact"/>
         <w:numPr>
           <w:ilvl w:val="1"/>
-          <w:numId w:val="1002"/>
+          <w:numId w:val="1003"/>
         </w:numPr>
       </w:pPr>
       <w:hyperlink w:anchor="quick-reference--on-call-guide">
@@ -2655,185 +2719,15 @@
         <w:pStyle w:val="Compact"/>
         <w:numPr>
           <w:ilvl w:val="1"/>
-          <w:numId w:val="1002"/>
-        </w:numPr>
-      </w:pPr>
-      <w:hyperlink w:anchor="categorized-index">
-        <w:r>
-          <w:rPr>
-            <w:rStyle w:val="Hyperlink"/>
-          </w:rPr>
-          <w:t xml:space="preserve">📑 Categorized Index</w:t>
-        </w:r>
-      </w:hyperlink>
-    </w:p>
-    <w:p>
-      <w:pPr>
-        <w:pStyle w:val="Compact"/>
-        <w:numPr>
-          <w:ilvl w:val="2"/>
           <w:numId w:val="1003"/>
         </w:numPr>
       </w:pPr>
-      <w:hyperlink w:anchor="ops">
-        <w:r>
-          <w:rPr>
-            <w:rStyle w:val="Hyperlink"/>
-          </w:rPr>
-          <w:t xml:space="preserve">🔧 Ops</w:t>
-        </w:r>
-      </w:hyperlink>
-    </w:p>
-    <w:p>
-      <w:pPr>
-        <w:pStyle w:val="Compact"/>
-        <w:numPr>
-          <w:ilvl w:val="2"/>
-          <w:numId w:val="1003"/>
-        </w:numPr>
-      </w:pPr>
-      <w:hyperlink w:anchor="rca-root-cause-analysis">
-        <w:r>
-          <w:rPr>
-            <w:rStyle w:val="Hyperlink"/>
-          </w:rPr>
-          <w:t xml:space="preserve">🔍 RCA (Root Cause Analysis)</w:t>
-        </w:r>
-      </w:hyperlink>
-    </w:p>
-    <w:p>
-      <w:pPr>
-        <w:pStyle w:val="Compact"/>
-        <w:numPr>
-          <w:ilvl w:val="2"/>
-          <w:numId w:val="1003"/>
-        </w:numPr>
-      </w:pPr>
-      <w:hyperlink w:anchor="systems-design">
-        <w:r>
-          <w:rPr>
-            <w:rStyle w:val="Hyperlink"/>
-          </w:rPr>
-          <w:t xml:space="preserve">🏗️ Systems Design</w:t>
-        </w:r>
-      </w:hyperlink>
-    </w:p>
-    <w:p>
-      <w:pPr>
-        <w:pStyle w:val="Compact"/>
-        <w:numPr>
-          <w:ilvl w:val="2"/>
-          <w:numId w:val="1003"/>
-        </w:numPr>
-      </w:pPr>
-      <w:hyperlink w:anchor="human-factors">
-        <w:r>
-          <w:rPr>
-            <w:rStyle w:val="Hyperlink"/>
-          </w:rPr>
-          <w:t xml:space="preserve">👥 Human Factors</w:t>
-        </w:r>
-      </w:hyperlink>
-    </w:p>
-    <w:p>
-      <w:pPr>
-        <w:pStyle w:val="Compact"/>
-        <w:numPr>
-          <w:ilvl w:val="2"/>
-          <w:numId w:val="1003"/>
-        </w:numPr>
-      </w:pPr>
-      <w:hyperlink w:anchor="personal-life">
-        <w:r>
-          <w:rPr>
-            <w:rStyle w:val="Hyperlink"/>
-          </w:rPr>
-          <w:t xml:space="preserve">🧘 Personal Life</w:t>
-        </w:r>
-      </w:hyperlink>
-    </w:p>
-    <w:p>
-      <w:pPr>
-        <w:pStyle w:val="Compact"/>
-        <w:numPr>
-          <w:ilvl w:val="1"/>
-          <w:numId w:val="1002"/>
-        </w:numPr>
-      </w:pPr>
-      <w:hyperlink w:anchor="who-uses-this">
-        <w:r>
-          <w:rPr>
-            <w:rStyle w:val="Hyperlink"/>
-          </w:rPr>
-          <w:t xml:space="preserve">Who Uses This?</w:t>
-        </w:r>
-      </w:hyperlink>
-    </w:p>
-    <w:p>
-      <w:pPr>
-        <w:pStyle w:val="Compact"/>
-        <w:numPr>
-          <w:ilvl w:val="1"/>
-          <w:numId w:val="1002"/>
-        </w:numPr>
-      </w:pPr>
-      <w:hyperlink w:anchor="cli">
-        <w:r>
-          <w:rPr>
-            <w:rStyle w:val="Hyperlink"/>
-          </w:rPr>
-          <w:t xml:space="preserve">CLI</w:t>
-        </w:r>
-      </w:hyperlink>
-    </w:p>
-    <w:p>
-      <w:pPr>
-        <w:pStyle w:val="Compact"/>
-        <w:numPr>
-          <w:ilvl w:val="1"/>
-          <w:numId w:val="1002"/>
-        </w:numPr>
-      </w:pPr>
-      <w:hyperlink w:anchor="mnemonic-selection-flowchart">
-        <w:r>
-          <w:rPr>
-            <w:rStyle w:val="Hyperlink"/>
-          </w:rPr>
-          <w:t xml:space="preserve">🔄 Mnemonic Selection Flowchart</w:t>
-        </w:r>
-      </w:hyperlink>
-    </w:p>
-    <w:p>
-      <w:pPr>
-        <w:pStyle w:val="Compact"/>
-        <w:numPr>
-          <w:ilvl w:val="1"/>
-          <w:numId w:val="1002"/>
-        </w:numPr>
-      </w:pPr>
-      <w:hyperlink w:anchor="table-of-contents">
-        <w:r>
-          <w:rPr>
-            <w:rStyle w:val="Hyperlink"/>
-          </w:rPr>
-          <w:t xml:space="preserve">Table of Contents</w:t>
-        </w:r>
-      </w:hyperlink>
-    </w:p>
-    <w:p>
-      <w:pPr>
-        <w:pStyle w:val="Compact"/>
-        <w:numPr>
-          <w:ilvl w:val="1"/>
-          <w:numId w:val="1002"/>
-        </w:numPr>
-      </w:pPr>
-      <w:hyperlink w:anchor="problem-solving-techniques">
-        <w:r>
-          <w:rPr>
-            <w:rStyle w:val="Hyperlink"/>
-          </w:rPr>
-          <w:t xml:space="preserve">🧩 Problem Solving Techniques</w:t>
+      <w:hyperlink w:anchor="categorized-index">
+        <w:r>
+          <w:rPr>
+            <w:rStyle w:val="Hyperlink"/>
+          </w:rPr>
+          <w:t xml:space="preserve">📑 Categorized Index</w:t>
         </w:r>
       </w:hyperlink>
     </w:p>
@@ -2845,12 +2739,12 @@
           <w:numId w:val="1004"/>
         </w:numPr>
       </w:pPr>
-      <w:hyperlink w:anchor="prepare">
-        <w:r>
-          <w:rPr>
-            <w:rStyle w:val="Hyperlink"/>
-          </w:rPr>
-          <w:t xml:space="preserve">PREPARE</w:t>
+      <w:hyperlink w:anchor="ops">
+        <w:r>
+          <w:rPr>
+            <w:rStyle w:val="Hyperlink"/>
+          </w:rPr>
+          <w:t xml:space="preserve">🔧 Ops</w:t>
         </w:r>
       </w:hyperlink>
     </w:p>
@@ -2862,12 +2756,12 @@
           <w:numId w:val="1004"/>
         </w:numPr>
       </w:pPr>
-      <w:hyperlink w:anchor="padder">
-        <w:r>
-          <w:rPr>
-            <w:rStyle w:val="Hyperlink"/>
-          </w:rPr>
-          <w:t xml:space="preserve">PADDER</w:t>
+      <w:hyperlink w:anchor="rca-root-cause-analysis">
+        <w:r>
+          <w:rPr>
+            <w:rStyle w:val="Hyperlink"/>
+          </w:rPr>
+          <w:t xml:space="preserve">🔍 RCA (Root Cause Analysis)</w:t>
         </w:r>
       </w:hyperlink>
     </w:p>
@@ -2879,12 +2773,12 @@
           <w:numId w:val="1004"/>
         </w:numPr>
       </w:pPr>
-      <w:hyperlink w:anchor="iceberg">
-        <w:r>
-          <w:rPr>
-            <w:rStyle w:val="Hyperlink"/>
-          </w:rPr>
-          <w:t xml:space="preserve">ICEBERG</w:t>
+      <w:hyperlink w:anchor="systems-design">
+        <w:r>
+          <w:rPr>
+            <w:rStyle w:val="Hyperlink"/>
+          </w:rPr>
+          <w:t xml:space="preserve">🏗️ Systems Design</w:t>
         </w:r>
       </w:hyperlink>
     </w:p>
@@ -2896,12 +2790,12 @@
           <w:numId w:val="1004"/>
         </w:numPr>
       </w:pPr>
-      <w:hyperlink w:anchor="idea">
-        <w:r>
-          <w:rPr>
-            <w:rStyle w:val="Hyperlink"/>
-          </w:rPr>
-          <w:t xml:space="preserve">IDEA</w:t>
+      <w:hyperlink w:anchor="human-factors">
+        <w:r>
+          <w:rPr>
+            <w:rStyle w:val="Hyperlink"/>
+          </w:rPr>
+          <w:t xml:space="preserve">👥 Human Factors</w:t>
         </w:r>
       </w:hyperlink>
     </w:p>
@@ -2913,80 +2807,12 @@
           <w:numId w:val="1004"/>
         </w:numPr>
       </w:pPr>
-      <w:hyperlink w:anchor="X8e9980d9c4ce21ef012162e30a699f691edb98f">
-        <w:r>
-          <w:rPr>
-            <w:rStyle w:val="Hyperlink"/>
-          </w:rPr>
-          <w:t xml:space="preserve">5 Whys</w:t>
-        </w:r>
-      </w:hyperlink>
-    </w:p>
-    <w:p>
-      <w:pPr>
-        <w:pStyle w:val="Compact"/>
-        <w:numPr>
-          <w:ilvl w:val="2"/>
-          <w:numId w:val="1004"/>
-        </w:numPr>
-      </w:pPr>
-      <w:hyperlink w:anchor="ishikawa-fishbone-diagram">
-        <w:r>
-          <w:rPr>
-            <w:rStyle w:val="Hyperlink"/>
-          </w:rPr>
-          <w:t xml:space="preserve">Ishikawa (Fishbone) Diagram</w:t>
-        </w:r>
-      </w:hyperlink>
-    </w:p>
-    <w:p>
-      <w:pPr>
-        <w:pStyle w:val="Compact"/>
-        <w:numPr>
-          <w:ilvl w:val="2"/>
-          <w:numId w:val="1004"/>
-        </w:numPr>
-      </w:pPr>
-      <w:hyperlink w:anchor="Xca622d85a42eb59a37ad21938087cef4d373dc5">
-        <w:r>
-          <w:rPr>
-            <w:rStyle w:val="Hyperlink"/>
-          </w:rPr>
-          <w:t xml:space="preserve">8D Approach</w:t>
-        </w:r>
-      </w:hyperlink>
-    </w:p>
-    <w:p>
-      <w:pPr>
-        <w:pStyle w:val="Compact"/>
-        <w:numPr>
-          <w:ilvl w:val="2"/>
-          <w:numId w:val="1004"/>
-        </w:numPr>
-      </w:pPr>
-      <w:hyperlink w:anchor="a3-problem-solving">
-        <w:r>
-          <w:rPr>
-            <w:rStyle w:val="Hyperlink"/>
-          </w:rPr>
-          <w:t xml:space="preserve">A3 Problem Solving</w:t>
-        </w:r>
-      </w:hyperlink>
-    </w:p>
-    <w:p>
-      <w:pPr>
-        <w:pStyle w:val="Compact"/>
-        <w:numPr>
-          <w:ilvl w:val="2"/>
-          <w:numId w:val="1004"/>
-        </w:numPr>
-      </w:pPr>
-      <w:hyperlink w:anchor="Xb7b74d10f58567b015eb79794e1304041b0d331">
-        <w:r>
-          <w:rPr>
-            <w:rStyle w:val="Hyperlink"/>
-          </w:rPr>
-          <w:t xml:space="preserve">5Ps</w:t>
+      <w:hyperlink w:anchor="personal-life">
+        <w:r>
+          <w:rPr>
+            <w:rStyle w:val="Hyperlink"/>
+          </w:rPr>
+          <w:t xml:space="preserve">🧘 Personal Life</w:t>
         </w:r>
       </w:hyperlink>
     </w:p>
@@ -2995,15 +2821,100 @@
         <w:pStyle w:val="Compact"/>
         <w:numPr>
           <w:ilvl w:val="1"/>
-          <w:numId w:val="1002"/>
+          <w:numId w:val="1003"/>
         </w:numPr>
       </w:pPr>
-      <w:hyperlink w:anchor="problem-analysis">
-        <w:r>
-          <w:rPr>
-            <w:rStyle w:val="Hyperlink"/>
-          </w:rPr>
-          <w:t xml:space="preserve">📊 Problem Analysis</w:t>
+      <w:hyperlink w:anchor="who-uses-this">
+        <w:r>
+          <w:rPr>
+            <w:rStyle w:val="Hyperlink"/>
+          </w:rPr>
+          <w:t xml:space="preserve">Who Uses This?</w:t>
+        </w:r>
+      </w:hyperlink>
+    </w:p>
+    <w:p>
+      <w:pPr>
+        <w:pStyle w:val="Compact"/>
+        <w:numPr>
+          <w:ilvl w:val="1"/>
+          <w:numId w:val="1003"/>
+        </w:numPr>
+      </w:pPr>
+      <w:hyperlink w:anchor="cli">
+        <w:r>
+          <w:rPr>
+            <w:rStyle w:val="Hyperlink"/>
+          </w:rPr>
+          <w:t xml:space="preserve">CLI</w:t>
+        </w:r>
+      </w:hyperlink>
+    </w:p>
+    <w:p>
+      <w:pPr>
+        <w:pStyle w:val="Compact"/>
+        <w:numPr>
+          <w:ilvl w:val="1"/>
+          <w:numId w:val="1003"/>
+        </w:numPr>
+      </w:pPr>
+      <w:hyperlink w:anchor="quick-start-sre--infra">
+        <w:r>
+          <w:rPr>
+            <w:rStyle w:val="Hyperlink"/>
+          </w:rPr>
+          <w:t xml:space="preserve">Quick Start (SRE / Infra)</w:t>
+        </w:r>
+      </w:hyperlink>
+    </w:p>
+    <w:p>
+      <w:pPr>
+        <w:pStyle w:val="Compact"/>
+        <w:numPr>
+          <w:ilvl w:val="1"/>
+          <w:numId w:val="1003"/>
+        </w:numPr>
+      </w:pPr>
+      <w:hyperlink w:anchor="mnemonic-selection-flowchart">
+        <w:r>
+          <w:rPr>
+            <w:rStyle w:val="Hyperlink"/>
+          </w:rPr>
+          <w:t xml:space="preserve">🔄 Mnemonic Selection Flowchart</w:t>
+        </w:r>
+      </w:hyperlink>
+    </w:p>
+    <w:p>
+      <w:pPr>
+        <w:pStyle w:val="Compact"/>
+        <w:numPr>
+          <w:ilvl w:val="1"/>
+          <w:numId w:val="1003"/>
+        </w:numPr>
+      </w:pPr>
+      <w:hyperlink w:anchor="table-of-contents">
+        <w:r>
+          <w:rPr>
+            <w:rStyle w:val="Hyperlink"/>
+          </w:rPr>
+          <w:t xml:space="preserve">Table of Contents</w:t>
+        </w:r>
+      </w:hyperlink>
+    </w:p>
+    <w:p>
+      <w:pPr>
+        <w:pStyle w:val="Compact"/>
+        <w:numPr>
+          <w:ilvl w:val="1"/>
+          <w:numId w:val="1003"/>
+        </w:numPr>
+      </w:pPr>
+      <w:hyperlink w:anchor="problem-solving-techniques">
+        <w:r>
+          <w:rPr>
+            <w:rStyle w:val="Hyperlink"/>
+          </w:rPr>
+          <w:t xml:space="preserve">🧩 Problem Solving Techniques</w:t>
         </w:r>
       </w:hyperlink>
     </w:p>
@@ -3015,12 +2926,12 @@
           <w:numId w:val="1005"/>
         </w:numPr>
       </w:pPr>
-      <w:hyperlink w:anchor="raci">
-        <w:r>
-          <w:rPr>
-            <w:rStyle w:val="Hyperlink"/>
-          </w:rPr>
-          <w:t xml:space="preserve">RACI</w:t>
+      <w:hyperlink w:anchor="prepare">
+        <w:r>
+          <w:rPr>
+            <w:rStyle w:val="Hyperlink"/>
+          </w:rPr>
+          <w:t xml:space="preserve">PREPARE</w:t>
         </w:r>
       </w:hyperlink>
     </w:p>
@@ -3032,12 +2943,12 @@
           <w:numId w:val="1005"/>
         </w:numPr>
       </w:pPr>
-      <w:hyperlink w:anchor="pestel">
-        <w:r>
-          <w:rPr>
-            <w:rStyle w:val="Hyperlink"/>
-          </w:rPr>
-          <w:t xml:space="preserve">PESTEL</w:t>
+      <w:hyperlink w:anchor="padder">
+        <w:r>
+          <w:rPr>
+            <w:rStyle w:val="Hyperlink"/>
+          </w:rPr>
+          <w:t xml:space="preserve">PADDER</w:t>
         </w:r>
       </w:hyperlink>
     </w:p>
@@ -3049,12 +2960,12 @@
           <w:numId w:val="1005"/>
         </w:numPr>
       </w:pPr>
-      <w:hyperlink w:anchor="swot">
-        <w:r>
-          <w:rPr>
-            <w:rStyle w:val="Hyperlink"/>
-          </w:rPr>
-          <w:t xml:space="preserve">SWOT</w:t>
+      <w:hyperlink w:anchor="iceberg">
+        <w:r>
+          <w:rPr>
+            <w:rStyle w:val="Hyperlink"/>
+          </w:rPr>
+          <w:t xml:space="preserve">ICEBERG</w:t>
         </w:r>
       </w:hyperlink>
     </w:p>
@@ -3066,12 +2977,97 @@
           <w:numId w:val="1005"/>
         </w:numPr>
       </w:pPr>
-      <w:hyperlink w:anchor="set-systems-engineering-triangle">
-        <w:r>
-          <w:rPr>
-            <w:rStyle w:val="Hyperlink"/>
-          </w:rPr>
-          <w:t xml:space="preserve">SET (Systems Engineering Triangle)</w:t>
+      <w:hyperlink w:anchor="idea">
+        <w:r>
+          <w:rPr>
+            <w:rStyle w:val="Hyperlink"/>
+          </w:rPr>
+          <w:t xml:space="preserve">IDEA</w:t>
+        </w:r>
+      </w:hyperlink>
+    </w:p>
+    <w:p>
+      <w:pPr>
+        <w:pStyle w:val="Compact"/>
+        <w:numPr>
+          <w:ilvl w:val="2"/>
+          <w:numId w:val="1005"/>
+        </w:numPr>
+      </w:pPr>
+      <w:hyperlink w:anchor="X8e9980d9c4ce21ef012162e30a699f691edb98f">
+        <w:r>
+          <w:rPr>
+            <w:rStyle w:val="Hyperlink"/>
+          </w:rPr>
+          <w:t xml:space="preserve">5 Whys</w:t>
+        </w:r>
+      </w:hyperlink>
+    </w:p>
+    <w:p>
+      <w:pPr>
+        <w:pStyle w:val="Compact"/>
+        <w:numPr>
+          <w:ilvl w:val="2"/>
+          <w:numId w:val="1005"/>
+        </w:numPr>
+      </w:pPr>
+      <w:hyperlink w:anchor="ishikawa-fishbone-diagram">
+        <w:r>
+          <w:rPr>
+            <w:rStyle w:val="Hyperlink"/>
+          </w:rPr>
+          <w:t xml:space="preserve">Ishikawa (Fishbone) Diagram</w:t>
+        </w:r>
+      </w:hyperlink>
+    </w:p>
+    <w:p>
+      <w:pPr>
+        <w:pStyle w:val="Compact"/>
+        <w:numPr>
+          <w:ilvl w:val="2"/>
+          <w:numId w:val="1005"/>
+        </w:numPr>
+      </w:pPr>
+      <w:hyperlink w:anchor="Xca622d85a42eb59a37ad21938087cef4d373dc5">
+        <w:r>
+          <w:rPr>
+            <w:rStyle w:val="Hyperlink"/>
+          </w:rPr>
+          <w:t xml:space="preserve">8D Approach</w:t>
+        </w:r>
+      </w:hyperlink>
+    </w:p>
+    <w:p>
+      <w:pPr>
+        <w:pStyle w:val="Compact"/>
+        <w:numPr>
+          <w:ilvl w:val="2"/>
+          <w:numId w:val="1005"/>
+        </w:numPr>
+      </w:pPr>
+      <w:hyperlink w:anchor="a3-problem-solving">
+        <w:r>
+          <w:rPr>
+            <w:rStyle w:val="Hyperlink"/>
+          </w:rPr>
+          <w:t xml:space="preserve">A3 Problem Solving</w:t>
+        </w:r>
+      </w:hyperlink>
+    </w:p>
+    <w:p>
+      <w:pPr>
+        <w:pStyle w:val="Compact"/>
+        <w:numPr>
+          <w:ilvl w:val="2"/>
+          <w:numId w:val="1005"/>
+        </w:numPr>
+      </w:pPr>
+      <w:hyperlink w:anchor="Xb7b74d10f58567b015eb79794e1304041b0d331">
+        <w:r>
+          <w:rPr>
+            <w:rStyle w:val="Hyperlink"/>
+          </w:rPr>
+          <w:t xml:space="preserve">5Ps</w:t>
         </w:r>
       </w:hyperlink>
     </w:p>
@@ -3080,15 +3076,15 @@
         <w:pStyle w:val="Compact"/>
         <w:numPr>
           <w:ilvl w:val="1"/>
-          <w:numId w:val="1002"/>
+          <w:numId w:val="1003"/>
         </w:numPr>
       </w:pPr>
-      <w:hyperlink w:anchor="problem-resolution-threats">
-        <w:r>
-          <w:rPr>
-            <w:rStyle w:val="Hyperlink"/>
-          </w:rPr>
-          <w:t xml:space="preserve">⚠️ Problem Resolution Threats</w:t>
+      <w:hyperlink w:anchor="problem-analysis">
+        <w:r>
+          <w:rPr>
+            <w:rStyle w:val="Hyperlink"/>
+          </w:rPr>
+          <w:t xml:space="preserve">📊 Problem Analysis</w:t>
         </w:r>
       </w:hyperlink>
     </w:p>
@@ -3100,12 +3096,12 @@
           <w:numId w:val="1006"/>
         </w:numPr>
       </w:pPr>
-      <w:hyperlink w:anchor="dice">
-        <w:r>
-          <w:rPr>
-            <w:rStyle w:val="Hyperlink"/>
-          </w:rPr>
-          <w:t xml:space="preserve">DICE</w:t>
+      <w:hyperlink w:anchor="raci">
+        <w:r>
+          <w:rPr>
+            <w:rStyle w:val="Hyperlink"/>
+          </w:rPr>
+          <w:t xml:space="preserve">RACI</w:t>
         </w:r>
       </w:hyperlink>
     </w:p>
@@ -3117,12 +3113,12 @@
           <w:numId w:val="1006"/>
         </w:numPr>
       </w:pPr>
-      <w:hyperlink w:anchor="fate">
-        <w:r>
-          <w:rPr>
-            <w:rStyle w:val="Hyperlink"/>
-          </w:rPr>
-          <w:t xml:space="preserve">FATE</w:t>
+      <w:hyperlink w:anchor="pestel">
+        <w:r>
+          <w:rPr>
+            <w:rStyle w:val="Hyperlink"/>
+          </w:rPr>
+          <w:t xml:space="preserve">PESTEL</w:t>
         </w:r>
       </w:hyperlink>
     </w:p>
@@ -3134,12 +3130,29 @@
           <w:numId w:val="1006"/>
         </w:numPr>
       </w:pPr>
-      <w:hyperlink w:anchor="pest">
-        <w:r>
-          <w:rPr>
-            <w:rStyle w:val="Hyperlink"/>
-          </w:rPr>
-          <w:t xml:space="preserve">PEST</w:t>
+      <w:hyperlink w:anchor="swot">
+        <w:r>
+          <w:rPr>
+            <w:rStyle w:val="Hyperlink"/>
+          </w:rPr>
+          <w:t xml:space="preserve">SWOT</w:t>
+        </w:r>
+      </w:hyperlink>
+    </w:p>
+    <w:p>
+      <w:pPr>
+        <w:pStyle w:val="Compact"/>
+        <w:numPr>
+          <w:ilvl w:val="2"/>
+          <w:numId w:val="1006"/>
+        </w:numPr>
+      </w:pPr>
+      <w:hyperlink w:anchor="set-systems-engineering-triangle">
+        <w:r>
+          <w:rPr>
+            <w:rStyle w:val="Hyperlink"/>
+          </w:rPr>
+          <w:t xml:space="preserve">SET (Systems Engineering Triangle)</w:t>
         </w:r>
       </w:hyperlink>
     </w:p>
@@ -3148,15 +3161,15 @@
         <w:pStyle w:val="Compact"/>
         <w:numPr>
           <w:ilvl w:val="1"/>
-          <w:numId w:val="1002"/>
+          <w:numId w:val="1003"/>
         </w:numPr>
       </w:pPr>
-      <w:hyperlink w:anchor="communication--conflict">
-        <w:r>
-          <w:rPr>
-            <w:rStyle w:val="Hyperlink"/>
-          </w:rPr>
-          <w:t xml:space="preserve">🗣️ Communication &amp; Conflict</w:t>
+      <w:hyperlink w:anchor="problem-resolution-threats">
+        <w:r>
+          <w:rPr>
+            <w:rStyle w:val="Hyperlink"/>
+          </w:rPr>
+          <w:t xml:space="preserve">⚠️ Problem Resolution Threats</w:t>
         </w:r>
       </w:hyperlink>
     </w:p>
@@ -3168,12 +3181,12 @@
           <w:numId w:val="1007"/>
         </w:numPr>
       </w:pPr>
-      <w:hyperlink w:anchor="breathe">
-        <w:r>
-          <w:rPr>
-            <w:rStyle w:val="Hyperlink"/>
-          </w:rPr>
-          <w:t xml:space="preserve">BREATHE</w:t>
+      <w:hyperlink w:anchor="dice">
+        <w:r>
+          <w:rPr>
+            <w:rStyle w:val="Hyperlink"/>
+          </w:rPr>
+          <w:t xml:space="preserve">DICE</w:t>
         </w:r>
       </w:hyperlink>
     </w:p>
@@ -3185,12 +3198,12 @@
           <w:numId w:val="1007"/>
         </w:numPr>
       </w:pPr>
-      <w:hyperlink w:anchor="pause">
-        <w:r>
-          <w:rPr>
-            <w:rStyle w:val="Hyperlink"/>
-          </w:rPr>
-          <w:t xml:space="preserve">PAUSE</w:t>
+      <w:hyperlink w:anchor="fate">
+        <w:r>
+          <w:rPr>
+            <w:rStyle w:val="Hyperlink"/>
+          </w:rPr>
+          <w:t xml:space="preserve">FATE</w:t>
         </w:r>
       </w:hyperlink>
     </w:p>
@@ -3202,12 +3215,12 @@
           <w:numId w:val="1007"/>
         </w:numPr>
       </w:pPr>
-      <w:hyperlink w:anchor="wait">
-        <w:r>
-          <w:rPr>
-            <w:rStyle w:val="Hyperlink"/>
-          </w:rPr>
-          <w:t xml:space="preserve">WAIT</w:t>
+      <w:hyperlink w:anchor="pest">
+        <w:r>
+          <w:rPr>
+            <w:rStyle w:val="Hyperlink"/>
+          </w:rPr>
+          <w:t xml:space="preserve">PEST</w:t>
         </w:r>
       </w:hyperlink>
     </w:p>
@@ -3216,15 +3229,15 @@
         <w:pStyle w:val="Compact"/>
         <w:numPr>
           <w:ilvl w:val="1"/>
-          <w:numId w:val="1002"/>
+          <w:numId w:val="1003"/>
         </w:numPr>
       </w:pPr>
-      <w:hyperlink w:anchor="stress--resilience">
-        <w:r>
-          <w:rPr>
-            <w:rStyle w:val="Hyperlink"/>
-          </w:rPr>
-          <w:t xml:space="preserve">🧘 Stress &amp; Resilience</w:t>
+      <w:hyperlink w:anchor="communication--conflict">
+        <w:r>
+          <w:rPr>
+            <w:rStyle w:val="Hyperlink"/>
+          </w:rPr>
+          <w:t xml:space="preserve">🗣️ Communication &amp; Conflict</w:t>
         </w:r>
       </w:hyperlink>
     </w:p>
@@ -3236,12 +3249,12 @@
           <w:numId w:val="1008"/>
         </w:numPr>
       </w:pPr>
-      <w:hyperlink w:anchor="pace">
-        <w:r>
-          <w:rPr>
-            <w:rStyle w:val="Hyperlink"/>
-          </w:rPr>
-          <w:t xml:space="preserve">PACE</w:t>
+      <w:hyperlink w:anchor="breathe">
+        <w:r>
+          <w:rPr>
+            <w:rStyle w:val="Hyperlink"/>
+          </w:rPr>
+          <w:t xml:space="preserve">BREATHE</w:t>
         </w:r>
       </w:hyperlink>
     </w:p>
@@ -3253,12 +3266,12 @@
           <w:numId w:val="1008"/>
         </w:numPr>
       </w:pPr>
-      <w:hyperlink w:anchor="stop">
-        <w:r>
-          <w:rPr>
-            <w:rStyle w:val="Hyperlink"/>
-          </w:rPr>
-          <w:t xml:space="preserve">STOP</w:t>
+      <w:hyperlink w:anchor="pause">
+        <w:r>
+          <w:rPr>
+            <w:rStyle w:val="Hyperlink"/>
+          </w:rPr>
+          <w:t xml:space="preserve">PAUSE</w:t>
         </w:r>
       </w:hyperlink>
     </w:p>
@@ -3270,46 +3283,12 @@
           <w:numId w:val="1008"/>
         </w:numPr>
       </w:pPr>
-      <w:hyperlink w:anchor="aries">
-        <w:r>
-          <w:rPr>
-            <w:rStyle w:val="Hyperlink"/>
-          </w:rPr>
-          <w:t xml:space="preserve">ARIES</w:t>
-        </w:r>
-      </w:hyperlink>
-    </w:p>
-    <w:p>
-      <w:pPr>
-        <w:pStyle w:val="Compact"/>
-        <w:numPr>
-          <w:ilvl w:val="2"/>
-          <w:numId w:val="1008"/>
-        </w:numPr>
-      </w:pPr>
-      <w:hyperlink w:anchor="calm">
-        <w:r>
-          <w:rPr>
-            <w:rStyle w:val="Hyperlink"/>
-          </w:rPr>
-          <w:t xml:space="preserve">CALM</w:t>
-        </w:r>
-      </w:hyperlink>
-    </w:p>
-    <w:p>
-      <w:pPr>
-        <w:pStyle w:val="Compact"/>
-        <w:numPr>
-          <w:ilvl w:val="2"/>
-          <w:numId w:val="1008"/>
-        </w:numPr>
-      </w:pPr>
-      <w:hyperlink w:anchor="shine">
-        <w:r>
-          <w:rPr>
-            <w:rStyle w:val="Hyperlink"/>
-          </w:rPr>
-          <w:t xml:space="preserve">SHINE</w:t>
+      <w:hyperlink w:anchor="wait">
+        <w:r>
+          <w:rPr>
+            <w:rStyle w:val="Hyperlink"/>
+          </w:rPr>
+          <w:t xml:space="preserve">WAIT</w:t>
         </w:r>
       </w:hyperlink>
     </w:p>
@@ -3318,15 +3297,15 @@
         <w:pStyle w:val="Compact"/>
         <w:numPr>
           <w:ilvl w:val="1"/>
-          <w:numId w:val="1002"/>
+          <w:numId w:val="1003"/>
         </w:numPr>
       </w:pPr>
-      <w:hyperlink w:anchor="infrastructure--systems-engineering">
-        <w:r>
-          <w:rPr>
-            <w:rStyle w:val="Hyperlink"/>
-          </w:rPr>
-          <w:t xml:space="preserve">🔧 Infrastructure &amp; Systems Engineering</w:t>
+      <w:hyperlink w:anchor="stress--resilience">
+        <w:r>
+          <w:rPr>
+            <w:rStyle w:val="Hyperlink"/>
+          </w:rPr>
+          <w:t xml:space="preserve">🧘 Stress &amp; Resilience</w:t>
         </w:r>
       </w:hyperlink>
     </w:p>
@@ -3338,12 +3317,12 @@
           <w:numId w:val="1009"/>
         </w:numPr>
       </w:pPr>
-      <w:hyperlink w:anchor="trace-network-troubleshooting">
-        <w:r>
-          <w:rPr>
-            <w:rStyle w:val="Hyperlink"/>
-          </w:rPr>
-          <w:t xml:space="preserve">TRACE (Network Troubleshooting)</w:t>
+      <w:hyperlink w:anchor="pace">
+        <w:r>
+          <w:rPr>
+            <w:rStyle w:val="Hyperlink"/>
+          </w:rPr>
+          <w:t xml:space="preserve">PACE</w:t>
         </w:r>
       </w:hyperlink>
     </w:p>
@@ -3355,12 +3334,12 @@
           <w:numId w:val="1009"/>
         </w:numPr>
       </w:pPr>
-      <w:hyperlink w:anchor="scale-infrastructure-design">
-        <w:r>
-          <w:rPr>
-            <w:rStyle w:val="Hyperlink"/>
-          </w:rPr>
-          <w:t xml:space="preserve">SCALE (Infrastructure Design)</w:t>
+      <w:hyperlink w:anchor="stop">
+        <w:r>
+          <w:rPr>
+            <w:rStyle w:val="Hyperlink"/>
+          </w:rPr>
+          <w:t xml:space="preserve">STOP</w:t>
         </w:r>
       </w:hyperlink>
     </w:p>
@@ -3372,12 +3351,46 @@
           <w:numId w:val="1009"/>
         </w:numPr>
       </w:pPr>
-      <w:hyperlink w:anchor="debug-code--system-analysis">
-        <w:r>
-          <w:rPr>
-            <w:rStyle w:val="Hyperlink"/>
-          </w:rPr>
-          <w:t xml:space="preserve">DEBUG (Code &amp; System Analysis)</w:t>
+      <w:hyperlink w:anchor="aries">
+        <w:r>
+          <w:rPr>
+            <w:rStyle w:val="Hyperlink"/>
+          </w:rPr>
+          <w:t xml:space="preserve">ARIES</w:t>
+        </w:r>
+      </w:hyperlink>
+    </w:p>
+    <w:p>
+      <w:pPr>
+        <w:pStyle w:val="Compact"/>
+        <w:numPr>
+          <w:ilvl w:val="2"/>
+          <w:numId w:val="1009"/>
+        </w:numPr>
+      </w:pPr>
+      <w:hyperlink w:anchor="calm">
+        <w:r>
+          <w:rPr>
+            <w:rStyle w:val="Hyperlink"/>
+          </w:rPr>
+          <w:t xml:space="preserve">CALM</w:t>
+        </w:r>
+      </w:hyperlink>
+    </w:p>
+    <w:p>
+      <w:pPr>
+        <w:pStyle w:val="Compact"/>
+        <w:numPr>
+          <w:ilvl w:val="2"/>
+          <w:numId w:val="1009"/>
+        </w:numPr>
+      </w:pPr>
+      <w:hyperlink w:anchor="shine">
+        <w:r>
+          <w:rPr>
+            <w:rStyle w:val="Hyperlink"/>
+          </w:rPr>
+          <w:t xml:space="preserve">SHINE</w:t>
         </w:r>
       </w:hyperlink>
     </w:p>
@@ -3386,15 +3399,15 @@
         <w:pStyle w:val="Compact"/>
         <w:numPr>
           <w:ilvl w:val="1"/>
-          <w:numId w:val="1002"/>
+          <w:numId w:val="1003"/>
         </w:numPr>
       </w:pPr>
-      <w:hyperlink w:anchor="proven-mnemonic-pipelines">
-        <w:r>
-          <w:rPr>
-            <w:rStyle w:val="Hyperlink"/>
-          </w:rPr>
-          <w:t xml:space="preserve">🔗 Proven Mnemonic Pipelines</w:t>
+      <w:hyperlink w:anchor="infrastructure--systems-engineering">
+        <w:r>
+          <w:rPr>
+            <w:rStyle w:val="Hyperlink"/>
+          </w:rPr>
+          <w:t xml:space="preserve">🔧 Infrastructure &amp; Systems Engineering</w:t>
         </w:r>
       </w:hyperlink>
     </w:p>
@@ -3406,14 +3419,12 @@
           <w:numId w:val="1010"/>
         </w:numPr>
       </w:pPr>
-      <w:hyperlink w:anchor="X55df2f206ba710f595b5136df5ae7de81a2c8c9">
-        <w:r>
-          <w:rPr>
-            <w:rStyle w:val="Hyperlink"/>
-            <w:b/>
-            <w:bCs/>
-          </w:rPr>
-          <w:t xml:space="preserve">1. CRISIS RESPONSE CHAIN</w:t>
+      <w:hyperlink w:anchor="trace-network-troubleshooting">
+        <w:r>
+          <w:rPr>
+            <w:rStyle w:val="Hyperlink"/>
+          </w:rPr>
+          <w:t xml:space="preserve">TRACE (Network Troubleshooting)</w:t>
         </w:r>
       </w:hyperlink>
     </w:p>
@@ -3425,14 +3436,12 @@
           <w:numId w:val="1010"/>
         </w:numPr>
       </w:pPr>
-      <w:hyperlink w:anchor="Xd4bb5831e1122eba446a86473d2f9b2b6afc8f7">
-        <w:r>
-          <w:rPr>
-            <w:rStyle w:val="Hyperlink"/>
-            <w:b/>
-            <w:bCs/>
-          </w:rPr>
-          <w:t xml:space="preserve">2. CONFLICT RESOLUTION CHAIN</w:t>
+      <w:hyperlink w:anchor="scale-infrastructure-design">
+        <w:r>
+          <w:rPr>
+            <w:rStyle w:val="Hyperlink"/>
+          </w:rPr>
+          <w:t xml:space="preserve">SCALE (Infrastructure Design)</w:t>
         </w:r>
       </w:hyperlink>
     </w:p>
@@ -3444,71 +3453,12 @@
           <w:numId w:val="1010"/>
         </w:numPr>
       </w:pPr>
-      <w:hyperlink w:anchor="Xa6a9995b90583db2e1c4ab8d4372e13616ebb78">
-        <w:r>
-          <w:rPr>
-            <w:rStyle w:val="Hyperlink"/>
-            <w:b/>
-            <w:bCs/>
-          </w:rPr>
-          <w:t xml:space="preserve">3. ROOT CAUSE INVESTIGATION CHAIN</w:t>
-        </w:r>
-      </w:hyperlink>
-    </w:p>
-    <w:p>
-      <w:pPr>
-        <w:pStyle w:val="Compact"/>
-        <w:numPr>
-          <w:ilvl w:val="2"/>
-          <w:numId w:val="1010"/>
-        </w:numPr>
-      </w:pPr>
-      <w:hyperlink w:anchor="Xc0ec1214d82d3b757f10004b5ec090278760322">
-        <w:r>
-          <w:rPr>
-            <w:rStyle w:val="Hyperlink"/>
-            <w:b/>
-            <w:bCs/>
-          </w:rPr>
-          <w:t xml:space="preserve">4. STRATEGIC DESIGN CHAIN</w:t>
-        </w:r>
-      </w:hyperlink>
-    </w:p>
-    <w:p>
-      <w:pPr>
-        <w:pStyle w:val="Compact"/>
-        <w:numPr>
-          <w:ilvl w:val="2"/>
-          <w:numId w:val="1010"/>
-        </w:numPr>
-      </w:pPr>
-      <w:hyperlink w:anchor="X2ab2668a47b2e3e108e5c9f032c2949d39bac45">
-        <w:r>
-          <w:rPr>
-            <w:rStyle w:val="Hyperlink"/>
-            <w:b/>
-            <w:bCs/>
-          </w:rPr>
-          <w:t xml:space="preserve">5. STRESS BURNOUT RECOVERY CHAIN</w:t>
-        </w:r>
-      </w:hyperlink>
-    </w:p>
-    <w:p>
-      <w:pPr>
-        <w:pStyle w:val="Compact"/>
-        <w:numPr>
-          <w:ilvl w:val="2"/>
-          <w:numId w:val="1010"/>
-        </w:numPr>
-      </w:pPr>
-      <w:hyperlink w:anchor="X2e8800b6f2699963b9016be427305f13b4c28b0">
-        <w:r>
-          <w:rPr>
-            <w:rStyle w:val="Hyperlink"/>
-            <w:b/>
-            <w:bCs/>
-          </w:rPr>
-          <w:t xml:space="preserve">6. RAPID TRIAGE CHAIN</w:t>
+      <w:hyperlink w:anchor="debug-code--system-analysis">
+        <w:r>
+          <w:rPr>
+            <w:rStyle w:val="Hyperlink"/>
+          </w:rPr>
+          <w:t xml:space="preserve">DEBUG (Code &amp; System Analysis)</w:t>
         </w:r>
       </w:hyperlink>
     </w:p>
@@ -3517,100 +3467,15 @@
         <w:pStyle w:val="Compact"/>
         <w:numPr>
           <w:ilvl w:val="1"/>
-          <w:numId w:val="1002"/>
+          <w:numId w:val="1003"/>
         </w:numPr>
       </w:pPr>
-      <w:hyperlink w:anchor="pipeline-selection-matrix">
-        <w:r>
-          <w:rPr>
-            <w:rStyle w:val="Hyperlink"/>
-          </w:rPr>
-          <w:t xml:space="preserve">📊 Pipeline Selection Matrix</w:t>
-        </w:r>
-      </w:hyperlink>
-    </w:p>
-    <w:p>
-      <w:pPr>
-        <w:pStyle w:val="Compact"/>
-        <w:numPr>
-          <w:ilvl w:val="1"/>
-          <w:numId w:val="1002"/>
-        </w:numPr>
-      </w:pPr>
-      <w:hyperlink w:anchor="pro-tips">
-        <w:r>
-          <w:rPr>
-            <w:rStyle w:val="Hyperlink"/>
-          </w:rPr>
-          <w:t xml:space="preserve">💡 Pro Tips</w:t>
-        </w:r>
-      </w:hyperlink>
-    </w:p>
-    <w:p>
-      <w:pPr>
-        <w:pStyle w:val="Compact"/>
-        <w:numPr>
-          <w:ilvl w:val="1"/>
-          <w:numId w:val="1002"/>
-        </w:numPr>
-      </w:pPr>
-      <w:hyperlink w:anchor="common-mistakes">
-        <w:r>
-          <w:rPr>
-            <w:rStyle w:val="Hyperlink"/>
-          </w:rPr>
-          <w:t xml:space="preserve">🎯 Common Mistakes</w:t>
-        </w:r>
-      </w:hyperlink>
-    </w:p>
-    <w:p>
-      <w:pPr>
-        <w:pStyle w:val="Compact"/>
-        <w:numPr>
-          <w:ilvl w:val="1"/>
-          <w:numId w:val="1002"/>
-        </w:numPr>
-      </w:pPr>
-      <w:hyperlink w:anchor="contributing">
-        <w:r>
-          <w:rPr>
-            <w:rStyle w:val="Hyperlink"/>
-          </w:rPr>
-          <w:t xml:space="preserve">🤝 Contributing</w:t>
-        </w:r>
-      </w:hyperlink>
-    </w:p>
-    <w:p>
-      <w:pPr>
-        <w:pStyle w:val="Compact"/>
-        <w:numPr>
-          <w:ilvl w:val="1"/>
-          <w:numId w:val="1002"/>
-        </w:numPr>
-      </w:pPr>
-      <w:hyperlink w:anchor="release-versions">
-        <w:r>
-          <w:rPr>
-            <w:rStyle w:val="Hyperlink"/>
-          </w:rPr>
-          <w:t xml:space="preserve">📥 Release Versions</w:t>
-        </w:r>
-      </w:hyperlink>
-    </w:p>
-    <w:p>
-      <w:pPr>
-        <w:pStyle w:val="Compact"/>
-        <w:numPr>
-          <w:ilvl w:val="1"/>
-          <w:numId w:val="1002"/>
-        </w:numPr>
-      </w:pPr>
-      <w:hyperlink w:anchor="sources--references">
-        <w:r>
-          <w:rPr>
-            <w:rStyle w:val="Hyperlink"/>
-          </w:rPr>
-          <w:t xml:space="preserve">Sources &amp; References</w:t>
+      <w:hyperlink w:anchor="proven-mnemonic-pipelines">
+        <w:r>
+          <w:rPr>
+            <w:rStyle w:val="Hyperlink"/>
+          </w:rPr>
+          <w:t xml:space="preserve">🔗 Proven Mnemonic Pipelines</w:t>
         </w:r>
       </w:hyperlink>
     </w:p>
@@ -3622,12 +3487,14 @@
           <w:numId w:val="1011"/>
         </w:numPr>
       </w:pPr>
-      <w:hyperlink w:anchor="problem-solving-methodologies">
-        <w:r>
-          <w:rPr>
-            <w:rStyle w:val="Hyperlink"/>
-          </w:rPr>
-          <w:t xml:space="preserve">Problem-Solving Methodologies</w:t>
+      <w:hyperlink w:anchor="X55df2f206ba710f595b5136df5ae7de81a2c8c9">
+        <w:r>
+          <w:rPr>
+            <w:rStyle w:val="Hyperlink"/>
+            <w:b/>
+            <w:bCs/>
+          </w:rPr>
+          <w:t xml:space="preserve">1. CRISIS RESPONSE CHAIN</w:t>
         </w:r>
       </w:hyperlink>
     </w:p>
@@ -3639,12 +3506,14 @@
           <w:numId w:val="1011"/>
         </w:numPr>
       </w:pPr>
-      <w:hyperlink w:anchor="strategic--analysis-frameworks">
-        <w:r>
-          <w:rPr>
-            <w:rStyle w:val="Hyperlink"/>
-          </w:rPr>
-          <w:t xml:space="preserve">Strategic &amp; Analysis Frameworks</w:t>
+      <w:hyperlink w:anchor="Xd4bb5831e1122eba446a86473d2f9b2b6afc8f7">
+        <w:r>
+          <w:rPr>
+            <w:rStyle w:val="Hyperlink"/>
+            <w:b/>
+            <w:bCs/>
+          </w:rPr>
+          <w:t xml:space="preserve">2. CONFLICT RESOLUTION CHAIN</w:t>
         </w:r>
       </w:hyperlink>
     </w:p>
@@ -3656,12 +3525,14 @@
           <w:numId w:val="1011"/>
         </w:numPr>
       </w:pPr>
-      <w:hyperlink w:anchor="problem-resolution-threats--triage">
-        <w:r>
-          <w:rPr>
-            <w:rStyle w:val="Hyperlink"/>
-          </w:rPr>
-          <w:t xml:space="preserve">Problem Resolution Threats &amp; Triage</w:t>
+      <w:hyperlink w:anchor="Xa6a9995b90583db2e1c4ab8d4372e13616ebb78">
+        <w:r>
+          <w:rPr>
+            <w:rStyle w:val="Hyperlink"/>
+            <w:b/>
+            <w:bCs/>
+          </w:rPr>
+          <w:t xml:space="preserve">3. ROOT CAUSE INVESTIGATION CHAIN</w:t>
         </w:r>
       </w:hyperlink>
     </w:p>
@@ -3673,6 +3544,216 @@
           <w:numId w:val="1011"/>
         </w:numPr>
       </w:pPr>
+      <w:hyperlink w:anchor="Xc0ec1214d82d3b757f10004b5ec090278760322">
+        <w:r>
+          <w:rPr>
+            <w:rStyle w:val="Hyperlink"/>
+            <w:b/>
+            <w:bCs/>
+          </w:rPr>
+          <w:t xml:space="preserve">4. STRATEGIC DESIGN CHAIN</w:t>
+        </w:r>
+      </w:hyperlink>
+    </w:p>
+    <w:p>
+      <w:pPr>
+        <w:pStyle w:val="Compact"/>
+        <w:numPr>
+          <w:ilvl w:val="2"/>
+          <w:numId w:val="1011"/>
+        </w:numPr>
+      </w:pPr>
+      <w:hyperlink w:anchor="X2ab2668a47b2e3e108e5c9f032c2949d39bac45">
+        <w:r>
+          <w:rPr>
+            <w:rStyle w:val="Hyperlink"/>
+            <w:b/>
+            <w:bCs/>
+          </w:rPr>
+          <w:t xml:space="preserve">5. STRESS BURNOUT RECOVERY CHAIN</w:t>
+        </w:r>
+      </w:hyperlink>
+    </w:p>
+    <w:p>
+      <w:pPr>
+        <w:pStyle w:val="Compact"/>
+        <w:numPr>
+          <w:ilvl w:val="2"/>
+          <w:numId w:val="1011"/>
+        </w:numPr>
+      </w:pPr>
+      <w:hyperlink w:anchor="X2e8800b6f2699963b9016be427305f13b4c28b0">
+        <w:r>
+          <w:rPr>
+            <w:rStyle w:val="Hyperlink"/>
+            <w:b/>
+            <w:bCs/>
+          </w:rPr>
+          <w:t xml:space="preserve">6. RAPID TRIAGE CHAIN</w:t>
+        </w:r>
+      </w:hyperlink>
+    </w:p>
+    <w:p>
+      <w:pPr>
+        <w:pStyle w:val="Compact"/>
+        <w:numPr>
+          <w:ilvl w:val="1"/>
+          <w:numId w:val="1003"/>
+        </w:numPr>
+      </w:pPr>
+      <w:hyperlink w:anchor="pipeline-selection-matrix">
+        <w:r>
+          <w:rPr>
+            <w:rStyle w:val="Hyperlink"/>
+          </w:rPr>
+          <w:t xml:space="preserve">📊 Pipeline Selection Matrix</w:t>
+        </w:r>
+      </w:hyperlink>
+    </w:p>
+    <w:p>
+      <w:pPr>
+        <w:pStyle w:val="Compact"/>
+        <w:numPr>
+          <w:ilvl w:val="1"/>
+          <w:numId w:val="1003"/>
+        </w:numPr>
+      </w:pPr>
+      <w:hyperlink w:anchor="pro-tips">
+        <w:r>
+          <w:rPr>
+            <w:rStyle w:val="Hyperlink"/>
+          </w:rPr>
+          <w:t xml:space="preserve">💡 Pro Tips</w:t>
+        </w:r>
+      </w:hyperlink>
+    </w:p>
+    <w:p>
+      <w:pPr>
+        <w:pStyle w:val="Compact"/>
+        <w:numPr>
+          <w:ilvl w:val="1"/>
+          <w:numId w:val="1003"/>
+        </w:numPr>
+      </w:pPr>
+      <w:hyperlink w:anchor="common-mistakes">
+        <w:r>
+          <w:rPr>
+            <w:rStyle w:val="Hyperlink"/>
+          </w:rPr>
+          <w:t xml:space="preserve">🎯 Common Mistakes</w:t>
+        </w:r>
+      </w:hyperlink>
+    </w:p>
+    <w:p>
+      <w:pPr>
+        <w:pStyle w:val="Compact"/>
+        <w:numPr>
+          <w:ilvl w:val="1"/>
+          <w:numId w:val="1003"/>
+        </w:numPr>
+      </w:pPr>
+      <w:hyperlink w:anchor="contributing">
+        <w:r>
+          <w:rPr>
+            <w:rStyle w:val="Hyperlink"/>
+          </w:rPr>
+          <w:t xml:space="preserve">🤝 Contributing</w:t>
+        </w:r>
+      </w:hyperlink>
+    </w:p>
+    <w:p>
+      <w:pPr>
+        <w:pStyle w:val="Compact"/>
+        <w:numPr>
+          <w:ilvl w:val="1"/>
+          <w:numId w:val="1003"/>
+        </w:numPr>
+      </w:pPr>
+      <w:hyperlink w:anchor="release-versions">
+        <w:r>
+          <w:rPr>
+            <w:rStyle w:val="Hyperlink"/>
+          </w:rPr>
+          <w:t xml:space="preserve">📥 Release Versions</w:t>
+        </w:r>
+      </w:hyperlink>
+    </w:p>
+    <w:p>
+      <w:pPr>
+        <w:pStyle w:val="Compact"/>
+        <w:numPr>
+          <w:ilvl w:val="1"/>
+          <w:numId w:val="1003"/>
+        </w:numPr>
+      </w:pPr>
+      <w:hyperlink w:anchor="sources--references">
+        <w:r>
+          <w:rPr>
+            <w:rStyle w:val="Hyperlink"/>
+          </w:rPr>
+          <w:t xml:space="preserve">Sources &amp; References</w:t>
+        </w:r>
+      </w:hyperlink>
+    </w:p>
+    <w:p>
+      <w:pPr>
+        <w:pStyle w:val="Compact"/>
+        <w:numPr>
+          <w:ilvl w:val="2"/>
+          <w:numId w:val="1012"/>
+        </w:numPr>
+      </w:pPr>
+      <w:hyperlink w:anchor="problem-solving-methodologies">
+        <w:r>
+          <w:rPr>
+            <w:rStyle w:val="Hyperlink"/>
+          </w:rPr>
+          <w:t xml:space="preserve">Problem-Solving Methodologies</w:t>
+        </w:r>
+      </w:hyperlink>
+    </w:p>
+    <w:p>
+      <w:pPr>
+        <w:pStyle w:val="Compact"/>
+        <w:numPr>
+          <w:ilvl w:val="2"/>
+          <w:numId w:val="1012"/>
+        </w:numPr>
+      </w:pPr>
+      <w:hyperlink w:anchor="strategic--analysis-frameworks">
+        <w:r>
+          <w:rPr>
+            <w:rStyle w:val="Hyperlink"/>
+          </w:rPr>
+          <w:t xml:space="preserve">Strategic &amp; Analysis Frameworks</w:t>
+        </w:r>
+      </w:hyperlink>
+    </w:p>
+    <w:p>
+      <w:pPr>
+        <w:pStyle w:val="Compact"/>
+        <w:numPr>
+          <w:ilvl w:val="2"/>
+          <w:numId w:val="1012"/>
+        </w:numPr>
+      </w:pPr>
+      <w:hyperlink w:anchor="problem-resolution-threats--triage">
+        <w:r>
+          <w:rPr>
+            <w:rStyle w:val="Hyperlink"/>
+          </w:rPr>
+          <w:t xml:space="preserve">Problem Resolution Threats &amp; Triage</w:t>
+        </w:r>
+      </w:hyperlink>
+    </w:p>
+    <w:p>
+      <w:pPr>
+        <w:pStyle w:val="Compact"/>
+        <w:numPr>
+          <w:ilvl w:val="2"/>
+          <w:numId w:val="1012"/>
+        </w:numPr>
+      </w:pPr>
       <w:hyperlink w:anchor="X1a0179dde52fdec6de955ca1c40d3c4d6f564a8">
         <w:r>
           <w:rPr>
@@ -3682,8 +3763,8 @@
         </w:r>
       </w:hyperlink>
     </w:p>
-    <w:bookmarkEnd w:id="21"/>
-    <w:bookmarkStart w:id="27" w:name="problem-solving-techniques"/>
+    <w:bookmarkEnd w:id="23"/>
+    <w:bookmarkStart w:id="29" w:name="problem-solving-techniques"/>
     <w:p>
       <w:pPr>
         <w:pStyle w:val="Heading2"/>
@@ -3701,110 +3782,25 @@
           <w:i/>
           <w:iCs/>
         </w:rPr>
-        <w:t xml:space="preserve">Start here for systematic approaches to complex problems.</w:t>
-      </w:r>
-    </w:p>
-    <w:bookmarkStart w:id="22" w:name="prepare"/>
-    <w:p>
-      <w:pPr>
-        <w:pStyle w:val="Heading3"/>
-      </w:pPr>
-      <w:r>
-        <w:t xml:space="preserve">PREPARE</w:t>
-      </w:r>
-    </w:p>
-    <w:p>
-      <w:pPr>
-        <w:pStyle w:val="SourceCode"/>
-      </w:pPr>
-      <w:r>
-        <w:rPr>
-          <w:rStyle w:val="VerbatimChar"/>
-        </w:rPr>
-        <w:t xml:space="preserve">P - Prioritize the problem  </w:t>
-      </w:r>
-      <w:r>
-        <w:br/>
-      </w:r>
-      <w:r>
-        <w:rPr>
-          <w:rStyle w:val="VerbatimChar"/>
-        </w:rPr>
-        <w:t xml:space="preserve">R - Research &amp; brainstorm solutions  </w:t>
-      </w:r>
-      <w:r>
-        <w:br/>
-      </w:r>
-      <w:r>
-        <w:rPr>
-          <w:rStyle w:val="VerbatimChar"/>
-        </w:rPr>
-        <w:t xml:space="preserve">E - Evaluate available options  </w:t>
-      </w:r>
-      <w:r>
-        <w:br/>
-      </w:r>
-      <w:r>
-        <w:rPr>
-          <w:rStyle w:val="VerbatimChar"/>
-        </w:rPr>
-        <w:t xml:space="preserve">P - Plan steps to resolve issue  </w:t>
-      </w:r>
-      <w:r>
-        <w:br/>
-      </w:r>
-      <w:r>
-        <w:rPr>
-          <w:rStyle w:val="VerbatimChar"/>
-        </w:rPr>
-        <w:t xml:space="preserve">A - Act on the plan  </w:t>
-      </w:r>
-      <w:r>
-        <w:br/>
-      </w:r>
-      <w:r>
-        <w:rPr>
-          <w:rStyle w:val="VerbatimChar"/>
-        </w:rPr>
-        <w:t xml:space="preserve">R - Reflect on results  </w:t>
-      </w:r>
-      <w:r>
-        <w:br/>
-      </w:r>
-      <w:r>
-        <w:rPr>
-          <w:rStyle w:val="VerbatimChar"/>
-        </w:rPr>
-        <w:t xml:space="preserve">E - Evaluate and revise plan as necessary  </w:t>
-      </w:r>
-    </w:p>
-    <w:p>
-      <w:pPr>
-        <w:pStyle w:val="FirstParagraph"/>
-      </w:pPr>
-      <w:r>
-        <w:rPr>
-          <w:b/>
-          <w:bCs/>
-        </w:rPr>
-        <w:t xml:space="preserve">💡 When to use:</w:t>
-      </w:r>
-      <w:r>
-        <w:t xml:space="preserve"> </w:t>
-      </w:r>
-      <w:r>
-        <w:t xml:space="preserve">Strategic planning (1–2 hr); medium complexity, multi-stakeholder; needs structure.</w:t>
-      </w:r>
-      <w:r>
-        <w:t xml:space="preserve"> </w:t>
+        <w:t xml:space="preserve">Full definitions for each mnemonic;</w:t>
       </w:r>
       <w:r>
         <w:rPr>
           <w:i/>
           <w:iCs/>
         </w:rPr>
-        <w:t xml:space="preserve">Not for outages—use</w:t>
-      </w:r>
+        <w:t xml:space="preserve"> </w:t>
+      </w:r>
+      <w:hyperlink w:anchor="categorized-index">
+        <w:r>
+          <w:rPr>
+            <w:rStyle w:val="Hyperlink"/>
+            <w:i/>
+            <w:iCs/>
+          </w:rPr>
+          <w:t xml:space="preserve">Categorized Index</w:t>
+        </w:r>
+      </w:hyperlink>
       <w:r>
         <w:rPr>
           <w:i/>
@@ -3812,6 +3808,122 @@
         </w:rPr>
         <w:t xml:space="preserve"> </w:t>
       </w:r>
+      <w:r>
+        <w:rPr>
+          <w:i/>
+          <w:iCs/>
+        </w:rPr>
+        <w:t xml:space="preserve">above to browse by use case.</w:t>
+      </w:r>
+    </w:p>
+    <w:bookmarkStart w:id="24" w:name="prepare"/>
+    <w:p>
+      <w:pPr>
+        <w:pStyle w:val="Heading3"/>
+      </w:pPr>
+      <w:r>
+        <w:t xml:space="preserve">PREPARE</w:t>
+      </w:r>
+    </w:p>
+    <w:p>
+      <w:pPr>
+        <w:pStyle w:val="SourceCode"/>
+      </w:pPr>
+      <w:r>
+        <w:rPr>
+          <w:rStyle w:val="VerbatimChar"/>
+        </w:rPr>
+        <w:t xml:space="preserve">P - Prioritize the problem  </w:t>
+      </w:r>
+      <w:r>
+        <w:br/>
+      </w:r>
+      <w:r>
+        <w:rPr>
+          <w:rStyle w:val="VerbatimChar"/>
+        </w:rPr>
+        <w:t xml:space="preserve">R - Research &amp; brainstorm solutions  </w:t>
+      </w:r>
+      <w:r>
+        <w:br/>
+      </w:r>
+      <w:r>
+        <w:rPr>
+          <w:rStyle w:val="VerbatimChar"/>
+        </w:rPr>
+        <w:t xml:space="preserve">E - Evaluate available options  </w:t>
+      </w:r>
+      <w:r>
+        <w:br/>
+      </w:r>
+      <w:r>
+        <w:rPr>
+          <w:rStyle w:val="VerbatimChar"/>
+        </w:rPr>
+        <w:t xml:space="preserve">P - Plan steps to resolve issue  </w:t>
+      </w:r>
+      <w:r>
+        <w:br/>
+      </w:r>
+      <w:r>
+        <w:rPr>
+          <w:rStyle w:val="VerbatimChar"/>
+        </w:rPr>
+        <w:t xml:space="preserve">A - Act on the plan  </w:t>
+      </w:r>
+      <w:r>
+        <w:br/>
+      </w:r>
+      <w:r>
+        <w:rPr>
+          <w:rStyle w:val="VerbatimChar"/>
+        </w:rPr>
+        <w:t xml:space="preserve">R - Reflect on results  </w:t>
+      </w:r>
+      <w:r>
+        <w:br/>
+      </w:r>
+      <w:r>
+        <w:rPr>
+          <w:rStyle w:val="VerbatimChar"/>
+        </w:rPr>
+        <w:t xml:space="preserve">E - Evaluate and revise plan as necessary  </w:t>
+      </w:r>
+    </w:p>
+    <w:p>
+      <w:pPr>
+        <w:pStyle w:val="FirstParagraph"/>
+      </w:pPr>
+      <w:r>
+        <w:rPr>
+          <w:b/>
+          <w:bCs/>
+        </w:rPr>
+        <w:t xml:space="preserve">💡 When to use:</w:t>
+      </w:r>
+      <w:r>
+        <w:t xml:space="preserve"> </w:t>
+      </w:r>
+      <w:r>
+        <w:t xml:space="preserve">Strategic planning (1–2 hr); medium complexity, multi-stakeholder; needs structure.</w:t>
+      </w:r>
+      <w:r>
+        <w:t xml:space="preserve"> </w:t>
+      </w:r>
+      <w:r>
+        <w:rPr>
+          <w:i/>
+          <w:iCs/>
+        </w:rPr>
+        <w:t xml:space="preserve">Not for outages—use</w:t>
+      </w:r>
+      <w:r>
+        <w:rPr>
+          <w:i/>
+          <w:iCs/>
+        </w:rPr>
+        <w:t xml:space="preserve"> </w:t>
+      </w:r>
       <w:hyperlink w:anchor="stop">
         <w:r>
           <w:rPr>
@@ -4761,8 +4873,8 @@
         <w:t xml:space="preserve">Deployment failures - Why? Pipeline failed. Why? Tests timed out. Why? Database slow. Why? Index missing. Why? Schema change didn’t include migration. Root cause: Missing migration validation step</w:t>
       </w:r>
     </w:p>
-    <w:bookmarkEnd w:id="22"/>
-    <w:bookmarkStart w:id="23" w:name="ishikawa-fishbone-diagram"/>
+    <w:bookmarkEnd w:id="24"/>
+    <w:bookmarkStart w:id="25" w:name="ishikawa-fishbone-diagram"/>
     <w:p>
       <w:pPr>
         <w:pStyle w:val="Heading3"/>
@@ -5069,8 +5181,8 @@
         <w:t xml:space="preserve">→ missing health-check in pipeline. Root cause: CI didn’t run post-deploy checks.</w:t>
       </w:r>
     </w:p>
-    <w:bookmarkEnd w:id="23"/>
-    <w:bookmarkStart w:id="24" w:name="d-approach"/>
+    <w:bookmarkEnd w:id="25"/>
+    <w:bookmarkStart w:id="26" w:name="d-approach"/>
     <w:p>
       <w:pPr>
         <w:pStyle w:val="Heading3"/>
@@ -5428,8 +5540,8 @@
         <w:t xml:space="preserve">: phishing → no MFA → insufficient training), Implement MFA, Validate with penetration test, Prevent (mandatory security awareness), Celebrate team response</w:t>
       </w:r>
     </w:p>
-    <w:bookmarkEnd w:id="24"/>
-    <w:bookmarkStart w:id="25" w:name="a3-problem-solving"/>
+    <w:bookmarkEnd w:id="26"/>
+    <w:bookmarkStart w:id="27" w:name="a3-problem-solving"/>
     <w:p>
       <w:pPr>
         <w:pStyle w:val="Heading3"/>
@@ -5728,8 +5840,8 @@
         <w:t xml:space="preserve">Sprint overruns - A3: Background (delivery slipping), Current state (scope creep, no Definition of Done), Goal (predictable sprints), Root cause (5 Whys → no intake prioritization), Countermeasures (backlog refinement + DoD), Plan (next 2 sprints). Share with product and eng leadership on one page.</w:t>
       </w:r>
     </w:p>
-    <w:bookmarkEnd w:id="25"/>
-    <w:bookmarkStart w:id="26" w:name="ps"/>
+    <w:bookmarkEnd w:id="27"/>
+    <w:bookmarkStart w:id="28" w:name="ps"/>
     <w:p>
       <w:pPr>
         <w:pStyle w:val="Heading3"/>
@@ -5770,9 +5882,9 @@
         <w:t xml:space="preserve">.</w:t>
       </w:r>
     </w:p>
-    <w:bookmarkEnd w:id="26"/>
-    <w:bookmarkEnd w:id="27"/>
-    <w:bookmarkStart w:id="31" w:name="problem-analysis"/>
+    <w:bookmarkEnd w:id="28"/>
+    <w:bookmarkEnd w:id="29"/>
+    <w:bookmarkStart w:id="33" w:name="problem-analysis"/>
     <w:p>
       <w:pPr>
         <w:pStyle w:val="Heading2"/>
@@ -5793,7 +5905,7 @@
         <w:t xml:space="preserve">Frameworks for scope and impact.</w:t>
       </w:r>
     </w:p>
-    <w:bookmarkStart w:id="28" w:name="raci"/>
+    <w:bookmarkStart w:id="30" w:name="raci"/>
     <w:p>
       <w:pPr>
         <w:pStyle w:val="Heading3"/>
@@ -6080,8 +6192,8 @@
         <w:t xml:space="preserve">Cloud migration planning - Political (vendor lock-in concerns), Economic (cost optimization), Technological (API compatibility), Legal (data sovereignty requirements)</w:t>
       </w:r>
     </w:p>
-    <w:bookmarkEnd w:id="28"/>
-    <w:bookmarkStart w:id="30" w:name="swot"/>
+    <w:bookmarkEnd w:id="30"/>
+    <w:bookmarkStart w:id="32" w:name="swot"/>
     <w:p>
       <w:pPr>
         <w:pStyle w:val="Heading3"/>
@@ -6301,7 +6413,7 @@
       <w:pPr>
         <w:pStyle w:val="BodyText"/>
       </w:pPr>
-      <w:hyperlink r:id="rId29">
+      <w:hyperlink r:id="rId31">
         <w:r>
           <w:rPr>
             <w:rStyle w:val="Hyperlink"/>
@@ -6312,9 +6424,9 @@
         </w:r>
       </w:hyperlink>
     </w:p>
-    <w:bookmarkEnd w:id="30"/>
-    <w:bookmarkEnd w:id="31"/>
-    <w:bookmarkStart w:id="35" w:name="problem-resolution-threats"/>
+    <w:bookmarkEnd w:id="32"/>
+    <w:bookmarkEnd w:id="33"/>
+    <w:bookmarkStart w:id="37" w:name="problem-resolution-threats"/>
     <w:p>
       <w:pPr>
         <w:pStyle w:val="Heading2"/>
@@ -6335,7 +6447,7 @@
         <w:t xml:space="preserve">Blockers before they derail.</w:t>
       </w:r>
     </w:p>
-    <w:bookmarkStart w:id="32" w:name="dice"/>
+    <w:bookmarkStart w:id="34" w:name="dice"/>
     <w:p>
       <w:pPr>
         <w:pStyle w:val="Heading3"/>
@@ -6450,8 +6562,8 @@
         <w:t xml:space="preserve">phase.</w:t>
       </w:r>
     </w:p>
-    <w:bookmarkEnd w:id="32"/>
-    <w:bookmarkStart w:id="33" w:name="fate"/>
+    <w:bookmarkEnd w:id="34"/>
+    <w:bookmarkStart w:id="35" w:name="fate"/>
     <w:p>
       <w:pPr>
         <w:pStyle w:val="Heading3"/>
@@ -6533,8 +6645,8 @@
         <w:t xml:space="preserve">to validate resources.</w:t>
       </w:r>
     </w:p>
-    <w:bookmarkEnd w:id="33"/>
-    <w:bookmarkStart w:id="34" w:name="pest"/>
+    <w:bookmarkEnd w:id="35"/>
+    <w:bookmarkStart w:id="36" w:name="pest"/>
     <w:p>
       <w:pPr>
         <w:pStyle w:val="Heading3"/>
@@ -6599,9 +6711,9 @@
         <w:t xml:space="preserve">External threats to solutions; how to combat/remove.</w:t>
       </w:r>
     </w:p>
-    <w:bookmarkEnd w:id="34"/>
-    <w:bookmarkEnd w:id="35"/>
-    <w:bookmarkStart w:id="38" w:name="communication-conflict"/>
+    <w:bookmarkEnd w:id="36"/>
+    <w:bookmarkEnd w:id="37"/>
+    <w:bookmarkStart w:id="40" w:name="communication-conflict"/>
     <w:p>
       <w:pPr>
         <w:pStyle w:val="Heading2"/>
@@ -6622,7 +6734,7 @@
         <w:t xml:space="preserve">Calm, productive in difficult conversations.</w:t>
       </w:r>
     </w:p>
-    <w:bookmarkStart w:id="36" w:name="breathe"/>
+    <w:bookmarkStart w:id="38" w:name="breathe"/>
     <w:p>
       <w:pPr>
         <w:pStyle w:val="Heading3"/>
@@ -6996,8 +7108,8 @@
         <w:t xml:space="preserve">Heated debate about architecture decision - Put in perspective (not life-or-death), Acknowledge both viewpoints have merit, Don’t decide now, Step away for lunch break, Evaluate pros/cons offline, Return with structured comparison</w:t>
       </w:r>
     </w:p>
-    <w:bookmarkEnd w:id="36"/>
-    <w:bookmarkStart w:id="37" w:name="wait"/>
+    <w:bookmarkEnd w:id="38"/>
+    <w:bookmarkStart w:id="39" w:name="wait"/>
     <w:p>
       <w:pPr>
         <w:pStyle w:val="Heading3"/>
@@ -7184,9 +7296,9 @@
         <w:t xml:space="preserve">(defend or resolve?). BREATHE+PAUSE; respond later with facts.</w:t>
       </w:r>
     </w:p>
-    <w:bookmarkEnd w:id="37"/>
-    <w:bookmarkEnd w:id="38"/>
-    <w:bookmarkStart w:id="44" w:name="stress-resilience"/>
+    <w:bookmarkEnd w:id="39"/>
+    <w:bookmarkEnd w:id="40"/>
+    <w:bookmarkStart w:id="46" w:name="stress-resilience"/>
     <w:p>
       <w:pPr>
         <w:pStyle w:val="Heading2"/>
@@ -7207,7 +7319,7 @@
         <w:t xml:space="preserve">Calm and connected under pressure.</w:t>
       </w:r>
     </w:p>
-    <w:bookmarkStart w:id="39" w:name="pace"/>
+    <w:bookmarkStart w:id="41" w:name="pace"/>
     <w:p>
       <w:pPr>
         <w:pStyle w:val="Heading3"/>
@@ -7272,8 +7384,8 @@
         <w:t xml:space="preserve">First in PACE→ARIES→CALM→SHINE; immediate stress.</w:t>
       </w:r>
     </w:p>
-    <w:bookmarkEnd w:id="39"/>
-    <w:bookmarkStart w:id="40" w:name="stop"/>
+    <w:bookmarkEnd w:id="41"/>
+    <w:bookmarkStart w:id="42" w:name="stop"/>
     <w:p>
       <w:pPr>
         <w:pStyle w:val="Heading3"/>
@@ -7571,8 +7683,8 @@
         <w:t xml:space="preserve">Production alert at 2 AM - Step back (don’t panic), Take deep breath (reduce adrenaline), Observe (read alert details), Pull back perspective (assess severity before waking team), Then proceed to TRACE for diagnostics</w:t>
       </w:r>
     </w:p>
-    <w:bookmarkEnd w:id="40"/>
-    <w:bookmarkStart w:id="41" w:name="aries"/>
+    <w:bookmarkEnd w:id="42"/>
+    <w:bookmarkStart w:id="43" w:name="aries"/>
     <w:p>
       <w:pPr>
         <w:pStyle w:val="Heading3"/>
@@ -7646,8 +7758,8 @@
         <w:t xml:space="preserve">Lifestyle in PACE→ARIES→CALM; long-term (2–4 weeks).</w:t>
       </w:r>
     </w:p>
-    <w:bookmarkEnd w:id="41"/>
-    <w:bookmarkStart w:id="42" w:name="calm"/>
+    <w:bookmarkEnd w:id="43"/>
+    <w:bookmarkStart w:id="44" w:name="calm"/>
     <w:p>
       <w:pPr>
         <w:pStyle w:val="Heading3"/>
@@ -7775,8 +7887,8 @@
         </w:r>
       </w:hyperlink>
     </w:p>
-    <w:bookmarkEnd w:id="42"/>
-    <w:bookmarkStart w:id="43" w:name="shine"/>
+    <w:bookmarkEnd w:id="44"/>
+    <w:bookmarkStart w:id="45" w:name="shine"/>
     <w:p>
       <w:pPr>
         <w:pStyle w:val="Heading3"/>
@@ -7864,9 +7976,9 @@
         <w:t xml:space="preserve">.</w:t>
       </w:r>
     </w:p>
-    <w:bookmarkEnd w:id="43"/>
-    <w:bookmarkEnd w:id="44"/>
-    <w:bookmarkStart w:id="48" w:name="infrastructure-systems-engineering"/>
+    <w:bookmarkEnd w:id="45"/>
+    <w:bookmarkEnd w:id="46"/>
+    <w:bookmarkStart w:id="50" w:name="infrastructure-systems-engineering"/>
     <w:p>
       <w:pPr>
         <w:pStyle w:val="Heading2"/>
@@ -7887,7 +7999,7 @@
         <w:t xml:space="preserve">Infra and DevOps.</w:t>
       </w:r>
     </w:p>
-    <w:bookmarkStart w:id="45" w:name="trace-network-troubleshooting"/>
+    <w:bookmarkStart w:id="47" w:name="trace-network-troubleshooting"/>
     <w:p>
       <w:pPr>
         <w:pStyle w:val="Heading3"/>
@@ -8029,8 +8141,8 @@
         </w:r>
       </w:hyperlink>
     </w:p>
-    <w:bookmarkEnd w:id="45"/>
-    <w:bookmarkStart w:id="46" w:name="scale-infrastructure-design"/>
+    <w:bookmarkEnd w:id="47"/>
+    <w:bookmarkStart w:id="48" w:name="scale-infrastructure-design"/>
     <w:p>
       <w:pPr>
         <w:pStyle w:val="Heading3"/>
@@ -8200,8 +8312,8 @@
         </w:r>
       </w:hyperlink>
     </w:p>
-    <w:bookmarkEnd w:id="46"/>
-    <w:bookmarkStart w:id="47" w:name="debug-code-system-analysis"/>
+    <w:bookmarkEnd w:id="48"/>
+    <w:bookmarkStart w:id="49" w:name="debug-code-system-analysis"/>
     <w:p>
       <w:pPr>
         <w:pStyle w:val="Heading3"/>
@@ -8368,9 +8480,9 @@
         </w:r>
       </w:hyperlink>
     </w:p>
-    <w:bookmarkEnd w:id="47"/>
-    <w:bookmarkEnd w:id="48"/>
-    <w:bookmarkStart w:id="55" w:name="proven-mnemonic-pipelines"/>
+    <w:bookmarkEnd w:id="49"/>
+    <w:bookmarkEnd w:id="50"/>
+    <w:bookmarkStart w:id="57" w:name="proven-mnemonic-pipelines"/>
     <w:p>
       <w:pPr>
         <w:pStyle w:val="Heading2"/>
@@ -8388,10 +8500,10 @@
           <w:i/>
           <w:iCs/>
         </w:rPr>
-        <w:t xml:space="preserve">Chains combine mnemonics into workflows for high-pressure scenarios; battle-tested.</w:t>
-      </w:r>
-    </w:p>
-    <w:bookmarkStart w:id="49" w:name="crisis-response-chain"/>
+        <w:t xml:space="preserve">Ordered chains of mnemonics for end-to-end workflows (e.g. crisis, conflict, root cause).</w:t>
+      </w:r>
+    </w:p>
+    <w:bookmarkStart w:id="51" w:name="crisis-response-chain"/>
     <w:p>
       <w:pPr>
         <w:pStyle w:val="Heading3"/>
@@ -8523,19 +8635,6 @@
           <w:t xml:space="preserve">8D</w:t>
         </w:r>
       </w:hyperlink>
-      <w:r>
-        <w:t xml:space="preserve">.</w:t>
-      </w:r>
-      <w:r>
-        <w:t xml:space="preserve"> </w:t>
-      </w:r>
-      <w:r>
-        <w:rPr>
-          <w:i/>
-          <w:iCs/>
-        </w:rPr>
-        <w:t xml:space="preserve">Step details in each mnemonic above.</w:t>
-      </w:r>
     </w:p>
     <w:p>
       <w:pPr>
@@ -8555,8 +8654,8 @@
         <w:t xml:space="preserve">STOP stabilizes; TRACE gathers evidence; DEBUG structures analysis; 8D prevents recurrence.</w:t>
       </w:r>
     </w:p>
-    <w:bookmarkEnd w:id="49"/>
-    <w:bookmarkStart w:id="50" w:name="conflict-resolution-chain"/>
+    <w:bookmarkEnd w:id="51"/>
+    <w:bookmarkStart w:id="52" w:name="conflict-resolution-chain"/>
     <w:p>
       <w:pPr>
         <w:pStyle w:val="Heading3"/>
@@ -8688,19 +8787,6 @@
           <w:t xml:space="preserve">RACI</w:t>
         </w:r>
       </w:hyperlink>
-      <w:r>
-        <w:t xml:space="preserve">.</w:t>
-      </w:r>
-      <w:r>
-        <w:t xml:space="preserve"> </w:t>
-      </w:r>
-      <w:r>
-        <w:rPr>
-          <w:i/>
-          <w:iCs/>
-        </w:rPr>
-        <w:t xml:space="preserve">Step details in each mnemonic above.</w:t>
-      </w:r>
     </w:p>
     <w:p>
       <w:pPr>
@@ -8720,8 +8806,8 @@
         <w:t xml:space="preserve">WAIT prevents escalation; BREATHE regulates; PAUSE creates space; RACI clarifies roles (often the root cause).</w:t>
       </w:r>
     </w:p>
-    <w:bookmarkEnd w:id="50"/>
-    <w:bookmarkStart w:id="51" w:name="root-cause-investigation-chain"/>
+    <w:bookmarkEnd w:id="52"/>
+    <w:bookmarkStart w:id="53" w:name="root-cause-investigation-chain"/>
     <w:p>
       <w:pPr>
         <w:pStyle w:val="Heading3"/>
@@ -8853,19 +8939,6 @@
           <w:t xml:space="preserve">RACI</w:t>
         </w:r>
       </w:hyperlink>
-      <w:r>
-        <w:t xml:space="preserve">.</w:t>
-      </w:r>
-      <w:r>
-        <w:t xml:space="preserve"> </w:t>
-      </w:r>
-      <w:r>
-        <w:rPr>
-          <w:i/>
-          <w:iCs/>
-        </w:rPr>
-        <w:t xml:space="preserve">Step details in each mnemonic above.</w:t>
-      </w:r>
     </w:p>
     <w:p>
       <w:pPr>
@@ -8885,8 +8958,8 @@
         <w:t xml:space="preserve">ICEBERG structures; 5 Whys drill to root cause; PADDER plans; RACI ensures accountability.</w:t>
       </w:r>
     </w:p>
-    <w:bookmarkEnd w:id="51"/>
-    <w:bookmarkStart w:id="52" w:name="strategic-design-chain"/>
+    <w:bookmarkEnd w:id="53"/>
+    <w:bookmarkStart w:id="54" w:name="strategic-design-chain"/>
     <w:p>
       <w:pPr>
         <w:pStyle w:val="Heading3"/>
@@ -9018,19 +9091,6 @@
           <w:t xml:space="preserve">SET</w:t>
         </w:r>
       </w:hyperlink>
-      <w:r>
-        <w:t xml:space="preserve">.</w:t>
-      </w:r>
-      <w:r>
-        <w:t xml:space="preserve"> </w:t>
-      </w:r>
-      <w:r>
-        <w:rPr>
-          <w:i/>
-          <w:iCs/>
-        </w:rPr>
-        <w:t xml:space="preserve">Step details in each mnemonic above.</w:t>
-      </w:r>
     </w:p>
     <w:p>
       <w:pPr>
@@ -9050,8 +9110,8 @@
         <w:t xml:space="preserve">SCALE sets requirements; SWOT evaluates; PESTEL finds external risks; SET manages expectations.</w:t>
       </w:r>
     </w:p>
-    <w:bookmarkEnd w:id="52"/>
-    <w:bookmarkStart w:id="53" w:name="stress-burnout-recovery-chain"/>
+    <w:bookmarkEnd w:id="54"/>
+    <w:bookmarkStart w:id="55" w:name="stress-burnout-recovery-chain"/>
     <w:p>
       <w:pPr>
         <w:pStyle w:val="Heading3"/>
@@ -9183,19 +9243,6 @@
           <w:t xml:space="preserve">SHINE</w:t>
         </w:r>
       </w:hyperlink>
-      <w:r>
-        <w:t xml:space="preserve">.</w:t>
-      </w:r>
-      <w:r>
-        <w:t xml:space="preserve"> </w:t>
-      </w:r>
-      <w:r>
-        <w:rPr>
-          <w:i/>
-          <w:iCs/>
-        </w:rPr>
-        <w:t xml:space="preserve">Step details in each mnemonic above.</w:t>
-      </w:r>
     </w:p>
     <w:p>
       <w:pPr>
@@ -9215,8 +9262,8 @@
         <w:t xml:space="preserve">PACE (immediate); ARIES (lifestyle); CALM (resilience); SHINE (sustainable).</w:t>
       </w:r>
     </w:p>
-    <w:bookmarkEnd w:id="53"/>
-    <w:bookmarkStart w:id="54" w:name="rapid-triage-chain"/>
+    <w:bookmarkEnd w:id="55"/>
+    <w:bookmarkStart w:id="56" w:name="rapid-triage-chain"/>
     <w:p>
       <w:pPr>
         <w:pStyle w:val="Heading3"/>
@@ -9331,19 +9378,6 @@
           <w:t xml:space="preserve">FATE</w:t>
         </w:r>
       </w:hyperlink>
-      <w:r>
-        <w:t xml:space="preserve">.</w:t>
-      </w:r>
-      <w:r>
-        <w:t xml:space="preserve"> </w:t>
-      </w:r>
-      <w:r>
-        <w:rPr>
-          <w:i/>
-          <w:iCs/>
-        </w:rPr>
-        <w:t xml:space="preserve">Step details in each mnemonic above.</w:t>
-      </w:r>
     </w:p>
     <w:p>
       <w:pPr>
@@ -9363,9 +9397,9 @@
         <w:t xml:space="preserve">IDEA (fast frame); DICE (blockers); FATE (resources).</w:t>
       </w:r>
     </w:p>
-    <w:bookmarkEnd w:id="54"/>
-    <w:bookmarkEnd w:id="55"/>
-    <w:bookmarkStart w:id="56" w:name="pipeline-selection-matrix"/>
+    <w:bookmarkEnd w:id="56"/>
+    <w:bookmarkEnd w:id="57"/>
+    <w:bookmarkStart w:id="58" w:name="pipeline-selection-matrix"/>
     <w:p>
       <w:pPr>
         <w:pStyle w:val="Heading2"/>
@@ -9973,8 +10007,8 @@
         </w:pict>
       </w:r>
     </w:p>
-    <w:bookmarkEnd w:id="56"/>
-    <w:bookmarkStart w:id="57" w:name="pro-tips"/>
+    <w:bookmarkEnd w:id="58"/>
+    <w:bookmarkStart w:id="59" w:name="pro-tips"/>
     <w:p>
       <w:pPr>
         <w:pStyle w:val="Heading2"/>
@@ -9988,7 +10022,7 @@
         <w:pStyle w:val="Compact"/>
         <w:numPr>
           <w:ilvl w:val="0"/>
-          <w:numId w:val="1012"/>
+          <w:numId w:val="1013"/>
         </w:numPr>
       </w:pPr>
       <w:r>
@@ -10010,7 +10044,7 @@
         <w:pStyle w:val="Compact"/>
         <w:numPr>
           <w:ilvl w:val="0"/>
-          <w:numId w:val="1012"/>
+          <w:numId w:val="1013"/>
         </w:numPr>
       </w:pPr>
       <w:r>
@@ -10032,7 +10066,7 @@
         <w:pStyle w:val="Compact"/>
         <w:numPr>
           <w:ilvl w:val="0"/>
-          <w:numId w:val="1012"/>
+          <w:numId w:val="1013"/>
         </w:numPr>
       </w:pPr>
       <w:r>
@@ -10102,7 +10136,7 @@
         <w:pStyle w:val="Compact"/>
         <w:numPr>
           <w:ilvl w:val="0"/>
-          <w:numId w:val="1012"/>
+          <w:numId w:val="1013"/>
         </w:numPr>
       </w:pPr>
       <w:r>
@@ -10141,7 +10175,7 @@
         <w:pStyle w:val="Compact"/>
         <w:numPr>
           <w:ilvl w:val="0"/>
-          <w:numId w:val="1012"/>
+          <w:numId w:val="1013"/>
         </w:numPr>
       </w:pPr>
       <w:r>
@@ -10165,8 +10199,8 @@
         </w:pict>
       </w:r>
     </w:p>
-    <w:bookmarkEnd w:id="57"/>
-    <w:bookmarkStart w:id="58" w:name="common-mistakes"/>
+    <w:bookmarkEnd w:id="59"/>
+    <w:bookmarkStart w:id="60" w:name="common-mistakes"/>
     <w:p>
       <w:pPr>
         <w:pStyle w:val="Heading2"/>
@@ -10696,8 +10730,8 @@
         </w:r>
       </w:hyperlink>
     </w:p>
-    <w:bookmarkEnd w:id="58"/>
-    <w:bookmarkStart w:id="60" w:name="contributing"/>
+    <w:bookmarkEnd w:id="60"/>
+    <w:bookmarkStart w:id="62" w:name="contributing"/>
     <w:p>
       <w:pPr>
         <w:pStyle w:val="Heading2"/>
@@ -10711,17 +10745,35 @@
         <w:pStyle w:val="FirstParagraph"/>
       </w:pPr>
       <w:r>
-        <w:t xml:space="preserve">Got a mnemonic that’s saved you countless times?</w:t>
-      </w:r>
-      <w:r>
-        <w:t xml:space="preserve"> </w:t>
-      </w:r>
-      <w:r>
-        <w:rPr>
-          <w:b/>
-          <w:bCs/>
-        </w:rPr>
-        <w:t xml:space="preserve">Share it!</w:t>
+        <w:rPr>
+          <w:b/>
+          <w:bCs/>
+        </w:rPr>
+        <w:t xml:space="preserve">Submission criteria:</w:t>
+      </w:r>
+      <w:r>
+        <w:t xml:space="preserve"> </w:t>
+      </w:r>
+      <w:r>
+        <w:t xml:space="preserve">- ✅ Must be provable/actionable (not just motivational)</w:t>
+      </w:r>
+      <w:r>
+        <w:t xml:space="preserve"> </w:t>
+      </w:r>
+      <w:r>
+        <w:t xml:space="preserve">- ✅ Should cross-reference existing mnemonics where applicable</w:t>
+      </w:r>
+      <w:r>
+        <w:t xml:space="preserve"> </w:t>
+      </w:r>
+      <w:r>
+        <w:t xml:space="preserve">- ✅ Include real-world usage context</w:t>
+      </w:r>
+      <w:r>
+        <w:t xml:space="preserve"> </w:t>
+      </w:r>
+      <w:r>
+        <w:t xml:space="preserve">- ✅ Keep it memorable (that’s the point!)</w:t>
       </w:r>
     </w:p>
     <w:p>
@@ -10729,48 +10781,12 @@
         <w:pStyle w:val="BodyText"/>
       </w:pPr>
       <w:r>
-        <w:rPr>
-          <w:b/>
-          <w:bCs/>
-        </w:rPr>
-        <w:t xml:space="preserve">Submission criteria:</w:t>
-      </w:r>
-      <w:r>
-        <w:t xml:space="preserve"> </w:t>
-      </w:r>
-      <w:r>
-        <w:t xml:space="preserve">- ✅ Must be provable/actionable (not just motivational)</w:t>
-      </w:r>
-      <w:r>
-        <w:t xml:space="preserve"> </w:t>
-      </w:r>
-      <w:r>
-        <w:t xml:space="preserve">- ✅ Should cross-reference existing mnemonics where applicable</w:t>
-      </w:r>
-      <w:r>
-        <w:t xml:space="preserve"> </w:t>
-      </w:r>
-      <w:r>
-        <w:t xml:space="preserve">- ✅ Include real-world usage context</w:t>
-      </w:r>
-      <w:r>
-        <w:t xml:space="preserve"> </w:t>
-      </w:r>
-      <w:r>
-        <w:t xml:space="preserve">- ✅ Keep it memorable (that’s the point!)</w:t>
-      </w:r>
-    </w:p>
-    <w:p>
-      <w:pPr>
-        <w:pStyle w:val="BodyText"/>
-      </w:pPr>
-      <w:r>
         <w:t xml:space="preserve">See</w:t>
       </w:r>
       <w:r>
         <w:t xml:space="preserve"> </w:t>
       </w:r>
-      <w:hyperlink r:id="rId59">
+      <w:hyperlink r:id="rId61">
         <w:r>
           <w:rPr>
             <w:rStyle w:val="Hyperlink"/>
@@ -10792,8 +10808,8 @@
         </w:pict>
       </w:r>
     </w:p>
-    <w:bookmarkEnd w:id="60"/>
-    <w:bookmarkStart w:id="73" w:name="release-versions"/>
+    <w:bookmarkEnd w:id="62"/>
+    <w:bookmarkStart w:id="75" w:name="release-versions"/>
     <w:p>
       <w:pPr>
         <w:pStyle w:val="Heading2"/>
@@ -10811,18 +10827,18 @@
           <w:b/>
           <w:bCs/>
         </w:rPr>
-        <w:t xml:space="preserve">v1.8</w:t>
-      </w:r>
-      <w:r>
-        <w:t xml:space="preserve"> </w:t>
-      </w:r>
-      <w:r>
-        <w:t xml:space="preserve">(2026-01-25) — Offline-ready (TOC, print-optimized).</w:t>
-      </w:r>
-      <w:r>
-        <w:t xml:space="preserve"> </w:t>
-      </w:r>
-      <w:hyperlink r:id="rId61">
+        <w:t xml:space="preserve">v2.6</w:t>
+      </w:r>
+      <w:r>
+        <w:t xml:space="preserve"> </w:t>
+      </w:r>
+      <w:r>
+        <w:t xml:space="preserve">(2026-01-25) — Domain addenda, Quick Start, Evidence tier, Tools &amp; docs, Awesome-list clarity; downloadable docs synced.</w:t>
+      </w:r>
+      <w:r>
+        <w:t xml:space="preserve"> </w:t>
+      </w:r>
+      <w:hyperlink r:id="rId63">
         <w:r>
           <w:rPr>
             <w:rStyle w:val="Hyperlink"/>
@@ -10845,7 +10861,7 @@
       <w:r>
         <w:t xml:space="preserve"> </w:t>
       </w:r>
-      <w:hyperlink r:id="rId62">
+      <w:hyperlink r:id="rId64">
         <w:r>
           <w:rPr>
             <w:rStyle w:val="Hyperlink"/>
@@ -10862,7 +10878,7 @@
       <w:r>
         <w:t xml:space="preserve"> </w:t>
       </w:r>
-      <w:hyperlink r:id="rId63">
+      <w:hyperlink r:id="rId65">
         <w:r>
           <w:rPr>
             <w:rStyle w:val="Hyperlink"/>
@@ -10891,7 +10907,7 @@
       <w:r>
         <w:t xml:space="preserve"> </w:t>
       </w:r>
-      <w:hyperlink r:id="rId64">
+      <w:hyperlink r:id="rId66">
         <w:r>
           <w:rPr>
             <w:rStyle w:val="Hyperlink"/>
@@ -10902,7 +10918,7 @@
       <w:r>
         <w:t xml:space="preserve"> </w:t>
       </w:r>
-      <w:hyperlink r:id="rId65">
+      <w:hyperlink r:id="rId67">
         <w:r>
           <w:rPr>
             <w:rStyle w:val="Hyperlink"/>
@@ -10913,7 +10929,7 @@
       <w:r>
         <w:t xml:space="preserve"> </w:t>
       </w:r>
-      <w:hyperlink r:id="rId66">
+      <w:hyperlink r:id="rId68">
         <w:r>
           <w:rPr>
             <w:rStyle w:val="Hyperlink"/>
@@ -10924,7 +10940,7 @@
       <w:r>
         <w:t xml:space="preserve"> </w:t>
       </w:r>
-      <w:hyperlink r:id="rId67">
+      <w:hyperlink r:id="rId69">
         <w:r>
           <w:rPr>
             <w:rStyle w:val="Hyperlink"/>
@@ -10941,7 +10957,7 @@
       <w:r>
         <w:t xml:space="preserve"> </w:t>
       </w:r>
-      <w:hyperlink r:id="rId68">
+      <w:hyperlink r:id="rId70">
         <w:r>
           <w:rPr>
             <w:rStyle w:val="Hyperlink"/>
@@ -10952,7 +10968,7 @@
       <w:r>
         <w:t xml:space="preserve"> </w:t>
       </w:r>
-      <w:hyperlink r:id="rId69">
+      <w:hyperlink r:id="rId71">
         <w:r>
           <w:rPr>
             <w:rStyle w:val="Hyperlink"/>
@@ -10963,7 +10979,7 @@
       <w:r>
         <w:t xml:space="preserve"> </w:t>
       </w:r>
-      <w:hyperlink r:id="rId70">
+      <w:hyperlink r:id="rId72">
         <w:r>
           <w:rPr>
             <w:rStyle w:val="Hyperlink"/>
@@ -10974,7 +10990,7 @@
       <w:r>
         <w:t xml:space="preserve"> </w:t>
       </w:r>
-      <w:hyperlink r:id="rId71">
+      <w:hyperlink r:id="rId73">
         <w:r>
           <w:rPr>
             <w:rStyle w:val="Hyperlink"/>
@@ -10988,14 +11004,14 @@
       <w:r>
         <w:t xml:space="preserve"> </w:t>
       </w:r>
-      <w:hyperlink r:id="rId72">
+      <w:hyperlink r:id="rId74">
         <w:r>
           <w:rPr>
             <w:rStyle w:val="Hyperlink"/>
             <w:i/>
             <w:iCs/>
           </w:rPr>
-          <w:t xml:space="preserve">releases/README</w:t>
+          <w:t xml:space="preserve">README</w:t>
         </w:r>
       </w:hyperlink>
       <w:r>
@@ -11020,8 +11036,8 @@
         </w:pict>
       </w:r>
     </w:p>
-    <w:bookmarkEnd w:id="73"/>
-    <w:bookmarkStart w:id="84" w:name="sources-references"/>
+    <w:bookmarkEnd w:id="75"/>
+    <w:bookmarkStart w:id="86" w:name="sources-references"/>
     <w:p>
       <w:pPr>
         <w:pStyle w:val="Heading2"/>
@@ -11030,179 +11046,13 @@
         <w:t xml:space="preserve">Sources &amp; References</w:t>
       </w:r>
     </w:p>
-    <w:bookmarkStart w:id="77" w:name="problem-solving-methodologies"/>
+    <w:bookmarkStart w:id="79" w:name="problem-solving-methodologies"/>
     <w:p>
       <w:pPr>
         <w:pStyle w:val="Heading3"/>
       </w:pPr>
       <w:r>
         <w:t xml:space="preserve">Problem-Solving Methodologies</w:t>
-      </w:r>
-    </w:p>
-    <w:p>
-      <w:pPr>
-        <w:pStyle w:val="Compact"/>
-        <w:numPr>
-          <w:ilvl w:val="0"/>
-          <w:numId w:val="1013"/>
-        </w:numPr>
-      </w:pPr>
-      <w:r>
-        <w:rPr>
-          <w:b/>
-          <w:bCs/>
-        </w:rPr>
-        <w:t xml:space="preserve">8D (Eight Disciplines)</w:t>
-      </w:r>
-      <w:r>
-        <w:t xml:space="preserve"> </w:t>
-      </w:r>
-      <w:r>
-        <w:t xml:space="preserve">✓ — Ford Motor Company (1987).</w:t>
-      </w:r>
-      <w:r>
-        <w:t xml:space="preserve"> </w:t>
-      </w:r>
-      <w:r>
-        <w:rPr>
-          <w:i/>
-          <w:iCs/>
-        </w:rPr>
-        <w:t xml:space="preserve">Team Oriented Problem Solving Manual</w:t>
-      </w:r>
-      <w:r>
-        <w:t xml:space="preserve">. Evolved from TQM; in wide use in automotive and aerospace.</w:t>
-      </w:r>
-      <w:r>
-        <w:t xml:space="preserve"> </w:t>
-      </w:r>
-      <w:hyperlink r:id="rId74">
-        <w:r>
-          <w:rPr>
-            <w:rStyle w:val="Hyperlink"/>
-          </w:rPr>
-          <w:t xml:space="preserve">Wikipedia</w:t>
-        </w:r>
-      </w:hyperlink>
-    </w:p>
-    <w:p>
-      <w:pPr>
-        <w:pStyle w:val="Compact"/>
-        <w:numPr>
-          <w:ilvl w:val="0"/>
-          <w:numId w:val="1013"/>
-        </w:numPr>
-      </w:pPr>
-      <w:r>
-        <w:rPr>
-          <w:b/>
-          <w:bCs/>
-        </w:rPr>
-        <w:t xml:space="preserve">5 Whys</w:t>
-      </w:r>
-      <w:r>
-        <w:t xml:space="preserve"> </w:t>
-      </w:r>
-      <w:r>
-        <w:t xml:space="preserve">⚠ — Toyota Production System root cause technique; widely adapted across industries.</w:t>
-      </w:r>
-    </w:p>
-    <w:p>
-      <w:pPr>
-        <w:pStyle w:val="Compact"/>
-        <w:numPr>
-          <w:ilvl w:val="0"/>
-          <w:numId w:val="1013"/>
-        </w:numPr>
-      </w:pPr>
-      <w:r>
-        <w:rPr>
-          <w:b/>
-          <w:bCs/>
-        </w:rPr>
-        <w:t xml:space="preserve">Ishikawa (Fishbone) Diagram</w:t>
-      </w:r>
-      <w:r>
-        <w:t xml:space="preserve"> </w:t>
-      </w:r>
-      <w:r>
-        <w:t xml:space="preserve">✓ — Ishikawa, K. (1960s). University of Tokyo. Cause–effect diagram; central to Japanese quality control and Toyota.</w:t>
-      </w:r>
-      <w:r>
-        <w:t xml:space="preserve"> </w:t>
-      </w:r>
-      <w:hyperlink r:id="rId75">
-        <w:r>
-          <w:rPr>
-            <w:rStyle w:val="Hyperlink"/>
-          </w:rPr>
-          <w:t xml:space="preserve">Wikipedia</w:t>
-        </w:r>
-      </w:hyperlink>
-    </w:p>
-    <w:p>
-      <w:pPr>
-        <w:pStyle w:val="Compact"/>
-        <w:numPr>
-          <w:ilvl w:val="0"/>
-          <w:numId w:val="1013"/>
-        </w:numPr>
-      </w:pPr>
-      <w:r>
-        <w:rPr>
-          <w:b/>
-          <w:bCs/>
-        </w:rPr>
-        <w:t xml:space="preserve">A3 Problem Solving</w:t>
-      </w:r>
-      <w:r>
-        <w:t xml:space="preserve"> </w:t>
-      </w:r>
-      <w:r>
-        <w:t xml:space="preserve">✓ — Toyota Production System. Single A3-page structured problem-solving (plan–do–check–act); one-page report for alignment.</w:t>
-      </w:r>
-      <w:r>
-        <w:t xml:space="preserve"> </w:t>
-      </w:r>
-      <w:hyperlink r:id="rId76">
-        <w:r>
-          <w:rPr>
-            <w:rStyle w:val="Hyperlink"/>
-          </w:rPr>
-          <w:t xml:space="preserve">Wikipedia</w:t>
-        </w:r>
-      </w:hyperlink>
-    </w:p>
-    <w:p>
-      <w:pPr>
-        <w:pStyle w:val="Compact"/>
-        <w:numPr>
-          <w:ilvl w:val="0"/>
-          <w:numId w:val="1013"/>
-        </w:numPr>
-      </w:pPr>
-      <w:r>
-        <w:rPr>
-          <w:b/>
-          <w:bCs/>
-        </w:rPr>
-        <w:t xml:space="preserve">PADDER, ICEBERG, IDEA, PREPARE</w:t>
-      </w:r>
-      <w:r>
-        <w:t xml:space="preserve"> </w:t>
-      </w:r>
-      <w:r>
-        <w:t xml:space="preserve">ℹ — Curated/educational problem-solving mnemonics for this collection.</w:t>
-      </w:r>
-    </w:p>
-    <w:bookmarkEnd w:id="77"/>
-    <w:bookmarkStart w:id="81" w:name="strategic-analysis-frameworks"/>
-    <w:p>
-      <w:pPr>
-        <w:pStyle w:val="Heading3"/>
-      </w:pPr>
-      <w:r>
-        <w:t xml:space="preserve">Strategic &amp; Analysis Frameworks</w:t>
       </w:r>
     </w:p>
     <w:p>
@@ -11218,13 +11068,13 @@
           <w:b/>
           <w:bCs/>
         </w:rPr>
-        <w:t xml:space="preserve">PESTEL</w:t>
-      </w:r>
-      <w:r>
-        <w:t xml:space="preserve"> </w:t>
-      </w:r>
-      <w:r>
-        <w:t xml:space="preserve">✓ — Aguilar, F. (1967).</w:t>
+        <w:t xml:space="preserve">8D (Eight Disciplines)</w:t>
+      </w:r>
+      <w:r>
+        <w:t xml:space="preserve"> </w:t>
+      </w:r>
+      <w:r>
+        <w:t xml:space="preserve">✓ — Ford Motor Company (1987).</w:t>
       </w:r>
       <w:r>
         <w:t xml:space="preserve"> </w:t>
@@ -11234,20 +11084,20 @@
           <w:i/>
           <w:iCs/>
         </w:rPr>
-        <w:t xml:space="preserve">Scanning the Business Environment</w:t>
-      </w:r>
-      <w:r>
-        <w:t xml:space="preserve">. Harvard; later extended to PESTLE/PESTEL (Legal, Environmental).</w:t>
-      </w:r>
-      <w:r>
-        <w:t xml:space="preserve"> </w:t>
-      </w:r>
-      <w:hyperlink r:id="rId78">
-        <w:r>
-          <w:rPr>
-            <w:rStyle w:val="Hyperlink"/>
-          </w:rPr>
-          <w:t xml:space="preserve">Background</w:t>
+        <w:t xml:space="preserve">Team Oriented Problem Solving Manual</w:t>
+      </w:r>
+      <w:r>
+        <w:t xml:space="preserve">. Evolved from TQM; in wide use in automotive and aerospace.</w:t>
+      </w:r>
+      <w:r>
+        <w:t xml:space="preserve"> </w:t>
+      </w:r>
+      <w:hyperlink r:id="rId76">
+        <w:r>
+          <w:rPr>
+            <w:rStyle w:val="Hyperlink"/>
+          </w:rPr>
+          <w:t xml:space="preserve">Wikipedia</w:t>
         </w:r>
       </w:hyperlink>
     </w:p>
@@ -11264,13 +11114,13 @@
           <w:b/>
           <w:bCs/>
         </w:rPr>
-        <w:t xml:space="preserve">PEST</w:t>
-      </w:r>
-      <w:r>
-        <w:t xml:space="preserve"> </w:t>
-      </w:r>
-      <w:r>
-        <w:t xml:space="preserve">ℹ — Four-factor variant (Political, Economic, Social, Technological); conceptually from the PESTEL lineage.</w:t>
+        <w:t xml:space="preserve">5 Whys</w:t>
+      </w:r>
+      <w:r>
+        <w:t xml:space="preserve"> </w:t>
+      </w:r>
+      <w:r>
+        <w:t xml:space="preserve">⚠ — Toyota Production System root cause technique; widely adapted across industries.</w:t>
       </w:r>
     </w:p>
     <w:p>
@@ -11286,23 +11136,23 @@
           <w:b/>
           <w:bCs/>
         </w:rPr>
-        <w:t xml:space="preserve">SWOT</w:t>
-      </w:r>
-      <w:r>
-        <w:t xml:space="preserve"> </w:t>
-      </w:r>
-      <w:r>
-        <w:t xml:space="preserve">✓ — Humphrey, A. (1960s–70s). Stanford Research Institute (SRI International); developed with Fortune 500 planning research.</w:t>
-      </w:r>
-      <w:r>
-        <w:t xml:space="preserve"> </w:t>
-      </w:r>
-      <w:hyperlink r:id="rId79">
-        <w:r>
-          <w:rPr>
-            <w:rStyle w:val="Hyperlink"/>
-          </w:rPr>
-          <w:t xml:space="preserve">e.g. Ninety</w:t>
+        <w:t xml:space="preserve">Ishikawa (Fishbone) Diagram</w:t>
+      </w:r>
+      <w:r>
+        <w:t xml:space="preserve"> </w:t>
+      </w:r>
+      <w:r>
+        <w:t xml:space="preserve">✓ — Ishikawa, K. (1960s). University of Tokyo. Cause–effect diagram; central to Japanese quality control and Toyota.</w:t>
+      </w:r>
+      <w:r>
+        <w:t xml:space="preserve"> </w:t>
+      </w:r>
+      <w:hyperlink r:id="rId77">
+        <w:r>
+          <w:rPr>
+            <w:rStyle w:val="Hyperlink"/>
+          </w:rPr>
+          <w:t xml:space="preserve">Wikipedia</w:t>
         </w:r>
       </w:hyperlink>
     </w:p>
@@ -11319,23 +11169,23 @@
           <w:b/>
           <w:bCs/>
         </w:rPr>
-        <w:t xml:space="preserve">RACI</w:t>
-      </w:r>
-      <w:r>
-        <w:t xml:space="preserve"> </w:t>
-      </w:r>
-      <w:r>
-        <w:t xml:space="preserve">✓ — Responsibility Assignment Matrix; emerged ~1950s–70s, no single inventor.</w:t>
-      </w:r>
-      <w:r>
-        <w:t xml:space="preserve"> </w:t>
-      </w:r>
-      <w:hyperlink r:id="rId80">
-        <w:r>
-          <w:rPr>
-            <w:rStyle w:val="Hyperlink"/>
-          </w:rPr>
-          <w:t xml:space="preserve">Wikipedia RAM</w:t>
+        <w:t xml:space="preserve">A3 Problem Solving</w:t>
+      </w:r>
+      <w:r>
+        <w:t xml:space="preserve"> </w:t>
+      </w:r>
+      <w:r>
+        <w:t xml:space="preserve">✓ — Toyota Production System. Single A3-page structured problem-solving (plan–do–check–act); one-page report for alignment.</w:t>
+      </w:r>
+      <w:r>
+        <w:t xml:space="preserve"> </w:t>
+      </w:r>
+      <w:hyperlink r:id="rId78">
+        <w:r>
+          <w:rPr>
+            <w:rStyle w:val="Hyperlink"/>
+          </w:rPr>
+          <w:t xml:space="preserve">Wikipedia</w:t>
         </w:r>
       </w:hyperlink>
     </w:p>
@@ -11352,47 +11202,23 @@
           <w:b/>
           <w:bCs/>
         </w:rPr>
-        <w:t xml:space="preserve">SET (Systems Engineering Triangle)</w:t>
-      </w:r>
-      <w:r>
-        <w:t xml:space="preserve"> </w:t>
-      </w:r>
-      <w:r>
-        <w:t xml:space="preserve">✓ — SEBoK,</w:t>
-      </w:r>
-      <w:r>
-        <w:t xml:space="preserve"> </w:t>
-      </w:r>
-      <w:r>
-        <w:rPr>
-          <w:i/>
-          <w:iCs/>
-        </w:rPr>
-        <w:t xml:space="preserve">Guide to the Systems Engineering Body of Knowledge</w:t>
-      </w:r>
-      <w:r>
-        <w:t xml:space="preserve">.</w:t>
-      </w:r>
-      <w:r>
-        <w:t xml:space="preserve"> </w:t>
-      </w:r>
-      <w:hyperlink r:id="rId29">
-        <w:r>
-          <w:rPr>
-            <w:rStyle w:val="Hyperlink"/>
-          </w:rPr>
-          <w:t xml:space="preserve">SEBoK</w:t>
-        </w:r>
-      </w:hyperlink>
-    </w:p>
-    <w:bookmarkEnd w:id="81"/>
-    <w:bookmarkStart w:id="82" w:name="problem-resolution-threats-triage"/>
+        <w:t xml:space="preserve">PADDER, ICEBERG, IDEA, PREPARE</w:t>
+      </w:r>
+      <w:r>
+        <w:t xml:space="preserve"> </w:t>
+      </w:r>
+      <w:r>
+        <w:t xml:space="preserve">ℹ — Curated/educational problem-solving mnemonics for this collection.</w:t>
+      </w:r>
+    </w:p>
+    <w:bookmarkEnd w:id="79"/>
+    <w:bookmarkStart w:id="83" w:name="strategic-analysis-frameworks"/>
     <w:p>
       <w:pPr>
         <w:pStyle w:val="Heading3"/>
       </w:pPr>
       <w:r>
-        <w:t xml:space="preserve">Problem Resolution Threats &amp; Triage</w:t>
+        <w:t xml:space="preserve">Strategic &amp; Analysis Frameworks</w:t>
       </w:r>
     </w:p>
     <w:p>
@@ -11408,23 +11234,181 @@
           <w:b/>
           <w:bCs/>
         </w:rPr>
-        <w:t xml:space="preserve">DICE, FATE</w:t>
-      </w:r>
-      <w:r>
-        <w:t xml:space="preserve"> </w:t>
-      </w:r>
-      <w:r>
-        <w:t xml:space="preserve">ℹ — Educational mnemonics for blockers and resource checks in this collection.</w:t>
-      </w:r>
-    </w:p>
-    <w:bookmarkEnd w:id="82"/>
-    <w:bookmarkStart w:id="83" w:name="X26575901e59616899e8b3847496560b142cc09a"/>
+        <w:t xml:space="preserve">PESTEL</w:t>
+      </w:r>
+      <w:r>
+        <w:t xml:space="preserve"> </w:t>
+      </w:r>
+      <w:r>
+        <w:t xml:space="preserve">✓ — Aguilar, F. (1967).</w:t>
+      </w:r>
+      <w:r>
+        <w:t xml:space="preserve"> </w:t>
+      </w:r>
+      <w:r>
+        <w:rPr>
+          <w:i/>
+          <w:iCs/>
+        </w:rPr>
+        <w:t xml:space="preserve">Scanning the Business Environment</w:t>
+      </w:r>
+      <w:r>
+        <w:t xml:space="preserve">. Harvard; later extended to PESTLE/PESTEL (Legal, Environmental).</w:t>
+      </w:r>
+      <w:r>
+        <w:t xml:space="preserve"> </w:t>
+      </w:r>
+      <w:hyperlink r:id="rId80">
+        <w:r>
+          <w:rPr>
+            <w:rStyle w:val="Hyperlink"/>
+          </w:rPr>
+          <w:t xml:space="preserve">Background</w:t>
+        </w:r>
+      </w:hyperlink>
+    </w:p>
+    <w:p>
+      <w:pPr>
+        <w:pStyle w:val="Compact"/>
+        <w:numPr>
+          <w:ilvl w:val="0"/>
+          <w:numId w:val="1015"/>
+        </w:numPr>
+      </w:pPr>
+      <w:r>
+        <w:rPr>
+          <w:b/>
+          <w:bCs/>
+        </w:rPr>
+        <w:t xml:space="preserve">PEST</w:t>
+      </w:r>
+      <w:r>
+        <w:t xml:space="preserve"> </w:t>
+      </w:r>
+      <w:r>
+        <w:t xml:space="preserve">ℹ — Four-factor variant (Political, Economic, Social, Technological); conceptually from the PESTEL lineage.</w:t>
+      </w:r>
+    </w:p>
+    <w:p>
+      <w:pPr>
+        <w:pStyle w:val="Compact"/>
+        <w:numPr>
+          <w:ilvl w:val="0"/>
+          <w:numId w:val="1015"/>
+        </w:numPr>
+      </w:pPr>
+      <w:r>
+        <w:rPr>
+          <w:b/>
+          <w:bCs/>
+        </w:rPr>
+        <w:t xml:space="preserve">SWOT</w:t>
+      </w:r>
+      <w:r>
+        <w:t xml:space="preserve"> </w:t>
+      </w:r>
+      <w:r>
+        <w:t xml:space="preserve">✓ — Humphrey, A. (1960s–70s). Stanford Research Institute (SRI International); developed with Fortune 500 planning research.</w:t>
+      </w:r>
+      <w:r>
+        <w:t xml:space="preserve"> </w:t>
+      </w:r>
+      <w:hyperlink r:id="rId81">
+        <w:r>
+          <w:rPr>
+            <w:rStyle w:val="Hyperlink"/>
+          </w:rPr>
+          <w:t xml:space="preserve">e.g. Ninety</w:t>
+        </w:r>
+      </w:hyperlink>
+    </w:p>
+    <w:p>
+      <w:pPr>
+        <w:pStyle w:val="Compact"/>
+        <w:numPr>
+          <w:ilvl w:val="0"/>
+          <w:numId w:val="1015"/>
+        </w:numPr>
+      </w:pPr>
+      <w:r>
+        <w:rPr>
+          <w:b/>
+          <w:bCs/>
+        </w:rPr>
+        <w:t xml:space="preserve">RACI</w:t>
+      </w:r>
+      <w:r>
+        <w:t xml:space="preserve"> </w:t>
+      </w:r>
+      <w:r>
+        <w:t xml:space="preserve">✓ — Responsibility Assignment Matrix; emerged ~1950s–70s, no single inventor.</w:t>
+      </w:r>
+      <w:r>
+        <w:t xml:space="preserve"> </w:t>
+      </w:r>
+      <w:hyperlink r:id="rId82">
+        <w:r>
+          <w:rPr>
+            <w:rStyle w:val="Hyperlink"/>
+          </w:rPr>
+          <w:t xml:space="preserve">Wikipedia RAM</w:t>
+        </w:r>
+      </w:hyperlink>
+    </w:p>
+    <w:p>
+      <w:pPr>
+        <w:pStyle w:val="Compact"/>
+        <w:numPr>
+          <w:ilvl w:val="0"/>
+          <w:numId w:val="1015"/>
+        </w:numPr>
+      </w:pPr>
+      <w:r>
+        <w:rPr>
+          <w:b/>
+          <w:bCs/>
+        </w:rPr>
+        <w:t xml:space="preserve">SET (Systems Engineering Triangle)</w:t>
+      </w:r>
+      <w:r>
+        <w:t xml:space="preserve"> </w:t>
+      </w:r>
+      <w:r>
+        <w:t xml:space="preserve">✓ — SEBoK,</w:t>
+      </w:r>
+      <w:r>
+        <w:t xml:space="preserve"> </w:t>
+      </w:r>
+      <w:r>
+        <w:rPr>
+          <w:i/>
+          <w:iCs/>
+        </w:rPr>
+        <w:t xml:space="preserve">Guide to the Systems Engineering Body of Knowledge</w:t>
+      </w:r>
+      <w:r>
+        <w:t xml:space="preserve">.</w:t>
+      </w:r>
+      <w:r>
+        <w:t xml:space="preserve"> </w:t>
+      </w:r>
+      <w:hyperlink r:id="rId31">
+        <w:r>
+          <w:rPr>
+            <w:rStyle w:val="Hyperlink"/>
+          </w:rPr>
+          <w:t xml:space="preserve">SEBoK</w:t>
+        </w:r>
+      </w:hyperlink>
+    </w:p>
+    <w:bookmarkEnd w:id="83"/>
+    <w:bookmarkStart w:id="84" w:name="problem-resolution-threats-triage"/>
     <w:p>
       <w:pPr>
         <w:pStyle w:val="Heading3"/>
       </w:pPr>
       <w:r>
-        <w:t xml:space="preserve">Communication, Stress &amp; Resilience, Infrastructure</w:t>
+        <w:t xml:space="preserve">Problem Resolution Threats &amp; Triage</w:t>
       </w:r>
     </w:p>
     <w:p>
@@ -11440,13 +11424,23 @@
           <w:b/>
           <w:bCs/>
         </w:rPr>
-        <w:t xml:space="preserve">BREATHE, PAUSE, WAIT, PACE, STOP, ARIES, CALM, SHINE</w:t>
-      </w:r>
-      <w:r>
-        <w:t xml:space="preserve"> </w:t>
-      </w:r>
-      <w:r>
-        <w:t xml:space="preserve">ℹ — Curated for stress management and conflict de-escalation.</w:t>
+        <w:t xml:space="preserve">DICE, FATE</w:t>
+      </w:r>
+      <w:r>
+        <w:t xml:space="preserve"> </w:t>
+      </w:r>
+      <w:r>
+        <w:t xml:space="preserve">ℹ — Educational mnemonics for blockers and resource checks in this collection.</w:t>
+      </w:r>
+    </w:p>
+    <w:bookmarkEnd w:id="84"/>
+    <w:bookmarkStart w:id="85" w:name="X26575901e59616899e8b3847496560b142cc09a"/>
+    <w:p>
+      <w:pPr>
+        <w:pStyle w:val="Heading3"/>
+      </w:pPr>
+      <w:r>
+        <w:t xml:space="preserve">Communication, Stress &amp; Resilience, Infrastructure</w:t>
       </w:r>
     </w:p>
     <w:p>
@@ -11454,7 +11448,7 @@
         <w:pStyle w:val="Compact"/>
         <w:numPr>
           <w:ilvl w:val="0"/>
-          <w:numId w:val="1016"/>
+          <w:numId w:val="1017"/>
         </w:numPr>
       </w:pPr>
       <w:r>
@@ -11462,6 +11456,28 @@
           <w:b/>
           <w:bCs/>
         </w:rPr>
+        <w:t xml:space="preserve">BREATHE, PAUSE, WAIT, PACE, STOP, ARIES, CALM, SHINE</w:t>
+      </w:r>
+      <w:r>
+        <w:t xml:space="preserve"> </w:t>
+      </w:r>
+      <w:r>
+        <w:t xml:space="preserve">ℹ — Curated for stress management and conflict de-escalation.</w:t>
+      </w:r>
+    </w:p>
+    <w:p>
+      <w:pPr>
+        <w:pStyle w:val="Compact"/>
+        <w:numPr>
+          <w:ilvl w:val="0"/>
+          <w:numId w:val="1017"/>
+        </w:numPr>
+      </w:pPr>
+      <w:r>
+        <w:rPr>
+          <w:b/>
+          <w:bCs/>
+        </w:rPr>
         <w:t xml:space="preserve">TRACE, SCALE, DEBUG</w:t>
       </w:r>
       <w:r>
@@ -11489,9 +11505,27 @@
         <w:t xml:space="preserve">✓ documented; ⚠ adapted; ℹ curated. Mix of established frameworks and educational compilations.</w:t>
       </w:r>
     </w:p>
-    <w:bookmarkEnd w:id="83"/>
-    <w:bookmarkEnd w:id="84"/>
+    <w:p>
+      <w:pPr>
+        <w:pStyle w:val="BodyText"/>
+      </w:pPr>
+      <w:r>
+        <w:rPr>
+          <w:b/>
+          <w:bCs/>
+        </w:rPr>
+        <w:t xml:space="preserve">Evidence:</w:t>
+      </w:r>
+      <w:r>
+        <w:t xml:space="preserve"> </w:t>
+      </w:r>
+      <w:r>
+        <w:t xml:space="preserve">★★★ strongly validated (5 Whys, 8D, Ishikawa); ★★ industry standard (SWOT, RACI, A3, SET); ★ curated. ✓/⚠/ℹ = attribution; ★ = evidence strength.</w:t>
+      </w:r>
+    </w:p>
     <w:bookmarkEnd w:id="85"/>
+    <w:bookmarkEnd w:id="86"/>
+    <w:bookmarkEnd w:id="87"/>
     <w:sectPr>
       <w:footnotePr>
         <w:numRestart w:val="eachSect"/>
@@ -11602,6 +11636,91 @@
       </w:pPr>
     </w:lvl>
   </w:abstractNum>
+  <w:abstractNum w:abstractNumId="99411">
+    <w:nsid w:val="00A99411"/>
+    <w:multiLevelType w:val="multilevel"/>
+    <w:lvl w:ilvl="0">
+      <w:start w:val="1"/>
+      <w:numFmt w:val="decimal"/>
+      <w:lvlText w:val="%1."/>
+      <w:lvlJc w:val="left"/>
+      <w:pPr>
+        <w:ind w:left="720" w:hanging="360"/>
+      </w:pPr>
+    </w:lvl>
+    <w:lvl w:ilvl="1">
+      <w:start w:val="1"/>
+      <w:numFmt w:val="decimal"/>
+      <w:lvlText w:val="%2."/>
+      <w:lvlJc w:val="left"/>
+      <w:pPr>
+        <w:ind w:left="1440" w:hanging="360"/>
+      </w:pPr>
+    </w:lvl>
+    <w:lvl w:ilvl="2">
+      <w:start w:val="1"/>
+      <w:numFmt w:val="decimal"/>
+      <w:lvlText w:val="%3."/>
+      <w:lvlJc w:val="left"/>
+      <w:pPr>
+        <w:ind w:left="2160" w:hanging="360"/>
+      </w:pPr>
+    </w:lvl>
+    <w:lvl w:ilvl="3">
+      <w:start w:val="1"/>
+      <w:numFmt w:val="decimal"/>
+      <w:lvlText w:val="%4."/>
+      <w:lvlJc w:val="left"/>
+      <w:pPr>
+        <w:ind w:left="2880" w:hanging="360"/>
+      </w:pPr>
+    </w:lvl>
+    <w:lvl w:ilvl="4">
+      <w:start w:val="1"/>
+      <w:numFmt w:val="decimal"/>
+      <w:lvlText w:val="%5."/>
+      <w:lvlJc w:val="left"/>
+      <w:pPr>
+        <w:ind w:left="3600" w:hanging="360"/>
+      </w:pPr>
+    </w:lvl>
+    <w:lvl w:ilvl="5">
+      <w:start w:val="1"/>
+      <w:numFmt w:val="decimal"/>
+      <w:lvlText w:val="%6."/>
+      <w:lvlJc w:val="left"/>
+      <w:pPr>
+        <w:ind w:left="4320" w:hanging="360"/>
+      </w:pPr>
+    </w:lvl>
+    <w:lvl w:ilvl="6">
+      <w:start w:val="1"/>
+      <w:numFmt w:val="decimal"/>
+      <w:lvlText w:val="%7."/>
+      <w:lvlJc w:val="left"/>
+      <w:pPr>
+        <w:ind w:left="5040" w:hanging="360"/>
+      </w:pPr>
+    </w:lvl>
+    <w:lvl w:ilvl="7">
+      <w:start w:val="1"/>
+      <w:numFmt w:val="decimal"/>
+      <w:lvlText w:val="%8."/>
+      <w:lvlJc w:val="left"/>
+      <w:pPr>
+        <w:ind w:left="5760" w:hanging="360"/>
+      </w:pPr>
+    </w:lvl>
+    <w:lvl w:ilvl="8">
+      <w:start w:val="1"/>
+      <w:numFmt w:val="decimal"/>
+      <w:lvlText w:val="%9."/>
+      <w:lvlJc w:val="left"/>
+      <w:pPr>
+        <w:ind w:left="6480" w:hanging="360"/>
+      </w:pPr>
+    </w:lvl>
+  </w:abstractNum>
   <w:abstractNum w:abstractNumId="991">
     <w:nsid w:val="0000A991"/>
     <w:multiLevelType w:val="multilevel"/>
@@ -11705,96 +11824,38 @@
       </w:rPr>
     </w:lvl>
   </w:abstractNum>
-  <w:abstractNum w:abstractNumId="99411">
-    <w:nsid w:val="00A99411"/>
-    <w:multiLevelType w:val="multilevel"/>
-    <w:lvl w:ilvl="0">
-      <w:start w:val="1"/>
-      <w:numFmt w:val="decimal"/>
-      <w:lvlText w:val="%1."/>
-      <w:lvlJc w:val="left"/>
-      <w:pPr>
-        <w:ind w:left="720" w:hanging="360"/>
-      </w:pPr>
-    </w:lvl>
-    <w:lvl w:ilvl="1">
-      <w:start w:val="1"/>
-      <w:numFmt w:val="decimal"/>
-      <w:lvlText w:val="%2."/>
-      <w:lvlJc w:val="left"/>
-      <w:pPr>
-        <w:ind w:left="1440" w:hanging="360"/>
-      </w:pPr>
-    </w:lvl>
-    <w:lvl w:ilvl="2">
-      <w:start w:val="1"/>
-      <w:numFmt w:val="decimal"/>
-      <w:lvlText w:val="%3."/>
-      <w:lvlJc w:val="left"/>
-      <w:pPr>
-        <w:ind w:left="2160" w:hanging="360"/>
-      </w:pPr>
-    </w:lvl>
-    <w:lvl w:ilvl="3">
-      <w:start w:val="1"/>
-      <w:numFmt w:val="decimal"/>
-      <w:lvlText w:val="%4."/>
-      <w:lvlJc w:val="left"/>
-      <w:pPr>
-        <w:ind w:left="2880" w:hanging="360"/>
-      </w:pPr>
-    </w:lvl>
-    <w:lvl w:ilvl="4">
-      <w:start w:val="1"/>
-      <w:numFmt w:val="decimal"/>
-      <w:lvlText w:val="%5."/>
-      <w:lvlJc w:val="left"/>
-      <w:pPr>
-        <w:ind w:left="3600" w:hanging="360"/>
-      </w:pPr>
-    </w:lvl>
-    <w:lvl w:ilvl="5">
-      <w:start w:val="1"/>
-      <w:numFmt w:val="decimal"/>
-      <w:lvlText w:val="%6."/>
-      <w:lvlJc w:val="left"/>
-      <w:pPr>
-        <w:ind w:left="4320" w:hanging="360"/>
-      </w:pPr>
-    </w:lvl>
-    <w:lvl w:ilvl="6">
-      <w:start w:val="1"/>
-      <w:numFmt w:val="decimal"/>
-      <w:lvlText w:val="%7."/>
-      <w:lvlJc w:val="left"/>
-      <w:pPr>
-        <w:ind w:left="5040" w:hanging="360"/>
-      </w:pPr>
-    </w:lvl>
-    <w:lvl w:ilvl="7">
-      <w:start w:val="1"/>
-      <w:numFmt w:val="decimal"/>
-      <w:lvlText w:val="%8."/>
-      <w:lvlJc w:val="left"/>
-      <w:pPr>
-        <w:ind w:left="5760" w:hanging="360"/>
-      </w:pPr>
-    </w:lvl>
-    <w:lvl w:ilvl="8">
-      <w:start w:val="1"/>
-      <w:numFmt w:val="decimal"/>
-      <w:lvlText w:val="%9."/>
-      <w:lvlJc w:val="left"/>
-      <w:pPr>
-        <w:ind w:left="6480" w:hanging="360"/>
-      </w:pPr>
-    </w:lvl>
-  </w:abstractNum>
   <w:num w:numId="1000">
     <w:abstractNumId w:val="990"/>
   </w:num>
   <w:num w:numId="1001">
-    <w:abstractNumId w:val="991"/>
+    <w:abstractNumId w:val="99411"/>
+    <w:lvlOverride w:ilvl="0">
+      <w:startOverride w:val="1"/>
+    </w:lvlOverride>
+    <w:lvlOverride w:ilvl="1">
+      <w:startOverride w:val="1"/>
+    </w:lvlOverride>
+    <w:lvlOverride w:ilvl="2">
+      <w:startOverride w:val="1"/>
+    </w:lvlOverride>
+    <w:lvlOverride w:ilvl="3">
+      <w:startOverride w:val="1"/>
+    </w:lvlOverride>
+    <w:lvlOverride w:ilvl="4">
+      <w:startOverride w:val="1"/>
+    </w:lvlOverride>
+    <w:lvlOverride w:ilvl="5">
+      <w:startOverride w:val="1"/>
+    </w:lvlOverride>
+    <w:lvlOverride w:ilvl="6">
+      <w:startOverride w:val="1"/>
+    </w:lvlOverride>
+    <w:lvlOverride w:ilvl="7">
+      <w:startOverride w:val="1"/>
+    </w:lvlOverride>
+    <w:lvlOverride w:ilvl="8">
+      <w:startOverride w:val="1"/>
+    </w:lvlOverride>
   </w:num>
   <w:num w:numId="1002">
     <w:abstractNumId w:val="991"/>
@@ -11827,6 +11888,9 @@
     <w:abstractNumId w:val="991"/>
   </w:num>
   <w:num w:numId="1012">
+    <w:abstractNumId w:val="991"/>
+  </w:num>
+  <w:num w:numId="1013">
     <w:abstractNumId w:val="99411"/>
     <w:lvlOverride w:ilvl="0">
       <w:startOverride w:val="1"/>
@@ -11856,9 +11920,6 @@
       <w:startOverride w:val="1"/>
     </w:lvlOverride>
   </w:num>
-  <w:num w:numId="1013">
-    <w:abstractNumId w:val="991"/>
-  </w:num>
   <w:num w:numId="1014">
     <w:abstractNumId w:val="991"/>
   </w:num>
@@ -11866,6 +11927,9 @@
     <w:abstractNumId w:val="991"/>
   </w:num>
   <w:num w:numId="1016">
+    <w:abstractNumId w:val="991"/>
+  </w:num>
+  <w:num w:numId="1017">
     <w:abstractNumId w:val="991"/>
   </w:num>
 </w:numbering>

</xml_diff>